<commit_message>
bổ sung docs test case phim không ở trạng thái NOW_SHOWING
</commit_message>
<xml_diff>
--- a/docs/Thu2_Ca3_Nhom4_23130102_BuiVanHieu.docx
+++ b/docs/Thu2_Ca3_Nhom4_23130102_BuiVanHieu.docx
@@ -281,8 +281,6 @@
       <w:pPr>
         <w:spacing w:line="360" w:lineRule="auto"/>
       </w:pPr>
-      <w:bookmarkStart w:id="57" w:name="_GoBack"/>
-      <w:bookmarkEnd w:id="57"/>
     </w:p>
     <w:p>
       <w:pPr>
@@ -3732,11 +3730,11 @@
           <w:szCs w:val="28"/>
         </w:rPr>
       </w:pPr>
-      <w:bookmarkStart w:id="8" w:name="_Toc228887504"/>
-      <w:bookmarkStart w:id="9" w:name="_Toc229251621"/>
-      <w:bookmarkStart w:id="10" w:name="_Toc3516"/>
-      <w:bookmarkStart w:id="11" w:name="_Toc229943261"/>
-      <w:bookmarkStart w:id="12" w:name="_Toc228888348"/>
+      <w:bookmarkStart w:id="8" w:name="_Toc3516"/>
+      <w:bookmarkStart w:id="9" w:name="_Toc229943261"/>
+      <w:bookmarkStart w:id="10" w:name="_Toc229251621"/>
+      <w:bookmarkStart w:id="11" w:name="_Toc228888348"/>
+      <w:bookmarkStart w:id="12" w:name="_Toc228887504"/>
       <w:r>
         <w:t>1.1. Tổng quan đề tài</w:t>
       </w:r>
@@ -3784,8 +3782,8 @@
         <w:spacing w:before="0" w:line="312" w:lineRule="auto"/>
         <w:ind w:left="720"/>
       </w:pPr>
-      <w:bookmarkStart w:id="13" w:name="_Toc229251622"/>
-      <w:bookmarkStart w:id="14" w:name="_Toc228887505"/>
+      <w:bookmarkStart w:id="13" w:name="_Toc228887505"/>
+      <w:bookmarkStart w:id="14" w:name="_Toc229251622"/>
       <w:bookmarkStart w:id="15" w:name="_Toc228888349"/>
       <w:bookmarkStart w:id="16" w:name="_Toc229943262"/>
       <w:bookmarkStart w:id="17" w:name="_Toc4596"/>
@@ -5854,9 +5852,9 @@
               </w:rPr>
             </w:pPr>
             <w:bookmarkStart w:id="20" w:name="_Toc228888351"/>
-            <w:bookmarkStart w:id="21" w:name="_Toc229251624"/>
-            <w:bookmarkStart w:id="22" w:name="_Toc229943264"/>
-            <w:bookmarkStart w:id="23" w:name="_Toc228887507"/>
+            <w:bookmarkStart w:id="21" w:name="_Toc229943264"/>
+            <w:bookmarkStart w:id="22" w:name="_Toc228887507"/>
+            <w:bookmarkStart w:id="23" w:name="_Toc229251624"/>
             <w:r>
               <w:t>FR01</w:t>
             </w:r>
@@ -11576,6 +11574,12 @@
             <w:insideH w:val="single" w:color="auto" w:sz="4" w:space="0"/>
             <w:insideV w:val="single" w:color="auto" w:sz="4" w:space="0"/>
           </w:tblBorders>
+          <w:tblCellMar>
+            <w:top w:w="0" w:type="dxa"/>
+            <w:left w:w="10" w:type="dxa"/>
+            <w:bottom w:w="0" w:type="dxa"/>
+            <w:right w:w="10" w:type="dxa"/>
+          </w:tblCellMar>
         </w:tblPrEx>
         <w:tc>
           <w:tcPr>
@@ -13169,12 +13173,6 @@
             <w:insideH w:val="single" w:color="auto" w:sz="4" w:space="0"/>
             <w:insideV w:val="single" w:color="auto" w:sz="4" w:space="0"/>
           </w:tblBorders>
-          <w:tblCellMar>
-            <w:top w:w="0" w:type="dxa"/>
-            <w:left w:w="10" w:type="dxa"/>
-            <w:bottom w:w="0" w:type="dxa"/>
-            <w:right w:w="10" w:type="dxa"/>
-          </w:tblCellMar>
         </w:tblPrEx>
         <w:tc>
           <w:tcPr>
@@ -15558,6 +15556,878 @@
     </w:p>
     <w:p>
       <w:pPr>
+        <w:pStyle w:val="3"/>
+        <w:widowControl/>
+        <w:spacing w:line="360" w:lineRule="auto"/>
+        <w:rPr>
+          <w:lang w:val="en-US"/>
+        </w:rPr>
+      </w:pPr>
+      <w:r>
+        <w:rPr>
+          <w:lang w:val="en-US"/>
+        </w:rPr>
+        <w:t>6.9. TC04-09: Phim không thuộc trạng thái được hiển thị</w:t>
+      </w:r>
+    </w:p>
+    <w:tbl>
+      <w:tblPr>
+        <w:tblStyle w:val="9"/>
+        <w:tblW w:w="9026" w:type="dxa"/>
+        <w:tblInd w:w="0" w:type="dxa"/>
+        <w:tblBorders>
+          <w:top w:val="single" w:color="auto" w:sz="4" w:space="0"/>
+          <w:left w:val="single" w:color="auto" w:sz="4" w:space="0"/>
+          <w:bottom w:val="single" w:color="auto" w:sz="4" w:space="0"/>
+          <w:right w:val="single" w:color="auto" w:sz="4" w:space="0"/>
+          <w:insideH w:val="single" w:color="auto" w:sz="4" w:space="0"/>
+          <w:insideV w:val="single" w:color="auto" w:sz="4" w:space="0"/>
+        </w:tblBorders>
+        <w:shd w:val="clear"/>
+        <w:tblLayout w:type="autofit"/>
+        <w:tblCellMar>
+          <w:top w:w="0" w:type="dxa"/>
+          <w:left w:w="10" w:type="dxa"/>
+          <w:bottom w:w="0" w:type="dxa"/>
+          <w:right w:w="10" w:type="dxa"/>
+        </w:tblCellMar>
+      </w:tblPr>
+      <w:tblGrid>
+        <w:gridCol w:w="2000"/>
+        <w:gridCol w:w="7026"/>
+      </w:tblGrid>
+      <w:tr>
+        <w:tblPrEx>
+          <w:tblBorders>
+            <w:top w:val="single" w:color="auto" w:sz="4" w:space="0"/>
+            <w:left w:val="single" w:color="auto" w:sz="4" w:space="0"/>
+            <w:bottom w:val="single" w:color="auto" w:sz="4" w:space="0"/>
+            <w:right w:val="single" w:color="auto" w:sz="4" w:space="0"/>
+            <w:insideH w:val="single" w:color="auto" w:sz="4" w:space="0"/>
+            <w:insideV w:val="single" w:color="auto" w:sz="4" w:space="0"/>
+          </w:tblBorders>
+          <w:tblCellMar>
+            <w:top w:w="0" w:type="dxa"/>
+            <w:left w:w="10" w:type="dxa"/>
+            <w:bottom w:w="0" w:type="dxa"/>
+            <w:right w:w="10" w:type="dxa"/>
+          </w:tblCellMar>
+        </w:tblPrEx>
+        <w:tc>
+          <w:tcPr>
+            <w:tcW w:w="2000" w:type="dxa"/>
+            <w:tcBorders>
+              <w:top w:val="single" w:color="000000" w:sz="6" w:space="0"/>
+              <w:left w:val="single" w:color="000000" w:sz="6" w:space="0"/>
+              <w:bottom w:val="single" w:color="000000" w:sz="6" w:space="0"/>
+              <w:right w:val="single" w:color="000000" w:sz="6" w:space="0"/>
+            </w:tcBorders>
+            <w:shd w:val="clear" w:color="auto" w:fill="D9D9D9"/>
+            <w:tcMar>
+              <w:top w:w="80" w:type="dxa"/>
+              <w:left w:w="120" w:type="dxa"/>
+              <w:bottom w:w="80" w:type="dxa"/>
+              <w:right w:w="120" w:type="dxa"/>
+            </w:tcMar>
+            <w:vAlign w:val="center"/>
+          </w:tcPr>
+          <w:p>
+            <w:pPr>
+              <w:keepNext w:val="0"/>
+              <w:keepLines w:val="0"/>
+              <w:widowControl/>
+              <w:suppressLineNumbers w:val="0"/>
+              <w:spacing w:before="0" w:beforeAutospacing="0" w:after="0" w:afterAutospacing="0"/>
+              <w:ind w:left="0" w:right="0"/>
+              <w:jc w:val="left"/>
+              <w:rPr>
+                <w:bdr w:val="none" w:color="auto" w:sz="0" w:space="0"/>
+              </w:rPr>
+            </w:pPr>
+            <w:r>
+              <w:rPr>
+                <w:rFonts w:hint="default" w:ascii="Times New Roman" w:hAnsi="Times New Roman" w:eastAsia="Times New Roman" w:cs="Times New Roman"/>
+                <w:b/>
+                <w:bCs/>
+                <w:color w:val="auto"/>
+                <w:kern w:val="0"/>
+                <w:sz w:val="24"/>
+                <w:szCs w:val="24"/>
+                <w:bdr w:val="none" w:color="auto" w:sz="0" w:space="0"/>
+                <w:lang w:val="en-US" w:eastAsia="zh-CN" w:bidi="ar"/>
+              </w:rPr>
+              <w:t>TC ID</w:t>
+            </w:r>
+          </w:p>
+        </w:tc>
+        <w:tc>
+          <w:tcPr>
+            <w:tcW w:w="7026" w:type="dxa"/>
+            <w:tcBorders>
+              <w:top w:val="single" w:color="000000" w:sz="6" w:space="0"/>
+              <w:left w:val="single" w:color="000000" w:sz="6" w:space="0"/>
+              <w:bottom w:val="single" w:color="000000" w:sz="6" w:space="0"/>
+              <w:right w:val="single" w:color="000000" w:sz="6" w:space="0"/>
+            </w:tcBorders>
+            <w:shd w:val="clear"/>
+            <w:tcMar>
+              <w:top w:w="80" w:type="dxa"/>
+              <w:left w:w="120" w:type="dxa"/>
+              <w:bottom w:w="80" w:type="dxa"/>
+              <w:right w:w="120" w:type="dxa"/>
+            </w:tcMar>
+            <w:vAlign w:val="center"/>
+          </w:tcPr>
+          <w:p>
+            <w:pPr>
+              <w:keepNext w:val="0"/>
+              <w:keepLines w:val="0"/>
+              <w:widowControl/>
+              <w:suppressLineNumbers w:val="0"/>
+              <w:spacing w:before="0" w:beforeAutospacing="0" w:after="0" w:afterAutospacing="0"/>
+              <w:ind w:left="0" w:right="0"/>
+              <w:jc w:val="left"/>
+              <w:rPr>
+                <w:bdr w:val="none" w:color="auto" w:sz="0" w:space="0"/>
+              </w:rPr>
+            </w:pPr>
+            <w:r>
+              <w:rPr>
+                <w:rFonts w:hint="default" w:ascii="Times New Roman" w:hAnsi="Times New Roman" w:eastAsia="Times New Roman" w:cs="Times New Roman"/>
+                <w:kern w:val="0"/>
+                <w:sz w:val="24"/>
+                <w:szCs w:val="24"/>
+                <w:bdr w:val="none" w:color="auto" w:sz="0" w:space="0"/>
+                <w:lang w:val="en-US" w:eastAsia="zh-CN" w:bidi="ar"/>
+              </w:rPr>
+              <w:t>TC04-09</w:t>
+            </w:r>
+          </w:p>
+        </w:tc>
+      </w:tr>
+      <w:tr>
+        <w:tblPrEx>
+          <w:tblBorders>
+            <w:top w:val="single" w:color="auto" w:sz="4" w:space="0"/>
+            <w:left w:val="single" w:color="auto" w:sz="4" w:space="0"/>
+            <w:bottom w:val="single" w:color="auto" w:sz="4" w:space="0"/>
+            <w:right w:val="single" w:color="auto" w:sz="4" w:space="0"/>
+            <w:insideH w:val="single" w:color="auto" w:sz="4" w:space="0"/>
+            <w:insideV w:val="single" w:color="auto" w:sz="4" w:space="0"/>
+          </w:tblBorders>
+          <w:shd w:val="clear"/>
+          <w:tblCellMar>
+            <w:top w:w="0" w:type="dxa"/>
+            <w:left w:w="10" w:type="dxa"/>
+            <w:bottom w:w="0" w:type="dxa"/>
+            <w:right w:w="10" w:type="dxa"/>
+          </w:tblCellMar>
+        </w:tblPrEx>
+        <w:tc>
+          <w:tcPr>
+            <w:tcW w:w="2000" w:type="dxa"/>
+            <w:tcBorders>
+              <w:top w:val="single" w:color="000000" w:sz="6" w:space="0"/>
+              <w:left w:val="single" w:color="000000" w:sz="6" w:space="0"/>
+              <w:bottom w:val="single" w:color="000000" w:sz="6" w:space="0"/>
+              <w:right w:val="single" w:color="000000" w:sz="6" w:space="0"/>
+            </w:tcBorders>
+            <w:shd w:val="clear" w:color="auto" w:fill="D9D9D9"/>
+            <w:tcMar>
+              <w:top w:w="80" w:type="dxa"/>
+              <w:left w:w="120" w:type="dxa"/>
+              <w:bottom w:w="80" w:type="dxa"/>
+              <w:right w:w="120" w:type="dxa"/>
+            </w:tcMar>
+            <w:vAlign w:val="center"/>
+          </w:tcPr>
+          <w:p>
+            <w:pPr>
+              <w:keepNext w:val="0"/>
+              <w:keepLines w:val="0"/>
+              <w:widowControl/>
+              <w:suppressLineNumbers w:val="0"/>
+              <w:spacing w:before="0" w:beforeAutospacing="0" w:after="0" w:afterAutospacing="0"/>
+              <w:ind w:left="0" w:right="0"/>
+              <w:jc w:val="left"/>
+              <w:rPr>
+                <w:bdr w:val="none" w:color="auto" w:sz="0" w:space="0"/>
+              </w:rPr>
+            </w:pPr>
+            <w:r>
+              <w:rPr>
+                <w:rFonts w:hint="default" w:ascii="Times New Roman" w:hAnsi="Times New Roman" w:eastAsia="Times New Roman" w:cs="Times New Roman"/>
+                <w:b/>
+                <w:bCs/>
+                <w:color w:val="auto"/>
+                <w:kern w:val="0"/>
+                <w:sz w:val="24"/>
+                <w:szCs w:val="24"/>
+                <w:bdr w:val="none" w:color="auto" w:sz="0" w:space="0"/>
+                <w:lang w:val="en-US" w:eastAsia="zh-CN" w:bidi="ar"/>
+              </w:rPr>
+              <w:t>Mô tả</w:t>
+            </w:r>
+          </w:p>
+        </w:tc>
+        <w:tc>
+          <w:tcPr>
+            <w:tcW w:w="7026" w:type="dxa"/>
+            <w:tcBorders>
+              <w:top w:val="single" w:color="000000" w:sz="6" w:space="0"/>
+              <w:left w:val="single" w:color="000000" w:sz="6" w:space="0"/>
+              <w:bottom w:val="single" w:color="000000" w:sz="6" w:space="0"/>
+              <w:right w:val="single" w:color="000000" w:sz="6" w:space="0"/>
+            </w:tcBorders>
+            <w:shd w:val="clear"/>
+            <w:tcMar>
+              <w:top w:w="80" w:type="dxa"/>
+              <w:left w:w="120" w:type="dxa"/>
+              <w:bottom w:w="80" w:type="dxa"/>
+              <w:right w:w="120" w:type="dxa"/>
+            </w:tcMar>
+            <w:vAlign w:val="center"/>
+          </w:tcPr>
+          <w:p>
+            <w:pPr>
+              <w:keepNext w:val="0"/>
+              <w:keepLines w:val="0"/>
+              <w:widowControl/>
+              <w:suppressLineNumbers w:val="0"/>
+              <w:spacing w:before="0" w:beforeAutospacing="0" w:after="0" w:afterAutospacing="0"/>
+              <w:ind w:left="0" w:right="0"/>
+              <w:jc w:val="left"/>
+              <w:rPr>
+                <w:bdr w:val="none" w:color="auto" w:sz="0" w:space="0"/>
+              </w:rPr>
+            </w:pPr>
+            <w:r>
+              <w:rPr>
+                <w:rFonts w:hint="default" w:ascii="Times New Roman" w:hAnsi="Times New Roman" w:eastAsia="Times New Roman" w:cs="Times New Roman"/>
+                <w:kern w:val="0"/>
+                <w:sz w:val="24"/>
+                <w:szCs w:val="24"/>
+                <w:bdr w:val="none" w:color="auto" w:sz="0" w:space="0"/>
+                <w:lang w:val="en-US" w:eastAsia="zh-CN" w:bidi="ar"/>
+              </w:rPr>
+              <w:t>Kiểm tra trường hợp khách hàng truy cập trực tiếp trang chi tiết của một phim có trạng thái khác NOW_SHOWING.</w:t>
+            </w:r>
+          </w:p>
+        </w:tc>
+      </w:tr>
+      <w:tr>
+        <w:tblPrEx>
+          <w:tblBorders>
+            <w:top w:val="single" w:color="auto" w:sz="4" w:space="0"/>
+            <w:left w:val="single" w:color="auto" w:sz="4" w:space="0"/>
+            <w:bottom w:val="single" w:color="auto" w:sz="4" w:space="0"/>
+            <w:right w:val="single" w:color="auto" w:sz="4" w:space="0"/>
+            <w:insideH w:val="single" w:color="auto" w:sz="4" w:space="0"/>
+            <w:insideV w:val="single" w:color="auto" w:sz="4" w:space="0"/>
+          </w:tblBorders>
+          <w:shd w:val="clear"/>
+          <w:tblCellMar>
+            <w:top w:w="0" w:type="dxa"/>
+            <w:left w:w="10" w:type="dxa"/>
+            <w:bottom w:w="0" w:type="dxa"/>
+            <w:right w:w="10" w:type="dxa"/>
+          </w:tblCellMar>
+        </w:tblPrEx>
+        <w:tc>
+          <w:tcPr>
+            <w:tcW w:w="2000" w:type="dxa"/>
+            <w:tcBorders>
+              <w:top w:val="single" w:color="000000" w:sz="6" w:space="0"/>
+              <w:left w:val="single" w:color="000000" w:sz="6" w:space="0"/>
+              <w:bottom w:val="single" w:color="000000" w:sz="6" w:space="0"/>
+              <w:right w:val="single" w:color="000000" w:sz="6" w:space="0"/>
+            </w:tcBorders>
+            <w:shd w:val="clear" w:color="auto" w:fill="D9D9D9"/>
+            <w:tcMar>
+              <w:top w:w="80" w:type="dxa"/>
+              <w:left w:w="120" w:type="dxa"/>
+              <w:bottom w:w="80" w:type="dxa"/>
+              <w:right w:w="120" w:type="dxa"/>
+            </w:tcMar>
+            <w:vAlign w:val="center"/>
+          </w:tcPr>
+          <w:p>
+            <w:pPr>
+              <w:keepNext w:val="0"/>
+              <w:keepLines w:val="0"/>
+              <w:widowControl/>
+              <w:suppressLineNumbers w:val="0"/>
+              <w:spacing w:before="0" w:beforeAutospacing="0" w:after="0" w:afterAutospacing="0"/>
+              <w:ind w:left="0" w:right="0"/>
+              <w:jc w:val="left"/>
+              <w:rPr>
+                <w:bdr w:val="none" w:color="auto" w:sz="0" w:space="0"/>
+              </w:rPr>
+            </w:pPr>
+            <w:r>
+              <w:rPr>
+                <w:rFonts w:hint="default" w:ascii="Times New Roman" w:hAnsi="Times New Roman" w:eastAsia="Times New Roman" w:cs="Times New Roman"/>
+                <w:b/>
+                <w:bCs/>
+                <w:color w:val="auto"/>
+                <w:kern w:val="0"/>
+                <w:sz w:val="24"/>
+                <w:szCs w:val="24"/>
+                <w:bdr w:val="none" w:color="auto" w:sz="0" w:space="0"/>
+                <w:lang w:val="en-US" w:eastAsia="zh-CN" w:bidi="ar"/>
+              </w:rPr>
+              <w:t>Tiền điều kiện</w:t>
+            </w:r>
+          </w:p>
+        </w:tc>
+        <w:tc>
+          <w:tcPr>
+            <w:tcW w:w="7026" w:type="dxa"/>
+            <w:tcBorders>
+              <w:top w:val="single" w:color="000000" w:sz="6" w:space="0"/>
+              <w:left w:val="single" w:color="000000" w:sz="6" w:space="0"/>
+              <w:bottom w:val="single" w:color="000000" w:sz="6" w:space="0"/>
+              <w:right w:val="single" w:color="000000" w:sz="6" w:space="0"/>
+            </w:tcBorders>
+            <w:shd w:val="clear"/>
+            <w:tcMar>
+              <w:top w:w="80" w:type="dxa"/>
+              <w:left w:w="120" w:type="dxa"/>
+              <w:bottom w:w="80" w:type="dxa"/>
+              <w:right w:w="120" w:type="dxa"/>
+            </w:tcMar>
+            <w:vAlign w:val="center"/>
+          </w:tcPr>
+          <w:p>
+            <w:pPr>
+              <w:keepNext w:val="0"/>
+              <w:keepLines w:val="0"/>
+              <w:widowControl/>
+              <w:suppressLineNumbers w:val="0"/>
+              <w:spacing w:before="0" w:beforeAutospacing="0" w:after="0" w:afterAutospacing="0"/>
+              <w:ind w:left="0" w:right="0"/>
+              <w:jc w:val="left"/>
+              <w:rPr>
+                <w:bdr w:val="none" w:color="auto" w:sz="0" w:space="0"/>
+              </w:rPr>
+            </w:pPr>
+            <w:r>
+              <w:rPr>
+                <w:rFonts w:hint="default" w:ascii="Times New Roman" w:hAnsi="Times New Roman" w:eastAsia="Times New Roman" w:cs="Times New Roman"/>
+                <w:kern w:val="0"/>
+                <w:sz w:val="24"/>
+                <w:szCs w:val="24"/>
+                <w:bdr w:val="none" w:color="auto" w:sz="0" w:space="0"/>
+                <w:lang w:val="en-US" w:eastAsia="zh-CN" w:bidi="ar"/>
+              </w:rPr>
+              <w:t>1. Hệ thống đang hoạt động bình thường.</w:t>
+            </w:r>
+          </w:p>
+          <w:p>
+            <w:pPr>
+              <w:keepNext w:val="0"/>
+              <w:keepLines w:val="0"/>
+              <w:widowControl/>
+              <w:suppressLineNumbers w:val="0"/>
+              <w:spacing w:before="0" w:beforeAutospacing="0" w:after="0" w:afterAutospacing="0"/>
+              <w:ind w:left="0" w:right="0"/>
+              <w:jc w:val="left"/>
+              <w:rPr>
+                <w:bdr w:val="none" w:color="auto" w:sz="0" w:space="0"/>
+              </w:rPr>
+            </w:pPr>
+            <w:r>
+              <w:rPr>
+                <w:rFonts w:hint="default" w:ascii="Times New Roman" w:hAnsi="Times New Roman" w:eastAsia="Times New Roman" w:cs="Times New Roman"/>
+                <w:kern w:val="0"/>
+                <w:sz w:val="24"/>
+                <w:szCs w:val="24"/>
+                <w:bdr w:val="none" w:color="auto" w:sz="0" w:space="0"/>
+                <w:lang w:val="en-US" w:eastAsia="zh-CN" w:bidi="ar"/>
+              </w:rPr>
+              <w:t>2. Trong cơ sở dữ liệu có phim tồn tại nhưng status khác NOW_SHOWING, ví dụ HIDDEN hoặc COMING_SOON.</w:t>
+            </w:r>
+          </w:p>
+          <w:p>
+            <w:pPr>
+              <w:keepNext w:val="0"/>
+              <w:keepLines w:val="0"/>
+              <w:widowControl/>
+              <w:suppressLineNumbers w:val="0"/>
+              <w:spacing w:before="0" w:beforeAutospacing="0" w:after="0" w:afterAutospacing="0"/>
+              <w:ind w:left="0" w:right="0"/>
+              <w:jc w:val="left"/>
+              <w:rPr>
+                <w:bdr w:val="none" w:color="auto" w:sz="0" w:space="0"/>
+              </w:rPr>
+            </w:pPr>
+            <w:r>
+              <w:rPr>
+                <w:rFonts w:hint="default" w:ascii="Times New Roman" w:hAnsi="Times New Roman" w:eastAsia="Times New Roman" w:cs="Times New Roman"/>
+                <w:kern w:val="0"/>
+                <w:sz w:val="24"/>
+                <w:szCs w:val="24"/>
+                <w:bdr w:val="none" w:color="auto" w:sz="0" w:space="0"/>
+                <w:lang w:val="en-US" w:eastAsia="zh-CN" w:bidi="ar"/>
+              </w:rPr>
+              <w:t>3. MovieDAO.findById(id) chỉ truy vấn phim có status = NOW_SHOWING.</w:t>
+            </w:r>
+          </w:p>
+        </w:tc>
+      </w:tr>
+      <w:tr>
+        <w:tblPrEx>
+          <w:tblBorders>
+            <w:top w:val="single" w:color="auto" w:sz="4" w:space="0"/>
+            <w:left w:val="single" w:color="auto" w:sz="4" w:space="0"/>
+            <w:bottom w:val="single" w:color="auto" w:sz="4" w:space="0"/>
+            <w:right w:val="single" w:color="auto" w:sz="4" w:space="0"/>
+            <w:insideH w:val="single" w:color="auto" w:sz="4" w:space="0"/>
+            <w:insideV w:val="single" w:color="auto" w:sz="4" w:space="0"/>
+          </w:tblBorders>
+          <w:shd w:val="clear"/>
+          <w:tblCellMar>
+            <w:top w:w="0" w:type="dxa"/>
+            <w:left w:w="10" w:type="dxa"/>
+            <w:bottom w:w="0" w:type="dxa"/>
+            <w:right w:w="10" w:type="dxa"/>
+          </w:tblCellMar>
+        </w:tblPrEx>
+        <w:tc>
+          <w:tcPr>
+            <w:tcW w:w="2000" w:type="dxa"/>
+            <w:tcBorders>
+              <w:top w:val="single" w:color="000000" w:sz="6" w:space="0"/>
+              <w:left w:val="single" w:color="000000" w:sz="6" w:space="0"/>
+              <w:bottom w:val="single" w:color="000000" w:sz="6" w:space="0"/>
+              <w:right w:val="single" w:color="000000" w:sz="6" w:space="0"/>
+            </w:tcBorders>
+            <w:shd w:val="clear" w:color="auto" w:fill="D9D9D9"/>
+            <w:tcMar>
+              <w:top w:w="80" w:type="dxa"/>
+              <w:left w:w="120" w:type="dxa"/>
+              <w:bottom w:w="80" w:type="dxa"/>
+              <w:right w:w="120" w:type="dxa"/>
+            </w:tcMar>
+            <w:vAlign w:val="center"/>
+          </w:tcPr>
+          <w:p>
+            <w:pPr>
+              <w:keepNext w:val="0"/>
+              <w:keepLines w:val="0"/>
+              <w:widowControl/>
+              <w:suppressLineNumbers w:val="0"/>
+              <w:spacing w:before="0" w:beforeAutospacing="0" w:after="0" w:afterAutospacing="0"/>
+              <w:ind w:left="0" w:right="0"/>
+              <w:jc w:val="left"/>
+              <w:rPr>
+                <w:bdr w:val="none" w:color="auto" w:sz="0" w:space="0"/>
+              </w:rPr>
+            </w:pPr>
+            <w:r>
+              <w:rPr>
+                <w:rFonts w:hint="default" w:ascii="Times New Roman" w:hAnsi="Times New Roman" w:eastAsia="Times New Roman" w:cs="Times New Roman"/>
+                <w:b/>
+                <w:bCs/>
+                <w:color w:val="auto"/>
+                <w:kern w:val="0"/>
+                <w:sz w:val="24"/>
+                <w:szCs w:val="24"/>
+                <w:bdr w:val="none" w:color="auto" w:sz="0" w:space="0"/>
+                <w:lang w:val="en-US" w:eastAsia="zh-CN" w:bidi="ar"/>
+              </w:rPr>
+              <w:t>Các bước thực hiện</w:t>
+            </w:r>
+          </w:p>
+        </w:tc>
+        <w:tc>
+          <w:tcPr>
+            <w:tcW w:w="7026" w:type="dxa"/>
+            <w:tcBorders>
+              <w:top w:val="single" w:color="000000" w:sz="6" w:space="0"/>
+              <w:left w:val="single" w:color="000000" w:sz="6" w:space="0"/>
+              <w:bottom w:val="single" w:color="000000" w:sz="6" w:space="0"/>
+              <w:right w:val="single" w:color="000000" w:sz="6" w:space="0"/>
+            </w:tcBorders>
+            <w:shd w:val="clear"/>
+            <w:tcMar>
+              <w:top w:w="80" w:type="dxa"/>
+              <w:left w:w="120" w:type="dxa"/>
+              <w:bottom w:w="80" w:type="dxa"/>
+              <w:right w:w="120" w:type="dxa"/>
+            </w:tcMar>
+            <w:vAlign w:val="center"/>
+          </w:tcPr>
+          <w:p>
+            <w:pPr>
+              <w:keepNext w:val="0"/>
+              <w:keepLines w:val="0"/>
+              <w:widowControl/>
+              <w:suppressLineNumbers w:val="0"/>
+              <w:spacing w:before="0" w:beforeAutospacing="0" w:after="0" w:afterAutospacing="0"/>
+              <w:ind w:left="0" w:right="0"/>
+              <w:jc w:val="left"/>
+              <w:rPr>
+                <w:bdr w:val="none" w:color="auto" w:sz="0" w:space="0"/>
+              </w:rPr>
+            </w:pPr>
+            <w:r>
+              <w:rPr>
+                <w:rFonts w:hint="default" w:ascii="Times New Roman" w:hAnsi="Times New Roman" w:eastAsia="Times New Roman" w:cs="Times New Roman"/>
+                <w:kern w:val="0"/>
+                <w:sz w:val="24"/>
+                <w:szCs w:val="24"/>
+                <w:bdr w:val="none" w:color="auto" w:sz="0" w:space="0"/>
+                <w:lang w:val="en-US" w:eastAsia="zh-CN" w:bidi="ar"/>
+              </w:rPr>
+              <w:t>1. Mở trình duyệt, truy cập trực tiếp URL: /movie-detail?id={id}.</w:t>
+            </w:r>
+          </w:p>
+          <w:p>
+            <w:pPr>
+              <w:keepNext w:val="0"/>
+              <w:keepLines w:val="0"/>
+              <w:widowControl/>
+              <w:suppressLineNumbers w:val="0"/>
+              <w:spacing w:before="0" w:beforeAutospacing="0" w:after="0" w:afterAutospacing="0"/>
+              <w:ind w:left="0" w:right="0"/>
+              <w:jc w:val="left"/>
+              <w:rPr>
+                <w:bdr w:val="none" w:color="auto" w:sz="0" w:space="0"/>
+              </w:rPr>
+            </w:pPr>
+            <w:r>
+              <w:rPr>
+                <w:rFonts w:hint="default" w:ascii="Times New Roman" w:hAnsi="Times New Roman" w:eastAsia="Times New Roman" w:cs="Times New Roman"/>
+                <w:kern w:val="0"/>
+                <w:sz w:val="24"/>
+                <w:szCs w:val="24"/>
+                <w:bdr w:val="none" w:color="auto" w:sz="0" w:space="0"/>
+                <w:lang w:val="en-US" w:eastAsia="zh-CN" w:bidi="ar"/>
+              </w:rPr>
+              <w:t>2. MovieController nhận request và kiểm tra id hợp lệ.</w:t>
+            </w:r>
+          </w:p>
+          <w:p>
+            <w:pPr>
+              <w:keepNext w:val="0"/>
+              <w:keepLines w:val="0"/>
+              <w:widowControl/>
+              <w:suppressLineNumbers w:val="0"/>
+              <w:spacing w:before="0" w:beforeAutospacing="0" w:after="0" w:afterAutospacing="0"/>
+              <w:ind w:left="0" w:right="0"/>
+              <w:jc w:val="left"/>
+              <w:rPr>
+                <w:bdr w:val="none" w:color="auto" w:sz="0" w:space="0"/>
+              </w:rPr>
+            </w:pPr>
+            <w:r>
+              <w:rPr>
+                <w:rFonts w:hint="default" w:ascii="Times New Roman" w:hAnsi="Times New Roman" w:eastAsia="Times New Roman" w:cs="Times New Roman"/>
+                <w:kern w:val="0"/>
+                <w:sz w:val="24"/>
+                <w:szCs w:val="24"/>
+                <w:bdr w:val="none" w:color="auto" w:sz="0" w:space="0"/>
+                <w:lang w:val="en-US" w:eastAsia="zh-CN" w:bidi="ar"/>
+              </w:rPr>
+              <w:t>3. MovieController gọi MovieService.getMovieDetail(id).</w:t>
+            </w:r>
+          </w:p>
+          <w:p>
+            <w:pPr>
+              <w:keepNext w:val="0"/>
+              <w:keepLines w:val="0"/>
+              <w:widowControl/>
+              <w:suppressLineNumbers w:val="0"/>
+              <w:spacing w:before="0" w:beforeAutospacing="0" w:after="0" w:afterAutospacing="0"/>
+              <w:ind w:left="0" w:right="0"/>
+              <w:jc w:val="left"/>
+              <w:rPr>
+                <w:bdr w:val="none" w:color="auto" w:sz="0" w:space="0"/>
+              </w:rPr>
+            </w:pPr>
+            <w:r>
+              <w:rPr>
+                <w:rFonts w:hint="default" w:ascii="Times New Roman" w:hAnsi="Times New Roman" w:eastAsia="Times New Roman" w:cs="Times New Roman"/>
+                <w:kern w:val="0"/>
+                <w:sz w:val="24"/>
+                <w:szCs w:val="24"/>
+                <w:bdr w:val="none" w:color="auto" w:sz="0" w:space="0"/>
+                <w:lang w:val="en-US" w:eastAsia="zh-CN" w:bidi="ar"/>
+              </w:rPr>
+              <w:t>4. MovieService gọi MovieDAO.findById(id).</w:t>
+            </w:r>
+          </w:p>
+          <w:p>
+            <w:pPr>
+              <w:keepNext w:val="0"/>
+              <w:keepLines w:val="0"/>
+              <w:widowControl/>
+              <w:suppressLineNumbers w:val="0"/>
+              <w:spacing w:before="0" w:beforeAutospacing="0" w:after="0" w:afterAutospacing="0"/>
+              <w:ind w:left="0" w:right="0"/>
+              <w:jc w:val="left"/>
+              <w:rPr>
+                <w:bdr w:val="none" w:color="auto" w:sz="0" w:space="0"/>
+              </w:rPr>
+            </w:pPr>
+            <w:r>
+              <w:rPr>
+                <w:rFonts w:hint="default" w:ascii="Times New Roman" w:hAnsi="Times New Roman" w:eastAsia="Times New Roman" w:cs="Times New Roman"/>
+                <w:kern w:val="0"/>
+                <w:sz w:val="24"/>
+                <w:szCs w:val="24"/>
+                <w:bdr w:val="none" w:color="auto" w:sz="0" w:space="0"/>
+                <w:lang w:val="en-US" w:eastAsia="zh-CN" w:bidi="ar"/>
+              </w:rPr>
+              <w:t>5. MovieDAO truy vấn phim theo id và điều kiện status = NOW_SHOWING.</w:t>
+            </w:r>
+          </w:p>
+          <w:p>
+            <w:pPr>
+              <w:keepNext w:val="0"/>
+              <w:keepLines w:val="0"/>
+              <w:widowControl/>
+              <w:suppressLineNumbers w:val="0"/>
+              <w:spacing w:before="0" w:beforeAutospacing="0" w:after="0" w:afterAutospacing="0"/>
+              <w:ind w:left="0" w:right="0"/>
+              <w:jc w:val="left"/>
+              <w:rPr>
+                <w:bdr w:val="none" w:color="auto" w:sz="0" w:space="0"/>
+              </w:rPr>
+            </w:pPr>
+            <w:r>
+              <w:rPr>
+                <w:rFonts w:hint="default" w:ascii="Times New Roman" w:hAnsi="Times New Roman" w:eastAsia="Times New Roman" w:cs="Times New Roman"/>
+                <w:kern w:val="0"/>
+                <w:sz w:val="24"/>
+                <w:szCs w:val="24"/>
+                <w:bdr w:val="none" w:color="auto" w:sz="0" w:space="0"/>
+                <w:lang w:val="en-US" w:eastAsia="zh-CN" w:bidi="ar"/>
+              </w:rPr>
+              <w:t>6. Vì phim không thỏa điều kiện trạng thái, MovieDAO trả về null.</w:t>
+            </w:r>
+          </w:p>
+          <w:p>
+            <w:pPr>
+              <w:keepNext w:val="0"/>
+              <w:keepLines w:val="0"/>
+              <w:widowControl/>
+              <w:suppressLineNumbers w:val="0"/>
+              <w:spacing w:before="0" w:beforeAutospacing="0" w:after="0" w:afterAutospacing="0"/>
+              <w:ind w:left="0" w:right="0"/>
+              <w:jc w:val="left"/>
+              <w:rPr>
+                <w:bdr w:val="none" w:color="auto" w:sz="0" w:space="0"/>
+              </w:rPr>
+            </w:pPr>
+            <w:r>
+              <w:rPr>
+                <w:rFonts w:hint="default" w:ascii="Times New Roman" w:hAnsi="Times New Roman" w:eastAsia="Times New Roman" w:cs="Times New Roman"/>
+                <w:kern w:val="0"/>
+                <w:sz w:val="24"/>
+                <w:szCs w:val="24"/>
+                <w:bdr w:val="none" w:color="auto" w:sz="0" w:space="0"/>
+                <w:lang w:val="en-US" w:eastAsia="zh-CN" w:bidi="ar"/>
+              </w:rPr>
+              <w:t>7. MovieController kiểm tra movie == null.</w:t>
+            </w:r>
+          </w:p>
+        </w:tc>
+      </w:tr>
+      <w:tr>
+        <w:tblPrEx>
+          <w:tblBorders>
+            <w:top w:val="single" w:color="auto" w:sz="4" w:space="0"/>
+            <w:left w:val="single" w:color="auto" w:sz="4" w:space="0"/>
+            <w:bottom w:val="single" w:color="auto" w:sz="4" w:space="0"/>
+            <w:right w:val="single" w:color="auto" w:sz="4" w:space="0"/>
+            <w:insideH w:val="single" w:color="auto" w:sz="4" w:space="0"/>
+            <w:insideV w:val="single" w:color="auto" w:sz="4" w:space="0"/>
+          </w:tblBorders>
+          <w:shd w:val="clear"/>
+          <w:tblCellMar>
+            <w:top w:w="0" w:type="dxa"/>
+            <w:left w:w="10" w:type="dxa"/>
+            <w:bottom w:w="0" w:type="dxa"/>
+            <w:right w:w="10" w:type="dxa"/>
+          </w:tblCellMar>
+        </w:tblPrEx>
+        <w:tc>
+          <w:tcPr>
+            <w:tcW w:w="2000" w:type="dxa"/>
+            <w:tcBorders>
+              <w:top w:val="single" w:color="000000" w:sz="6" w:space="0"/>
+              <w:left w:val="single" w:color="000000" w:sz="6" w:space="0"/>
+              <w:bottom w:val="single" w:color="000000" w:sz="6" w:space="0"/>
+              <w:right w:val="single" w:color="000000" w:sz="6" w:space="0"/>
+            </w:tcBorders>
+            <w:shd w:val="clear" w:color="auto" w:fill="D9D9D9"/>
+            <w:tcMar>
+              <w:top w:w="80" w:type="dxa"/>
+              <w:left w:w="120" w:type="dxa"/>
+              <w:bottom w:w="80" w:type="dxa"/>
+              <w:right w:w="120" w:type="dxa"/>
+            </w:tcMar>
+            <w:vAlign w:val="center"/>
+          </w:tcPr>
+          <w:p>
+            <w:pPr>
+              <w:keepNext w:val="0"/>
+              <w:keepLines w:val="0"/>
+              <w:widowControl/>
+              <w:suppressLineNumbers w:val="0"/>
+              <w:spacing w:before="0" w:beforeAutospacing="0" w:after="0" w:afterAutospacing="0"/>
+              <w:ind w:left="0" w:right="0"/>
+              <w:jc w:val="left"/>
+              <w:rPr>
+                <w:bdr w:val="none" w:color="auto" w:sz="0" w:space="0"/>
+              </w:rPr>
+            </w:pPr>
+            <w:r>
+              <w:rPr>
+                <w:rFonts w:hint="default" w:ascii="Times New Roman" w:hAnsi="Times New Roman" w:eastAsia="Times New Roman" w:cs="Times New Roman"/>
+                <w:b/>
+                <w:bCs/>
+                <w:color w:val="auto"/>
+                <w:kern w:val="0"/>
+                <w:sz w:val="24"/>
+                <w:szCs w:val="24"/>
+                <w:bdr w:val="none" w:color="auto" w:sz="0" w:space="0"/>
+                <w:lang w:val="en-US" w:eastAsia="zh-CN" w:bidi="ar"/>
+              </w:rPr>
+              <w:t>Kết quả mong đợi</w:t>
+            </w:r>
+          </w:p>
+        </w:tc>
+        <w:tc>
+          <w:tcPr>
+            <w:tcW w:w="7026" w:type="dxa"/>
+            <w:tcBorders>
+              <w:top w:val="single" w:color="000000" w:sz="6" w:space="0"/>
+              <w:left w:val="single" w:color="000000" w:sz="6" w:space="0"/>
+              <w:bottom w:val="single" w:color="000000" w:sz="6" w:space="0"/>
+              <w:right w:val="single" w:color="000000" w:sz="6" w:space="0"/>
+            </w:tcBorders>
+            <w:shd w:val="clear"/>
+            <w:tcMar>
+              <w:top w:w="80" w:type="dxa"/>
+              <w:left w:w="120" w:type="dxa"/>
+              <w:bottom w:w="80" w:type="dxa"/>
+              <w:right w:w="120" w:type="dxa"/>
+            </w:tcMar>
+            <w:vAlign w:val="center"/>
+          </w:tcPr>
+          <w:p>
+            <w:pPr>
+              <w:keepNext w:val="0"/>
+              <w:keepLines w:val="0"/>
+              <w:widowControl/>
+              <w:suppressLineNumbers w:val="0"/>
+              <w:spacing w:before="0" w:beforeAutospacing="0" w:after="0" w:afterAutospacing="0"/>
+              <w:ind w:left="0" w:right="0"/>
+              <w:jc w:val="left"/>
+              <w:rPr>
+                <w:bdr w:val="none" w:color="auto" w:sz="0" w:space="0"/>
+              </w:rPr>
+            </w:pPr>
+            <w:r>
+              <w:rPr>
+                <w:rFonts w:hint="default" w:ascii="Times New Roman" w:hAnsi="Times New Roman" w:eastAsia="Times New Roman" w:cs="Times New Roman"/>
+                <w:kern w:val="0"/>
+                <w:sz w:val="24"/>
+                <w:szCs w:val="24"/>
+                <w:bdr w:val="none" w:color="auto" w:sz="0" w:space="0"/>
+                <w:lang w:val="en-US" w:eastAsia="zh-CN" w:bidi="ar"/>
+              </w:rPr>
+              <w:t>1. Hệ thống không hiển thị trang chi tiết của phim không hợp lệ.</w:t>
+            </w:r>
+          </w:p>
+          <w:p>
+            <w:pPr>
+              <w:keepNext w:val="0"/>
+              <w:keepLines w:val="0"/>
+              <w:widowControl/>
+              <w:suppressLineNumbers w:val="0"/>
+              <w:spacing w:before="0" w:beforeAutospacing="0" w:after="0" w:afterAutospacing="0"/>
+              <w:ind w:left="0" w:right="0"/>
+              <w:jc w:val="left"/>
+              <w:rPr>
+                <w:bdr w:val="none" w:color="auto" w:sz="0" w:space="0"/>
+              </w:rPr>
+            </w:pPr>
+            <w:r>
+              <w:rPr>
+                <w:rFonts w:hint="default" w:ascii="Times New Roman" w:hAnsi="Times New Roman" w:eastAsia="Times New Roman" w:cs="Times New Roman"/>
+                <w:kern w:val="0"/>
+                <w:sz w:val="24"/>
+                <w:szCs w:val="24"/>
+                <w:bdr w:val="none" w:color="auto" w:sz="0" w:space="0"/>
+                <w:lang w:val="en-US" w:eastAsia="zh-CN" w:bidi="ar"/>
+              </w:rPr>
+              <w:t>2. Hệ thống redirect về trang danh sách phim (/movies).</w:t>
+            </w:r>
+          </w:p>
+          <w:p>
+            <w:pPr>
+              <w:keepNext w:val="0"/>
+              <w:keepLines w:val="0"/>
+              <w:widowControl/>
+              <w:suppressLineNumbers w:val="0"/>
+              <w:spacing w:before="0" w:beforeAutospacing="0" w:after="0" w:afterAutospacing="0"/>
+              <w:ind w:left="0" w:right="0"/>
+              <w:jc w:val="left"/>
+              <w:rPr>
+                <w:bdr w:val="none" w:color="auto" w:sz="0" w:space="0"/>
+              </w:rPr>
+            </w:pPr>
+            <w:r>
+              <w:rPr>
+                <w:rFonts w:hint="default" w:ascii="Times New Roman" w:hAnsi="Times New Roman" w:eastAsia="Times New Roman" w:cs="Times New Roman"/>
+                <w:kern w:val="0"/>
+                <w:sz w:val="24"/>
+                <w:szCs w:val="24"/>
+                <w:bdr w:val="none" w:color="auto" w:sz="0" w:space="0"/>
+                <w:lang w:val="en-US" w:eastAsia="zh-CN" w:bidi="ar"/>
+              </w:rPr>
+              <w:t>3. Không phát sinh lỗi HTTP 500.</w:t>
+            </w:r>
+          </w:p>
+          <w:p>
+            <w:pPr>
+              <w:keepNext w:val="0"/>
+              <w:keepLines w:val="0"/>
+              <w:widowControl/>
+              <w:suppressLineNumbers w:val="0"/>
+              <w:spacing w:before="0" w:beforeAutospacing="0" w:after="0" w:afterAutospacing="0"/>
+              <w:ind w:left="0" w:right="0"/>
+              <w:jc w:val="left"/>
+              <w:rPr>
+                <w:bdr w:val="none" w:color="auto" w:sz="0" w:space="0"/>
+              </w:rPr>
+            </w:pPr>
+            <w:r>
+              <w:rPr>
+                <w:rFonts w:hint="default" w:ascii="Times New Roman" w:hAnsi="Times New Roman" w:eastAsia="Times New Roman" w:cs="Times New Roman"/>
+                <w:kern w:val="0"/>
+                <w:sz w:val="24"/>
+                <w:szCs w:val="24"/>
+                <w:bdr w:val="none" w:color="auto" w:sz="0" w:space="0"/>
+                <w:lang w:val="en-US" w:eastAsia="zh-CN" w:bidi="ar"/>
+              </w:rPr>
+              <w:t>4. Không có dữ liệu phim không được phép hiển thị xuất hiện trên giao diện.</w:t>
+            </w:r>
+          </w:p>
+        </w:tc>
+      </w:tr>
+    </w:tbl>
+    <w:p>
+      <w:pPr>
+        <w:spacing w:line="360" w:lineRule="auto"/>
+      </w:pPr>
+    </w:p>
+    <w:p>
+      <w:pPr>
         <w:pStyle w:val="2"/>
         <w:pageBreakBefore/>
         <w:spacing w:line="360" w:lineRule="auto"/>
@@ -15576,8 +16446,8 @@
           <w:rFonts w:ascii="Arial" w:hAnsi="Arial"/>
         </w:rPr>
       </w:pPr>
-      <w:bookmarkStart w:id="43" w:name="_Toc228887530"/>
-      <w:bookmarkStart w:id="44" w:name="_Toc9810"/>
+      <w:bookmarkStart w:id="43" w:name="_Toc9810"/>
+      <w:bookmarkStart w:id="44" w:name="_Toc228887530"/>
       <w:bookmarkStart w:id="45" w:name="_Toc7416"/>
       <w:r>
         <w:rPr>
@@ -17537,7 +18407,7 @@
   <w:docDefaults>
     <w:rPrDefault>
       <w:rPr>
-        <w:rFonts w:ascii="Times New Roman" w:hAnsi="Times New Roman" w:eastAsia="Times New Roman" w:cs="Times New Roman"/>
+        <w:rFonts w:ascii="Times New Roman" w:hAnsi="Times New Roman" w:eastAsia="SimSun" w:cs="Times New Roman"/>
       </w:rPr>
     </w:rPrDefault>
     <w:pPrDefault/>
@@ -17562,8 +18432,8 @@
     <w:lsdException w:unhideWhenUsed="0" w:uiPriority="0" w:semiHidden="0" w:name="index 7"/>
     <w:lsdException w:unhideWhenUsed="0" w:uiPriority="0" w:semiHidden="0" w:name="index 8"/>
     <w:lsdException w:unhideWhenUsed="0" w:uiPriority="0" w:semiHidden="0" w:name="index 9"/>
-    <w:lsdException w:unhideWhenUsed="0" w:uiPriority="0" w:semiHidden="0" w:name="toc 1"/>
-    <w:lsdException w:unhideWhenUsed="0" w:uiPriority="0" w:semiHidden="0" w:name="toc 2"/>
+    <w:lsdException w:qFormat="1" w:unhideWhenUsed="0" w:uiPriority="0" w:semiHidden="0" w:name="toc 1"/>
+    <w:lsdException w:qFormat="1" w:unhideWhenUsed="0" w:uiPriority="0" w:semiHidden="0" w:name="toc 2"/>
     <w:lsdException w:unhideWhenUsed="0" w:uiPriority="0" w:semiHidden="0" w:name="toc 3"/>
     <w:lsdException w:unhideWhenUsed="0" w:uiPriority="0" w:semiHidden="0" w:name="toc 4"/>
     <w:lsdException w:unhideWhenUsed="0" w:uiPriority="0" w:semiHidden="0" w:name="toc 5"/>
@@ -17608,7 +18478,7 @@
     <w:lsdException w:qFormat="1" w:unhideWhenUsed="0" w:uiPriority="0" w:semiHidden="0" w:name="Title"/>
     <w:lsdException w:unhideWhenUsed="0" w:uiPriority="0" w:semiHidden="0" w:name="Closing"/>
     <w:lsdException w:unhideWhenUsed="0" w:uiPriority="0" w:semiHidden="0" w:name="Signature"/>
-    <w:lsdException w:uiPriority="1" w:semiHidden="0" w:name="Default Paragraph Font"/>
+    <w:lsdException w:qFormat="1" w:uiPriority="1" w:semiHidden="0" w:name="Default Paragraph Font"/>
     <w:lsdException w:unhideWhenUsed="0" w:uiPriority="0" w:semiHidden="0" w:name="Body Text"/>
     <w:lsdException w:unhideWhenUsed="0" w:uiPriority="0" w:semiHidden="0" w:name="Body Text Indent"/>
     <w:lsdException w:unhideWhenUsed="0" w:uiPriority="0" w:semiHidden="0" w:name="List Continue"/>
@@ -17827,6 +18697,7 @@
     <w:name w:val="heading 2"/>
     <w:basedOn w:val="1"/>
     <w:next w:val="1"/>
+    <w:link w:val="22"/>
     <w:qFormat/>
     <w:uiPriority w:val="0"/>
     <w:pPr>
@@ -17913,6 +18784,7 @@
   <w:style w:type="character" w:default="1" w:styleId="8">
     <w:name w:val="Default Paragraph Font"/>
     <w:unhideWhenUsed/>
+    <w:qFormat/>
     <w:uiPriority w:val="1"/>
   </w:style>
   <w:style w:type="table" w:default="1" w:styleId="9">
@@ -17920,6 +18792,19 @@
     <w:semiHidden/>
     <w:unhideWhenUsed/>
     <w:uiPriority w:val="99"/>
+    <w:pPr>
+      <w:keepNext w:val="0"/>
+      <w:keepLines w:val="0"/>
+      <w:widowControl/>
+      <w:suppressLineNumbers w:val="0"/>
+      <w:spacing w:before="0" w:beforeAutospacing="0" w:after="0" w:afterAutospacing="0"/>
+      <w:ind w:left="0" w:right="0"/>
+    </w:pPr>
+    <w:rPr>
+      <w:rFonts w:hint="default" w:ascii="Times New Roman" w:hAnsi="Times New Roman" w:cs="Times New Roman"/>
+      <w:sz w:val="20"/>
+      <w:szCs w:val="20"/>
+    </w:rPr>
     <w:tblPr>
       <w:tblCellMar>
         <w:top w:w="0" w:type="dxa"/>
@@ -18014,12 +18899,14 @@
     <w:name w:val="toc 1"/>
     <w:basedOn w:val="1"/>
     <w:next w:val="1"/>
+    <w:qFormat/>
     <w:uiPriority w:val="0"/>
   </w:style>
   <w:style w:type="paragraph" w:styleId="18">
     <w:name w:val="toc 2"/>
     <w:basedOn w:val="1"/>
     <w:next w:val="1"/>
+    <w:qFormat/>
     <w:uiPriority w:val="0"/>
     <w:pPr>
       <w:ind w:left="420" w:leftChars="200"/>
@@ -18053,6 +18940,18 @@
     <w:rPr>
       <w:sz w:val="20"/>
       <w:szCs w:val="20"/>
+    </w:rPr>
+  </w:style>
+  <w:style w:type="character" w:customStyle="1" w:styleId="22">
+    <w:name w:val="Heading 2 Char"/>
+    <w:link w:val="3"/>
+    <w:uiPriority w:val="0"/>
+    <w:rPr>
+      <w:b/>
+      <w:bCs/>
+      <w:color w:val="000000"/>
+      <w:sz w:val="26"/>
+      <w:szCs w:val="26"/>
     </w:rPr>
   </w:style>
 </w:styles>

</xml_diff>

<commit_message>
cập nhật sequence hoàn thiện
</commit_message>
<xml_diff>
--- a/docs/Thu2_Ca3_Nhom4_23130102_BuiVanHieu.docx
+++ b/docs/Thu2_Ca3_Nhom4_23130102_BuiVanHieu.docx
@@ -2598,6 +2598,547 @@
           </w:p>
         </w:tc>
       </w:tr>
+      <w:tr>
+        <w:tblPrEx>
+          <w:tblBorders>
+            <w:top w:val="single" w:color="auto" w:sz="4" w:space="0"/>
+            <w:left w:val="single" w:color="auto" w:sz="4" w:space="0"/>
+            <w:bottom w:val="single" w:color="auto" w:sz="4" w:space="0"/>
+            <w:right w:val="single" w:color="auto" w:sz="4" w:space="0"/>
+            <w:insideH w:val="single" w:color="auto" w:sz="4" w:space="0"/>
+            <w:insideV w:val="single" w:color="auto" w:sz="4" w:space="0"/>
+          </w:tblBorders>
+          <w:shd w:val="clear" w:color="auto" w:fill="auto"/>
+          <w:tblCellMar>
+            <w:top w:w="0" w:type="dxa"/>
+            <w:left w:w="108" w:type="dxa"/>
+            <w:bottom w:w="0" w:type="dxa"/>
+            <w:right w:w="108" w:type="dxa"/>
+          </w:tblCellMar>
+        </w:tblPrEx>
+        <w:tc>
+          <w:tcPr>
+            <w:tcW w:w="2209" w:type="dxa"/>
+            <w:tcBorders>
+              <w:top w:val="single" w:color="auto" w:sz="4" w:space="0"/>
+              <w:left w:val="single" w:color="auto" w:sz="4" w:space="0"/>
+              <w:bottom w:val="single" w:color="auto" w:sz="4" w:space="0"/>
+              <w:right w:val="single" w:color="auto" w:sz="4" w:space="0"/>
+            </w:tcBorders>
+            <w:shd w:val="clear" w:color="auto" w:fill="auto"/>
+            <w:vAlign w:val="top"/>
+          </w:tcPr>
+          <w:p>
+            <w:pPr>
+              <w:keepNext w:val="0"/>
+              <w:keepLines w:val="0"/>
+              <w:widowControl/>
+              <w:suppressLineNumbers w:val="0"/>
+              <w:spacing w:before="40" w:beforeAutospacing="0" w:after="40" w:afterAutospacing="0" w:line="360" w:lineRule="auto"/>
+              <w:ind w:left="360" w:right="0"/>
+              <w:jc w:val="center"/>
+              <w:rPr>
+                <w:rFonts w:hint="default" w:ascii="Times New Roman" w:hAnsi="Times New Roman" w:eastAsia="Times New Roman" w:cs="Times New Roman"/>
+                <w:kern w:val="0"/>
+                <w:sz w:val="24"/>
+                <w:szCs w:val="24"/>
+                <w:lang w:val="en-US" w:eastAsia="zh-CN" w:bidi="ar"/>
+              </w:rPr>
+            </w:pPr>
+            <w:r>
+              <w:rPr>
+                <w:rFonts w:hint="default" w:ascii="Times New Roman" w:hAnsi="Times New Roman" w:eastAsia="Times New Roman" w:cs="Times New Roman"/>
+                <w:kern w:val="0"/>
+                <w:sz w:val="24"/>
+                <w:szCs w:val="24"/>
+                <w:lang w:val="en-US" w:eastAsia="zh-CN" w:bidi="ar"/>
+              </w:rPr>
+              <w:t>03/06/2026</w:t>
+            </w:r>
+          </w:p>
+        </w:tc>
+        <w:tc>
+          <w:tcPr>
+            <w:tcW w:w="2209" w:type="dxa"/>
+            <w:tcBorders>
+              <w:top w:val="single" w:color="auto" w:sz="4" w:space="0"/>
+              <w:left w:val="single" w:color="auto" w:sz="4" w:space="0"/>
+              <w:bottom w:val="single" w:color="auto" w:sz="4" w:space="0"/>
+              <w:right w:val="single" w:color="auto" w:sz="4" w:space="0"/>
+            </w:tcBorders>
+            <w:shd w:val="clear" w:color="auto" w:fill="auto"/>
+            <w:vAlign w:val="top"/>
+          </w:tcPr>
+          <w:p>
+            <w:pPr>
+              <w:keepNext w:val="0"/>
+              <w:keepLines w:val="0"/>
+              <w:widowControl/>
+              <w:suppressLineNumbers w:val="0"/>
+              <w:spacing w:before="40" w:beforeAutospacing="0" w:after="40" w:afterAutospacing="0" w:line="360" w:lineRule="auto"/>
+              <w:ind w:left="360" w:right="0"/>
+              <w:jc w:val="center"/>
+              <w:rPr>
+                <w:rFonts w:hint="default" w:ascii="Times New Roman" w:hAnsi="Times New Roman" w:eastAsia="Times New Roman" w:cs="Times New Roman"/>
+                <w:kern w:val="0"/>
+                <w:sz w:val="24"/>
+                <w:szCs w:val="24"/>
+                <w:lang w:val="en-US" w:eastAsia="zh-CN" w:bidi="ar"/>
+              </w:rPr>
+            </w:pPr>
+            <w:r>
+              <w:rPr>
+                <w:rFonts w:hint="default" w:cs="Times New Roman"/>
+                <w:kern w:val="0"/>
+                <w:sz w:val="24"/>
+                <w:szCs w:val="24"/>
+                <w:lang w:val="en-US" w:eastAsia="zh-CN" w:bidi="ar"/>
+              </w:rPr>
+              <w:t>1.2</w:t>
+            </w:r>
+          </w:p>
+        </w:tc>
+        <w:tc>
+          <w:tcPr>
+            <w:tcW w:w="2209" w:type="dxa"/>
+            <w:tcBorders>
+              <w:top w:val="single" w:color="auto" w:sz="4" w:space="0"/>
+              <w:left w:val="single" w:color="auto" w:sz="4" w:space="0"/>
+              <w:bottom w:val="single" w:color="auto" w:sz="4" w:space="0"/>
+              <w:right w:val="single" w:color="auto" w:sz="4" w:space="0"/>
+            </w:tcBorders>
+            <w:shd w:val="clear" w:color="auto" w:fill="auto"/>
+            <w:vAlign w:val="top"/>
+          </w:tcPr>
+          <w:p>
+            <w:pPr>
+              <w:keepNext w:val="0"/>
+              <w:keepLines w:val="0"/>
+              <w:widowControl/>
+              <w:suppressLineNumbers w:val="0"/>
+              <w:spacing w:before="40" w:beforeAutospacing="0" w:after="40" w:afterAutospacing="0" w:line="360" w:lineRule="auto"/>
+              <w:ind w:left="360" w:right="0"/>
+              <w:jc w:val="center"/>
+              <w:rPr>
+                <w:rFonts w:hint="default" w:ascii="Times New Roman" w:hAnsi="Times New Roman" w:eastAsia="Times New Roman" w:cs="Times New Roman"/>
+                <w:kern w:val="0"/>
+                <w:sz w:val="24"/>
+                <w:szCs w:val="24"/>
+                <w:lang w:val="en-US" w:eastAsia="zh-CN" w:bidi="ar"/>
+              </w:rPr>
+            </w:pPr>
+            <w:r>
+              <w:rPr>
+                <w:rFonts w:hint="default" w:cs="Times New Roman"/>
+                <w:kern w:val="0"/>
+                <w:sz w:val="24"/>
+                <w:szCs w:val="24"/>
+                <w:lang w:val="en-US" w:eastAsia="zh-CN" w:bidi="ar"/>
+              </w:rPr>
+              <w:t>Bùi Văn Hiếu</w:t>
+            </w:r>
+          </w:p>
+        </w:tc>
+        <w:tc>
+          <w:tcPr>
+            <w:tcW w:w="2210" w:type="dxa"/>
+            <w:tcBorders>
+              <w:top w:val="single" w:color="auto" w:sz="4" w:space="0"/>
+              <w:left w:val="single" w:color="auto" w:sz="4" w:space="0"/>
+              <w:bottom w:val="single" w:color="auto" w:sz="4" w:space="0"/>
+              <w:right w:val="single" w:color="auto" w:sz="4" w:space="0"/>
+            </w:tcBorders>
+            <w:shd w:val="clear" w:color="auto" w:fill="auto"/>
+            <w:vAlign w:val="top"/>
+          </w:tcPr>
+          <w:p>
+            <w:pPr>
+              <w:keepNext w:val="0"/>
+              <w:keepLines w:val="0"/>
+              <w:widowControl/>
+              <w:suppressLineNumbers w:val="0"/>
+              <w:spacing w:before="40" w:beforeAutospacing="0" w:after="40" w:afterAutospacing="0" w:line="360" w:lineRule="auto"/>
+              <w:ind w:left="0" w:right="0"/>
+              <w:jc w:val="left"/>
+              <w:rPr>
+                <w:rFonts w:hint="default" w:ascii="Times New Roman" w:hAnsi="Times New Roman" w:eastAsia="Times New Roman" w:cs="Times New Roman"/>
+                <w:kern w:val="0"/>
+                <w:sz w:val="24"/>
+                <w:szCs w:val="24"/>
+                <w:lang w:val="en-US" w:eastAsia="zh-CN" w:bidi="ar"/>
+              </w:rPr>
+            </w:pPr>
+            <w:r>
+              <w:rPr>
+                <w:rFonts w:hint="default" w:ascii="Times New Roman" w:hAnsi="Times New Roman" w:eastAsia="Times New Roman" w:cs="Times New Roman"/>
+                <w:kern w:val="0"/>
+                <w:sz w:val="24"/>
+                <w:szCs w:val="24"/>
+                <w:lang w:val="en-US" w:eastAsia="zh-CN" w:bidi="ar"/>
+              </w:rPr>
+              <w:t>Cập nhật phần tóm tắt và mục lục của tài liệu; điều chỉnh nội dung liên quan đến các test case UC04 để phản ánh đầy đủ các trường hợp kiểm thử của chức năng xem chi tiết phim.</w:t>
+            </w:r>
+          </w:p>
+        </w:tc>
+      </w:tr>
+      <w:tr>
+        <w:tblPrEx>
+          <w:tblBorders>
+            <w:top w:val="single" w:color="auto" w:sz="4" w:space="0"/>
+            <w:left w:val="single" w:color="auto" w:sz="4" w:space="0"/>
+            <w:bottom w:val="single" w:color="auto" w:sz="4" w:space="0"/>
+            <w:right w:val="single" w:color="auto" w:sz="4" w:space="0"/>
+            <w:insideH w:val="single" w:color="auto" w:sz="4" w:space="0"/>
+            <w:insideV w:val="single" w:color="auto" w:sz="4" w:space="0"/>
+          </w:tblBorders>
+          <w:shd w:val="clear" w:color="auto" w:fill="auto"/>
+          <w:tblCellMar>
+            <w:top w:w="0" w:type="dxa"/>
+            <w:left w:w="108" w:type="dxa"/>
+            <w:bottom w:w="0" w:type="dxa"/>
+            <w:right w:w="108" w:type="dxa"/>
+          </w:tblCellMar>
+        </w:tblPrEx>
+        <w:tc>
+          <w:tcPr>
+            <w:tcW w:w="2209" w:type="dxa"/>
+            <w:tcBorders>
+              <w:top w:val="single" w:color="auto" w:sz="4" w:space="0"/>
+              <w:left w:val="single" w:color="auto" w:sz="4" w:space="0"/>
+              <w:bottom w:val="single" w:color="auto" w:sz="4" w:space="0"/>
+              <w:right w:val="single" w:color="auto" w:sz="4" w:space="0"/>
+            </w:tcBorders>
+            <w:shd w:val="clear" w:color="auto" w:fill="auto"/>
+            <w:vAlign w:val="top"/>
+          </w:tcPr>
+          <w:p>
+            <w:pPr>
+              <w:keepNext w:val="0"/>
+              <w:keepLines w:val="0"/>
+              <w:widowControl/>
+              <w:suppressLineNumbers w:val="0"/>
+              <w:spacing w:before="40" w:beforeAutospacing="0" w:after="40" w:afterAutospacing="0" w:line="360" w:lineRule="auto"/>
+              <w:ind w:left="360" w:right="0"/>
+              <w:jc w:val="center"/>
+              <w:rPr>
+                <w:rFonts w:hint="default" w:ascii="Times New Roman" w:hAnsi="Times New Roman" w:eastAsia="Times New Roman" w:cs="Times New Roman"/>
+                <w:kern w:val="0"/>
+                <w:sz w:val="24"/>
+                <w:szCs w:val="24"/>
+                <w:lang w:val="en-US" w:eastAsia="zh-CN" w:bidi="ar"/>
+              </w:rPr>
+            </w:pPr>
+            <w:r>
+              <w:rPr>
+                <w:rFonts w:hint="default" w:ascii="Times New Roman" w:hAnsi="Times New Roman" w:eastAsia="Times New Roman" w:cs="Times New Roman"/>
+                <w:kern w:val="0"/>
+                <w:sz w:val="24"/>
+                <w:szCs w:val="24"/>
+                <w:lang w:val="en-US" w:eastAsia="zh-CN" w:bidi="ar"/>
+              </w:rPr>
+              <w:t>06/06/2026</w:t>
+            </w:r>
+          </w:p>
+        </w:tc>
+        <w:tc>
+          <w:tcPr>
+            <w:tcW w:w="2209" w:type="dxa"/>
+            <w:tcBorders>
+              <w:top w:val="single" w:color="auto" w:sz="4" w:space="0"/>
+              <w:left w:val="single" w:color="auto" w:sz="4" w:space="0"/>
+              <w:bottom w:val="single" w:color="auto" w:sz="4" w:space="0"/>
+              <w:right w:val="single" w:color="auto" w:sz="4" w:space="0"/>
+            </w:tcBorders>
+            <w:shd w:val="clear" w:color="auto" w:fill="auto"/>
+            <w:vAlign w:val="top"/>
+          </w:tcPr>
+          <w:p>
+            <w:pPr>
+              <w:keepNext w:val="0"/>
+              <w:keepLines w:val="0"/>
+              <w:widowControl/>
+              <w:suppressLineNumbers w:val="0"/>
+              <w:spacing w:before="40" w:beforeAutospacing="0" w:after="40" w:afterAutospacing="0" w:line="360" w:lineRule="auto"/>
+              <w:ind w:left="360" w:right="0"/>
+              <w:jc w:val="center"/>
+              <w:rPr>
+                <w:rFonts w:hint="default" w:cs="Times New Roman"/>
+                <w:kern w:val="0"/>
+                <w:sz w:val="24"/>
+                <w:szCs w:val="24"/>
+                <w:lang w:val="en-US" w:eastAsia="zh-CN" w:bidi="ar"/>
+              </w:rPr>
+            </w:pPr>
+            <w:r>
+              <w:rPr>
+                <w:rFonts w:hint="default" w:cs="Times New Roman"/>
+                <w:kern w:val="0"/>
+                <w:sz w:val="24"/>
+                <w:szCs w:val="24"/>
+                <w:lang w:val="en-US" w:eastAsia="zh-CN" w:bidi="ar"/>
+              </w:rPr>
+              <w:t>1.3</w:t>
+            </w:r>
+          </w:p>
+        </w:tc>
+        <w:tc>
+          <w:tcPr>
+            <w:tcW w:w="2209" w:type="dxa"/>
+            <w:tcBorders>
+              <w:top w:val="single" w:color="auto" w:sz="4" w:space="0"/>
+              <w:left w:val="single" w:color="auto" w:sz="4" w:space="0"/>
+              <w:bottom w:val="single" w:color="auto" w:sz="4" w:space="0"/>
+              <w:right w:val="single" w:color="auto" w:sz="4" w:space="0"/>
+            </w:tcBorders>
+            <w:shd w:val="clear" w:color="auto" w:fill="auto"/>
+            <w:vAlign w:val="top"/>
+          </w:tcPr>
+          <w:p>
+            <w:pPr>
+              <w:keepNext w:val="0"/>
+              <w:keepLines w:val="0"/>
+              <w:widowControl/>
+              <w:suppressLineNumbers w:val="0"/>
+              <w:spacing w:before="40" w:beforeAutospacing="0" w:after="40" w:afterAutospacing="0" w:line="360" w:lineRule="auto"/>
+              <w:ind w:left="360" w:right="0"/>
+              <w:jc w:val="center"/>
+              <w:rPr>
+                <w:rFonts w:hint="default" w:cs="Times New Roman"/>
+                <w:kern w:val="0"/>
+                <w:sz w:val="24"/>
+                <w:szCs w:val="24"/>
+                <w:lang w:val="en-US" w:eastAsia="zh-CN" w:bidi="ar"/>
+              </w:rPr>
+            </w:pPr>
+            <w:r>
+              <w:rPr>
+                <w:rFonts w:hint="default" w:cs="Times New Roman"/>
+                <w:kern w:val="0"/>
+                <w:sz w:val="24"/>
+                <w:szCs w:val="24"/>
+                <w:lang w:val="en-US" w:eastAsia="zh-CN" w:bidi="ar"/>
+              </w:rPr>
+              <w:t>Bùi Văn Hiếu</w:t>
+            </w:r>
+          </w:p>
+        </w:tc>
+        <w:tc>
+          <w:tcPr>
+            <w:tcW w:w="2210" w:type="dxa"/>
+            <w:tcBorders>
+              <w:top w:val="single" w:color="auto" w:sz="4" w:space="0"/>
+              <w:left w:val="single" w:color="auto" w:sz="4" w:space="0"/>
+              <w:bottom w:val="single" w:color="auto" w:sz="4" w:space="0"/>
+              <w:right w:val="single" w:color="auto" w:sz="4" w:space="0"/>
+            </w:tcBorders>
+            <w:shd w:val="clear" w:color="auto" w:fill="auto"/>
+            <w:vAlign w:val="top"/>
+          </w:tcPr>
+          <w:p>
+            <w:pPr>
+              <w:keepNext w:val="0"/>
+              <w:keepLines w:val="0"/>
+              <w:widowControl/>
+              <w:suppressLineNumbers w:val="0"/>
+              <w:spacing w:before="40" w:beforeAutospacing="0" w:after="40" w:afterAutospacing="0" w:line="360" w:lineRule="auto"/>
+              <w:ind w:left="0" w:right="0"/>
+              <w:jc w:val="left"/>
+              <w:rPr>
+                <w:rFonts w:hint="default" w:ascii="Times New Roman" w:hAnsi="Times New Roman" w:eastAsia="Times New Roman" w:cs="Times New Roman"/>
+                <w:kern w:val="0"/>
+                <w:sz w:val="24"/>
+                <w:szCs w:val="24"/>
+                <w:lang w:val="en-US" w:eastAsia="zh-CN" w:bidi="ar"/>
+              </w:rPr>
+            </w:pPr>
+            <w:r>
+              <w:rPr>
+                <w:rFonts w:hint="default" w:ascii="Times New Roman" w:hAnsi="Times New Roman" w:eastAsia="Times New Roman" w:cs="Times New Roman"/>
+                <w:kern w:val="0"/>
+                <w:sz w:val="24"/>
+                <w:szCs w:val="24"/>
+                <w:lang w:val="en-US" w:eastAsia="zh-CN" w:bidi="ar"/>
+              </w:rPr>
+              <w:t>Đối chiếu và cập nhật tài liệu UC04 theo mã nguồn hiện tại, bao gồm Preconditions, Main Flow, Alternative Flows, Sequence Diagram và Test Case để khớp với luồng xử lý thực tế của chức năng xem chi tiết phim.</w:t>
+            </w:r>
+          </w:p>
+        </w:tc>
+      </w:tr>
+      <w:tr>
+        <w:tblPrEx>
+          <w:tblBorders>
+            <w:top w:val="single" w:color="auto" w:sz="4" w:space="0"/>
+            <w:left w:val="single" w:color="auto" w:sz="4" w:space="0"/>
+            <w:bottom w:val="single" w:color="auto" w:sz="4" w:space="0"/>
+            <w:right w:val="single" w:color="auto" w:sz="4" w:space="0"/>
+            <w:insideH w:val="single" w:color="auto" w:sz="4" w:space="0"/>
+            <w:insideV w:val="single" w:color="auto" w:sz="4" w:space="0"/>
+          </w:tblBorders>
+          <w:shd w:val="clear" w:color="auto" w:fill="auto"/>
+          <w:tblCellMar>
+            <w:top w:w="0" w:type="dxa"/>
+            <w:left w:w="108" w:type="dxa"/>
+            <w:bottom w:w="0" w:type="dxa"/>
+            <w:right w:w="108" w:type="dxa"/>
+          </w:tblCellMar>
+        </w:tblPrEx>
+        <w:tc>
+          <w:tcPr>
+            <w:tcW w:w="2209" w:type="dxa"/>
+            <w:tcBorders>
+              <w:top w:val="single" w:color="auto" w:sz="4" w:space="0"/>
+              <w:left w:val="single" w:color="auto" w:sz="4" w:space="0"/>
+              <w:bottom w:val="single" w:color="auto" w:sz="4" w:space="0"/>
+              <w:right w:val="single" w:color="auto" w:sz="4" w:space="0"/>
+            </w:tcBorders>
+            <w:shd w:val="clear" w:color="auto" w:fill="auto"/>
+            <w:vAlign w:val="top"/>
+          </w:tcPr>
+          <w:p>
+            <w:pPr>
+              <w:keepNext w:val="0"/>
+              <w:keepLines w:val="0"/>
+              <w:widowControl/>
+              <w:suppressLineNumbers w:val="0"/>
+              <w:spacing w:before="40" w:beforeAutospacing="0" w:after="40" w:afterAutospacing="0" w:line="360" w:lineRule="auto"/>
+              <w:ind w:left="360" w:right="0"/>
+              <w:jc w:val="center"/>
+              <w:rPr>
+                <w:rFonts w:hint="default" w:ascii="Times New Roman" w:hAnsi="Times New Roman" w:eastAsia="Times New Roman" w:cs="Times New Roman"/>
+                <w:kern w:val="0"/>
+                <w:sz w:val="24"/>
+                <w:szCs w:val="24"/>
+                <w:lang w:val="en-US" w:eastAsia="zh-CN" w:bidi="ar"/>
+              </w:rPr>
+            </w:pPr>
+            <w:r>
+              <w:rPr>
+                <w:rFonts w:hint="default" w:ascii="Times New Roman" w:hAnsi="Times New Roman" w:eastAsia="Times New Roman" w:cs="Times New Roman"/>
+                <w:kern w:val="0"/>
+                <w:sz w:val="24"/>
+                <w:szCs w:val="24"/>
+                <w:lang w:val="en-US" w:eastAsia="zh-CN" w:bidi="ar"/>
+              </w:rPr>
+              <w:t>06/06/2026</w:t>
+            </w:r>
+          </w:p>
+        </w:tc>
+        <w:tc>
+          <w:tcPr>
+            <w:tcW w:w="2209" w:type="dxa"/>
+            <w:tcBorders>
+              <w:top w:val="single" w:color="auto" w:sz="4" w:space="0"/>
+              <w:left w:val="single" w:color="auto" w:sz="4" w:space="0"/>
+              <w:bottom w:val="single" w:color="auto" w:sz="4" w:space="0"/>
+              <w:right w:val="single" w:color="auto" w:sz="4" w:space="0"/>
+            </w:tcBorders>
+            <w:shd w:val="clear" w:color="auto" w:fill="auto"/>
+            <w:vAlign w:val="top"/>
+          </w:tcPr>
+          <w:p>
+            <w:pPr>
+              <w:keepNext w:val="0"/>
+              <w:keepLines w:val="0"/>
+              <w:widowControl/>
+              <w:suppressLineNumbers w:val="0"/>
+              <w:spacing w:before="40" w:beforeAutospacing="0" w:after="40" w:afterAutospacing="0" w:line="360" w:lineRule="auto"/>
+              <w:ind w:left="360" w:right="0"/>
+              <w:jc w:val="center"/>
+              <w:rPr>
+                <w:rFonts w:hint="default" w:cs="Times New Roman"/>
+                <w:kern w:val="0"/>
+                <w:sz w:val="24"/>
+                <w:szCs w:val="24"/>
+                <w:lang w:val="en-US" w:eastAsia="zh-CN" w:bidi="ar"/>
+              </w:rPr>
+            </w:pPr>
+            <w:r>
+              <w:rPr>
+                <w:rFonts w:hint="default" w:cs="Times New Roman"/>
+                <w:kern w:val="0"/>
+                <w:sz w:val="24"/>
+                <w:szCs w:val="24"/>
+                <w:lang w:val="en-US" w:eastAsia="zh-CN" w:bidi="ar"/>
+              </w:rPr>
+              <w:t>1.4</w:t>
+            </w:r>
+          </w:p>
+        </w:tc>
+        <w:tc>
+          <w:tcPr>
+            <w:tcW w:w="2209" w:type="dxa"/>
+            <w:tcBorders>
+              <w:top w:val="single" w:color="auto" w:sz="4" w:space="0"/>
+              <w:left w:val="single" w:color="auto" w:sz="4" w:space="0"/>
+              <w:bottom w:val="single" w:color="auto" w:sz="4" w:space="0"/>
+              <w:right w:val="single" w:color="auto" w:sz="4" w:space="0"/>
+            </w:tcBorders>
+            <w:shd w:val="clear" w:color="auto" w:fill="auto"/>
+            <w:vAlign w:val="top"/>
+          </w:tcPr>
+          <w:p>
+            <w:pPr>
+              <w:keepNext w:val="0"/>
+              <w:keepLines w:val="0"/>
+              <w:widowControl/>
+              <w:suppressLineNumbers w:val="0"/>
+              <w:spacing w:before="40" w:beforeAutospacing="0" w:after="40" w:afterAutospacing="0" w:line="360" w:lineRule="auto"/>
+              <w:ind w:left="360" w:right="0"/>
+              <w:jc w:val="center"/>
+              <w:rPr>
+                <w:rFonts w:hint="default" w:cs="Times New Roman"/>
+                <w:kern w:val="0"/>
+                <w:sz w:val="24"/>
+                <w:szCs w:val="24"/>
+                <w:lang w:val="en-US" w:eastAsia="zh-CN" w:bidi="ar"/>
+              </w:rPr>
+            </w:pPr>
+            <w:r>
+              <w:rPr>
+                <w:rFonts w:hint="default" w:cs="Times New Roman"/>
+                <w:kern w:val="0"/>
+                <w:sz w:val="24"/>
+                <w:szCs w:val="24"/>
+                <w:lang w:val="en-US" w:eastAsia="zh-CN" w:bidi="ar"/>
+              </w:rPr>
+              <w:t>Bùi Văn Hiếu</w:t>
+            </w:r>
+          </w:p>
+        </w:tc>
+        <w:tc>
+          <w:tcPr>
+            <w:tcW w:w="2210" w:type="dxa"/>
+            <w:tcBorders>
+              <w:top w:val="single" w:color="auto" w:sz="4" w:space="0"/>
+              <w:left w:val="single" w:color="auto" w:sz="4" w:space="0"/>
+              <w:bottom w:val="single" w:color="auto" w:sz="4" w:space="0"/>
+              <w:right w:val="single" w:color="auto" w:sz="4" w:space="0"/>
+            </w:tcBorders>
+            <w:shd w:val="clear" w:color="auto" w:fill="auto"/>
+            <w:vAlign w:val="top"/>
+          </w:tcPr>
+          <w:p>
+            <w:pPr>
+              <w:keepNext w:val="0"/>
+              <w:keepLines w:val="0"/>
+              <w:widowControl/>
+              <w:suppressLineNumbers w:val="0"/>
+              <w:spacing w:before="40" w:beforeAutospacing="0" w:after="40" w:afterAutospacing="0" w:line="360" w:lineRule="auto"/>
+              <w:ind w:left="0" w:right="0"/>
+              <w:jc w:val="left"/>
+              <w:rPr>
+                <w:rFonts w:hint="default" w:ascii="Times New Roman" w:hAnsi="Times New Roman" w:eastAsia="Times New Roman" w:cs="Times New Roman"/>
+                <w:kern w:val="0"/>
+                <w:sz w:val="24"/>
+                <w:szCs w:val="24"/>
+                <w:lang w:val="en-US" w:eastAsia="zh-CN" w:bidi="ar"/>
+              </w:rPr>
+            </w:pPr>
+            <w:bookmarkStart w:id="144" w:name="_GoBack"/>
+            <w:bookmarkEnd w:id="144"/>
+          </w:p>
+        </w:tc>
+      </w:tr>
     </w:tbl>
     <w:p>
       <w:pPr>
@@ -2646,9 +3187,9 @@
           <w:lang w:val="en-US"/>
         </w:rPr>
       </w:pPr>
-      <w:bookmarkStart w:id="6" w:name="_Toc7225"/>
+      <w:bookmarkStart w:id="6" w:name="_Toc231414233"/>
       <w:bookmarkStart w:id="7" w:name="_Toc22296"/>
-      <w:bookmarkStart w:id="8" w:name="_Toc231414233"/>
+      <w:bookmarkStart w:id="8" w:name="_Toc7225"/>
       <w:r>
         <w:rPr>
           <w:lang w:val="en-US"/>
@@ -5140,8 +5681,8 @@
         </w:rPr>
       </w:pPr>
       <w:bookmarkStart w:id="9" w:name="_Toc1677"/>
-      <w:bookmarkStart w:id="10" w:name="_Toc231414234"/>
-      <w:bookmarkStart w:id="11" w:name="_Toc28442"/>
+      <w:bookmarkStart w:id="10" w:name="_Toc28442"/>
+      <w:bookmarkStart w:id="11" w:name="_Toc231414234"/>
       <w:r>
         <w:rPr>
           <w:lang w:val="en-US"/>
@@ -5161,9 +5702,9 @@
           <w:lang w:val="en-US"/>
         </w:rPr>
       </w:pPr>
-      <w:bookmarkStart w:id="12" w:name="_Toc30409"/>
-      <w:bookmarkStart w:id="13" w:name="_Toc28286"/>
-      <w:bookmarkStart w:id="14" w:name="_Toc231414235"/>
+      <w:bookmarkStart w:id="12" w:name="_Toc28286"/>
+      <w:bookmarkStart w:id="13" w:name="_Toc231414235"/>
+      <w:bookmarkStart w:id="14" w:name="_Toc30409"/>
       <w:r>
         <w:rPr>
           <w:lang w:val="en-US"/>
@@ -5209,8 +5750,8 @@
         </w:rPr>
       </w:pPr>
       <w:bookmarkStart w:id="15" w:name="_Toc9067"/>
-      <w:bookmarkStart w:id="16" w:name="_Toc1909"/>
-      <w:bookmarkStart w:id="17" w:name="_Toc231414236"/>
+      <w:bookmarkStart w:id="16" w:name="_Toc231414236"/>
+      <w:bookmarkStart w:id="17" w:name="_Toc1909"/>
       <w:r>
         <w:rPr>
           <w:lang w:val="en-US"/>
@@ -5255,9 +5796,9 @@
           <w:lang w:val="en-US"/>
         </w:rPr>
       </w:pPr>
-      <w:bookmarkStart w:id="18" w:name="_Toc3926"/>
+      <w:bookmarkStart w:id="18" w:name="_Toc231414237"/>
       <w:bookmarkStart w:id="19" w:name="_Toc9270"/>
-      <w:bookmarkStart w:id="20" w:name="_Toc231414237"/>
+      <w:bookmarkStart w:id="20" w:name="_Toc3926"/>
       <w:r>
         <w:rPr>
           <w:lang w:val="en-US"/>
@@ -5304,8 +5845,8 @@
         </w:rPr>
       </w:pPr>
       <w:bookmarkStart w:id="21" w:name="_Toc30898"/>
-      <w:bookmarkStart w:id="22" w:name="_Toc20435"/>
-      <w:bookmarkStart w:id="23" w:name="_Toc231414238"/>
+      <w:bookmarkStart w:id="22" w:name="_Toc231414238"/>
+      <w:bookmarkStart w:id="23" w:name="_Toc20435"/>
       <w:r>
         <w:rPr>
           <w:lang w:val="en-US"/>
@@ -5331,8 +5872,8 @@
       <w:bookmarkStart w:id="25" w:name="_Toc3516"/>
       <w:bookmarkStart w:id="26" w:name="_Toc15567"/>
       <w:bookmarkStart w:id="27" w:name="_Toc228887504"/>
-      <w:bookmarkStart w:id="28" w:name="_Toc228888348"/>
-      <w:bookmarkStart w:id="29" w:name="_Toc229943261"/>
+      <w:bookmarkStart w:id="28" w:name="_Toc229943261"/>
+      <w:bookmarkStart w:id="29" w:name="_Toc228888348"/>
       <w:bookmarkStart w:id="30" w:name="_Toc231414239"/>
       <w:r>
         <w:rPr>
@@ -5410,13 +5951,13 @@
           <w:lang w:val="en-US"/>
         </w:rPr>
       </w:pPr>
-      <w:bookmarkStart w:id="31" w:name="_Toc228888349"/>
+      <w:bookmarkStart w:id="31" w:name="_Toc229943262"/>
       <w:bookmarkStart w:id="32" w:name="_Toc228887505"/>
-      <w:bookmarkStart w:id="33" w:name="_Toc229943262"/>
-      <w:bookmarkStart w:id="34" w:name="_Toc229251622"/>
-      <w:bookmarkStart w:id="35" w:name="_Toc1553"/>
+      <w:bookmarkStart w:id="33" w:name="_Toc229251622"/>
+      <w:bookmarkStart w:id="34" w:name="_Toc228888349"/>
+      <w:bookmarkStart w:id="35" w:name="_Toc231414240"/>
       <w:bookmarkStart w:id="36" w:name="_Toc4596"/>
-      <w:bookmarkStart w:id="37" w:name="_Toc231414240"/>
+      <w:bookmarkStart w:id="37" w:name="_Toc1553"/>
       <w:r>
         <w:rPr>
           <w:lang w:val="en-US"/>
@@ -5543,7 +6084,6 @@
             <w:insideH w:val="single" w:color="auto" w:sz="4" w:space="0"/>
             <w:insideV w:val="single" w:color="auto" w:sz="4" w:space="0"/>
           </w:tblBorders>
-          <w:shd w:val="clear" w:color="auto" w:fill="auto"/>
           <w:tblCellMar>
             <w:top w:w="0" w:type="dxa"/>
             <w:left w:w="10" w:type="dxa"/>
@@ -6408,8 +6948,8 @@
         </w:rPr>
       </w:pPr>
       <w:bookmarkStart w:id="38" w:name="_Toc6816"/>
-      <w:bookmarkStart w:id="39" w:name="_Toc231414241"/>
-      <w:bookmarkStart w:id="40" w:name="_Toc22329"/>
+      <w:bookmarkStart w:id="39" w:name="_Toc22329"/>
+      <w:bookmarkStart w:id="40" w:name="_Toc231414241"/>
       <w:r>
         <w:rPr>
           <w:lang w:val="en-US"/>
@@ -7289,7 +7829,6 @@
             <w:insideH w:val="single" w:color="auto" w:sz="4" w:space="0"/>
             <w:insideV w:val="single" w:color="auto" w:sz="4" w:space="0"/>
           </w:tblBorders>
-          <w:shd w:val="clear" w:color="auto" w:fill="auto"/>
           <w:tblCellMar>
             <w:top w:w="0" w:type="dxa"/>
             <w:left w:w="10" w:type="dxa"/>
@@ -8274,7 +8813,6 @@
             <w:insideH w:val="single" w:color="auto" w:sz="4" w:space="0"/>
             <w:insideV w:val="single" w:color="auto" w:sz="4" w:space="0"/>
           </w:tblBorders>
-          <w:shd w:val="clear" w:color="auto" w:fill="auto"/>
           <w:tblCellMar>
             <w:top w:w="0" w:type="dxa"/>
             <w:left w:w="10" w:type="dxa"/>
@@ -8610,6 +9148,7 @@
             <w:insideH w:val="single" w:color="auto" w:sz="4" w:space="0"/>
             <w:insideV w:val="single" w:color="auto" w:sz="4" w:space="0"/>
           </w:tblBorders>
+          <w:shd w:val="clear" w:color="auto" w:fill="auto"/>
           <w:tblCellMar>
             <w:top w:w="0" w:type="dxa"/>
             <w:left w:w="108" w:type="dxa"/>
@@ -8893,6 +9432,7 @@
             <w:insideH w:val="single" w:color="auto" w:sz="4" w:space="0"/>
             <w:insideV w:val="single" w:color="auto" w:sz="4" w:space="0"/>
           </w:tblBorders>
+          <w:shd w:val="clear" w:color="auto" w:fill="auto"/>
           <w:tblCellMar>
             <w:top w:w="0" w:type="dxa"/>
             <w:left w:w="108" w:type="dxa"/>
@@ -9460,6 +10000,7 @@
             <w:insideH w:val="single" w:color="auto" w:sz="4" w:space="0"/>
             <w:insideV w:val="single" w:color="auto" w:sz="4" w:space="0"/>
           </w:tblBorders>
+          <w:shd w:val="clear" w:color="auto" w:fill="auto"/>
           <w:tblCellMar>
             <w:top w:w="0" w:type="dxa"/>
             <w:left w:w="108" w:type="dxa"/>
@@ -9743,6 +10284,7 @@
             <w:insideH w:val="single" w:color="auto" w:sz="4" w:space="0"/>
             <w:insideV w:val="single" w:color="auto" w:sz="4" w:space="0"/>
           </w:tblBorders>
+          <w:shd w:val="clear" w:color="auto" w:fill="auto"/>
           <w:tblCellMar>
             <w:top w:w="0" w:type="dxa"/>
             <w:left w:w="108" w:type="dxa"/>
@@ -10455,9 +10997,9 @@
           <w:lang w:val="en-US"/>
         </w:rPr>
       </w:pPr>
-      <w:bookmarkStart w:id="48" w:name="_Toc8765"/>
-      <w:bookmarkStart w:id="49" w:name="_Toc231414243"/>
-      <w:bookmarkStart w:id="50" w:name="_Toc382"/>
+      <w:bookmarkStart w:id="48" w:name="_Toc231414243"/>
+      <w:bookmarkStart w:id="49" w:name="_Toc382"/>
+      <w:bookmarkStart w:id="50" w:name="_Toc8765"/>
       <w:r>
         <w:rPr>
           <w:lang w:val="en-US"/>
@@ -10739,12 +11281,7 @@
             <w:insideH w:val="single" w:color="auto" w:sz="4" w:space="0"/>
             <w:insideV w:val="single" w:color="auto" w:sz="4" w:space="0"/>
           </w:tblBorders>
-          <w:tblCellMar>
-            <w:top w:w="0" w:type="dxa"/>
-            <w:left w:w="108" w:type="dxa"/>
-            <w:bottom w:w="0" w:type="dxa"/>
-            <w:right w:w="108" w:type="dxa"/>
-          </w:tblCellMar>
+          <w:shd w:val="clear" w:color="auto" w:fill="auto"/>
         </w:tblPrEx>
         <w:tc>
           <w:tcPr>
@@ -11729,9 +12266,9 @@
           <w:lang w:val="en-US"/>
         </w:rPr>
       </w:pPr>
-      <w:bookmarkStart w:id="51" w:name="_Toc231414244"/>
-      <w:bookmarkStart w:id="52" w:name="_Toc29555"/>
-      <w:bookmarkStart w:id="53" w:name="_Toc14852"/>
+      <w:bookmarkStart w:id="51" w:name="_Toc29555"/>
+      <w:bookmarkStart w:id="52" w:name="_Toc14852"/>
+      <w:bookmarkStart w:id="53" w:name="_Toc231414244"/>
       <w:r>
         <w:rPr>
           <w:lang w:val="en-US"/>
@@ -11924,8 +12461,8 @@
         </w:rPr>
       </w:pPr>
       <w:bookmarkStart w:id="57" w:name="_Toc231414246"/>
-      <w:bookmarkStart w:id="58" w:name="_Toc7349"/>
-      <w:bookmarkStart w:id="59" w:name="_Toc30027"/>
+      <w:bookmarkStart w:id="58" w:name="_Toc30027"/>
+      <w:bookmarkStart w:id="59" w:name="_Toc7349"/>
       <w:r>
         <w:rPr>
           <w:lang w:val="en-US"/>
@@ -12126,9 +12663,9 @@
           <w:lang w:val="en-US"/>
         </w:rPr>
       </w:pPr>
-      <w:bookmarkStart w:id="60" w:name="_Toc22913"/>
+      <w:bookmarkStart w:id="60" w:name="_Toc1750"/>
       <w:bookmarkStart w:id="61" w:name="_Toc231414247"/>
-      <w:bookmarkStart w:id="62" w:name="_Toc1750"/>
+      <w:bookmarkStart w:id="62" w:name="_Toc22913"/>
       <w:r>
         <w:rPr>
           <w:lang w:val="en-US"/>
@@ -12630,6 +13167,7 @@
             <w:insideH w:val="single" w:color="auto" w:sz="4" w:space="0"/>
             <w:insideV w:val="single" w:color="auto" w:sz="4" w:space="0"/>
           </w:tblBorders>
+          <w:shd w:val="clear" w:color="auto" w:fill="auto"/>
           <w:tblCellMar>
             <w:top w:w="0" w:type="dxa"/>
             <w:left w:w="10" w:type="dxa"/>
@@ -13060,7 +13598,6 @@
             <w:insideH w:val="single" w:color="auto" w:sz="4" w:space="0"/>
             <w:insideV w:val="single" w:color="auto" w:sz="4" w:space="0"/>
           </w:tblBorders>
-          <w:shd w:val="clear" w:color="auto" w:fill="auto"/>
           <w:tblCellMar>
             <w:top w:w="0" w:type="dxa"/>
             <w:left w:w="10" w:type="dxa"/>
@@ -13378,7 +13915,6 @@
             <w:insideH w:val="single" w:color="auto" w:sz="4" w:space="0"/>
             <w:insideV w:val="single" w:color="auto" w:sz="4" w:space="0"/>
           </w:tblBorders>
-          <w:shd w:val="clear" w:color="auto" w:fill="auto"/>
           <w:tblCellMar>
             <w:top w:w="0" w:type="dxa"/>
             <w:left w:w="10" w:type="dxa"/>
@@ -13500,8 +14036,8 @@
           <w:lang w:val="en-US"/>
         </w:rPr>
       </w:pPr>
-      <w:bookmarkStart w:id="66" w:name="_Toc231414249"/>
-      <w:bookmarkStart w:id="67" w:name="_Toc13122"/>
+      <w:bookmarkStart w:id="66" w:name="_Toc13122"/>
+      <w:bookmarkStart w:id="67" w:name="_Toc231414249"/>
       <w:bookmarkStart w:id="68" w:name="_Toc24085"/>
       <w:r>
         <w:rPr>
@@ -13549,6 +14085,7 @@
             <w:insideH w:val="single" w:color="auto" w:sz="4" w:space="0"/>
             <w:insideV w:val="single" w:color="auto" w:sz="4" w:space="0"/>
           </w:tblBorders>
+          <w:shd w:val="clear" w:color="auto" w:fill="auto"/>
           <w:tblCellMar>
             <w:top w:w="0" w:type="dxa"/>
             <w:left w:w="10" w:type="dxa"/>
@@ -13648,6 +14185,310 @@
                 <w:lang w:val="en-US" w:eastAsia="zh-CN" w:bidi="ar"/>
               </w:rPr>
               <w:t>Mô tả</w:t>
+            </w:r>
+          </w:p>
+        </w:tc>
+      </w:tr>
+      <w:tr>
+        <w:tblPrEx>
+          <w:tblBorders>
+            <w:top w:val="single" w:color="auto" w:sz="4" w:space="0"/>
+            <w:left w:val="single" w:color="auto" w:sz="4" w:space="0"/>
+            <w:bottom w:val="single" w:color="auto" w:sz="4" w:space="0"/>
+            <w:right w:val="single" w:color="auto" w:sz="4" w:space="0"/>
+            <w:insideH w:val="single" w:color="auto" w:sz="4" w:space="0"/>
+            <w:insideV w:val="single" w:color="auto" w:sz="4" w:space="0"/>
+          </w:tblBorders>
+          <w:tblCellMar>
+            <w:top w:w="0" w:type="dxa"/>
+            <w:left w:w="10" w:type="dxa"/>
+            <w:bottom w:w="0" w:type="dxa"/>
+            <w:right w:w="10" w:type="dxa"/>
+          </w:tblCellMar>
+        </w:tblPrEx>
+        <w:tc>
+          <w:tcPr>
+            <w:tcW w:w="1200" w:type="dxa"/>
+            <w:tcBorders>
+              <w:top w:val="single" w:color="000000" w:sz="6" w:space="0"/>
+              <w:left w:val="single" w:color="000000" w:sz="6" w:space="0"/>
+              <w:bottom w:val="single" w:color="000000" w:sz="6" w:space="0"/>
+              <w:right w:val="single" w:color="000000" w:sz="6" w:space="0"/>
+            </w:tcBorders>
+            <w:shd w:val="clear" w:color="auto" w:fill="auto"/>
+            <w:tcMar>
+              <w:top w:w="80" w:type="dxa"/>
+              <w:left w:w="120" w:type="dxa"/>
+              <w:bottom w:w="80" w:type="dxa"/>
+              <w:right w:w="120" w:type="dxa"/>
+            </w:tcMar>
+            <w:vAlign w:val="center"/>
+          </w:tcPr>
+          <w:p>
+            <w:pPr>
+              <w:keepNext w:val="0"/>
+              <w:keepLines w:val="0"/>
+              <w:widowControl/>
+              <w:suppressLineNumbers w:val="0"/>
+              <w:spacing w:before="40" w:beforeAutospacing="0" w:after="40" w:afterAutospacing="0" w:line="360" w:lineRule="auto"/>
+              <w:ind w:left="0" w:right="0"/>
+              <w:jc w:val="center"/>
+              <w:rPr>
+                <w:rFonts w:hint="default"/>
+              </w:rPr>
+            </w:pPr>
+            <w:r>
+              <w:rPr>
+                <w:rFonts w:hint="default" w:ascii="Times New Roman" w:hAnsi="Times New Roman" w:eastAsia="Times New Roman" w:cs="Times New Roman"/>
+                <w:kern w:val="0"/>
+                <w:sz w:val="24"/>
+                <w:szCs w:val="24"/>
+                <w:lang w:val="en-US" w:eastAsia="zh-CN" w:bidi="ar"/>
+              </w:rPr>
+              <w:t>4.1.0</w:t>
+            </w:r>
+          </w:p>
+        </w:tc>
+        <w:tc>
+          <w:tcPr>
+            <w:tcW w:w="7826" w:type="dxa"/>
+            <w:tcBorders>
+              <w:top w:val="single" w:color="000000" w:sz="6" w:space="0"/>
+              <w:left w:val="single" w:color="000000" w:sz="6" w:space="0"/>
+              <w:bottom w:val="single" w:color="000000" w:sz="6" w:space="0"/>
+              <w:right w:val="single" w:color="000000" w:sz="6" w:space="0"/>
+            </w:tcBorders>
+            <w:shd w:val="clear" w:color="auto" w:fill="auto"/>
+            <w:tcMar>
+              <w:top w:w="80" w:type="dxa"/>
+              <w:left w:w="120" w:type="dxa"/>
+              <w:bottom w:w="80" w:type="dxa"/>
+              <w:right w:w="120" w:type="dxa"/>
+            </w:tcMar>
+            <w:vAlign w:val="center"/>
+          </w:tcPr>
+          <w:p>
+            <w:pPr>
+              <w:keepNext w:val="0"/>
+              <w:keepLines w:val="0"/>
+              <w:widowControl/>
+              <w:suppressLineNumbers w:val="0"/>
+              <w:spacing w:before="40" w:beforeAutospacing="0" w:after="40" w:afterAutospacing="0" w:line="360" w:lineRule="auto"/>
+              <w:ind w:left="0" w:right="0"/>
+              <w:jc w:val="left"/>
+              <w:rPr>
+                <w:rFonts w:hint="default"/>
+              </w:rPr>
+            </w:pPr>
+            <w:r>
+              <w:rPr>
+                <w:rFonts w:hint="default" w:ascii="Times New Roman" w:hAnsi="Times New Roman" w:eastAsia="Times New Roman" w:cs="Times New Roman"/>
+                <w:kern w:val="0"/>
+                <w:sz w:val="24"/>
+                <w:szCs w:val="24"/>
+                <w:lang w:val="en-US" w:eastAsia="zh-CN" w:bidi="ar"/>
+              </w:rPr>
+              <w:t>Khách hàng nhấn nút “Chi tiết” trên một movie card tại trang danh sách phim (/movies). Trình duyệt gửi HTTP GET request đến URL: /movie-detail?id={movieId}.</w:t>
+            </w:r>
+          </w:p>
+        </w:tc>
+      </w:tr>
+      <w:tr>
+        <w:tblPrEx>
+          <w:tblBorders>
+            <w:top w:val="single" w:color="auto" w:sz="4" w:space="0"/>
+            <w:left w:val="single" w:color="auto" w:sz="4" w:space="0"/>
+            <w:bottom w:val="single" w:color="auto" w:sz="4" w:space="0"/>
+            <w:right w:val="single" w:color="auto" w:sz="4" w:space="0"/>
+            <w:insideH w:val="single" w:color="auto" w:sz="4" w:space="0"/>
+            <w:insideV w:val="single" w:color="auto" w:sz="4" w:space="0"/>
+          </w:tblBorders>
+          <w:tblCellMar>
+            <w:top w:w="0" w:type="dxa"/>
+            <w:left w:w="10" w:type="dxa"/>
+            <w:bottom w:w="0" w:type="dxa"/>
+            <w:right w:w="10" w:type="dxa"/>
+          </w:tblCellMar>
+        </w:tblPrEx>
+        <w:tc>
+          <w:tcPr>
+            <w:tcW w:w="1200" w:type="dxa"/>
+            <w:tcBorders>
+              <w:top w:val="single" w:color="000000" w:sz="6" w:space="0"/>
+              <w:left w:val="single" w:color="000000" w:sz="6" w:space="0"/>
+              <w:bottom w:val="single" w:color="000000" w:sz="6" w:space="0"/>
+              <w:right w:val="single" w:color="000000" w:sz="6" w:space="0"/>
+            </w:tcBorders>
+            <w:shd w:val="clear" w:color="auto" w:fill="auto"/>
+            <w:tcMar>
+              <w:top w:w="80" w:type="dxa"/>
+              <w:left w:w="120" w:type="dxa"/>
+              <w:bottom w:w="80" w:type="dxa"/>
+              <w:right w:w="120" w:type="dxa"/>
+            </w:tcMar>
+            <w:vAlign w:val="center"/>
+          </w:tcPr>
+          <w:p>
+            <w:pPr>
+              <w:keepNext w:val="0"/>
+              <w:keepLines w:val="0"/>
+              <w:widowControl/>
+              <w:suppressLineNumbers w:val="0"/>
+              <w:spacing w:before="40" w:beforeAutospacing="0" w:after="40" w:afterAutospacing="0" w:line="360" w:lineRule="auto"/>
+              <w:ind w:left="0" w:right="0"/>
+              <w:jc w:val="center"/>
+              <w:rPr>
+                <w:rFonts w:hint="default"/>
+              </w:rPr>
+            </w:pPr>
+            <w:r>
+              <w:rPr>
+                <w:rFonts w:hint="default" w:ascii="Times New Roman" w:hAnsi="Times New Roman" w:eastAsia="Times New Roman" w:cs="Times New Roman"/>
+                <w:kern w:val="0"/>
+                <w:sz w:val="24"/>
+                <w:szCs w:val="24"/>
+                <w:lang w:val="en-US" w:eastAsia="zh-CN" w:bidi="ar"/>
+              </w:rPr>
+              <w:t>4.1.1</w:t>
+            </w:r>
+          </w:p>
+        </w:tc>
+        <w:tc>
+          <w:tcPr>
+            <w:tcW w:w="7826" w:type="dxa"/>
+            <w:tcBorders>
+              <w:top w:val="single" w:color="000000" w:sz="6" w:space="0"/>
+              <w:left w:val="single" w:color="000000" w:sz="6" w:space="0"/>
+              <w:bottom w:val="single" w:color="000000" w:sz="6" w:space="0"/>
+              <w:right w:val="single" w:color="000000" w:sz="6" w:space="0"/>
+            </w:tcBorders>
+            <w:shd w:val="clear" w:color="auto" w:fill="auto"/>
+            <w:tcMar>
+              <w:top w:w="80" w:type="dxa"/>
+              <w:left w:w="120" w:type="dxa"/>
+              <w:bottom w:w="80" w:type="dxa"/>
+              <w:right w:w="120" w:type="dxa"/>
+            </w:tcMar>
+            <w:vAlign w:val="center"/>
+          </w:tcPr>
+          <w:p>
+            <w:pPr>
+              <w:keepNext w:val="0"/>
+              <w:keepLines w:val="0"/>
+              <w:widowControl/>
+              <w:suppressLineNumbers w:val="0"/>
+              <w:spacing w:before="40" w:beforeAutospacing="0" w:after="40" w:afterAutospacing="0" w:line="360" w:lineRule="auto"/>
+              <w:ind w:left="0" w:right="0"/>
+              <w:jc w:val="left"/>
+              <w:rPr>
+                <w:rFonts w:hint="default"/>
+              </w:rPr>
+            </w:pPr>
+            <w:r>
+              <w:rPr>
+                <w:rFonts w:hint="default"/>
+              </w:rPr>
+              <w:t>MovieController tiếp nhận request. Controller lấy giá trị tham số id từ request bằng request.getParameter("id"). Nếu id là null hoặc chuỗi rỗng, Controller redirect về /movies?detailMessage=missing_id và kết thúc use case.</w:t>
+            </w:r>
+          </w:p>
+        </w:tc>
+      </w:tr>
+      <w:tr>
+        <w:tblPrEx>
+          <w:tblBorders>
+            <w:top w:val="single" w:color="auto" w:sz="4" w:space="0"/>
+            <w:left w:val="single" w:color="auto" w:sz="4" w:space="0"/>
+            <w:bottom w:val="single" w:color="auto" w:sz="4" w:space="0"/>
+            <w:right w:val="single" w:color="auto" w:sz="4" w:space="0"/>
+            <w:insideH w:val="single" w:color="auto" w:sz="4" w:space="0"/>
+            <w:insideV w:val="single" w:color="auto" w:sz="4" w:space="0"/>
+          </w:tblBorders>
+          <w:tblCellMar>
+            <w:top w:w="0" w:type="dxa"/>
+            <w:left w:w="10" w:type="dxa"/>
+            <w:bottom w:w="0" w:type="dxa"/>
+            <w:right w:w="10" w:type="dxa"/>
+          </w:tblCellMar>
+        </w:tblPrEx>
+        <w:tc>
+          <w:tcPr>
+            <w:tcW w:w="1200" w:type="dxa"/>
+            <w:tcBorders>
+              <w:top w:val="single" w:color="000000" w:sz="6" w:space="0"/>
+              <w:left w:val="single" w:color="000000" w:sz="6" w:space="0"/>
+              <w:bottom w:val="single" w:color="000000" w:sz="6" w:space="0"/>
+              <w:right w:val="single" w:color="000000" w:sz="6" w:space="0"/>
+            </w:tcBorders>
+            <w:shd w:val="clear" w:color="auto" w:fill="auto"/>
+            <w:tcMar>
+              <w:top w:w="80" w:type="dxa"/>
+              <w:left w:w="120" w:type="dxa"/>
+              <w:bottom w:w="80" w:type="dxa"/>
+              <w:right w:w="120" w:type="dxa"/>
+            </w:tcMar>
+            <w:vAlign w:val="center"/>
+          </w:tcPr>
+          <w:p>
+            <w:pPr>
+              <w:keepNext w:val="0"/>
+              <w:keepLines w:val="0"/>
+              <w:widowControl/>
+              <w:suppressLineNumbers w:val="0"/>
+              <w:spacing w:before="40" w:beforeAutospacing="0" w:after="40" w:afterAutospacing="0" w:line="360" w:lineRule="auto"/>
+              <w:ind w:left="0" w:right="0"/>
+              <w:jc w:val="center"/>
+              <w:rPr>
+                <w:rFonts w:hint="default"/>
+              </w:rPr>
+            </w:pPr>
+            <w:r>
+              <w:rPr>
+                <w:rFonts w:hint="default" w:ascii="Times New Roman" w:hAnsi="Times New Roman" w:eastAsia="Times New Roman" w:cs="Times New Roman"/>
+                <w:kern w:val="0"/>
+                <w:sz w:val="24"/>
+                <w:szCs w:val="24"/>
+                <w:lang w:val="en-US" w:eastAsia="zh-CN" w:bidi="ar"/>
+              </w:rPr>
+              <w:t>4.1.2</w:t>
+            </w:r>
+          </w:p>
+        </w:tc>
+        <w:tc>
+          <w:tcPr>
+            <w:tcW w:w="7826" w:type="dxa"/>
+            <w:tcBorders>
+              <w:top w:val="single" w:color="000000" w:sz="6" w:space="0"/>
+              <w:left w:val="single" w:color="000000" w:sz="6" w:space="0"/>
+              <w:bottom w:val="single" w:color="000000" w:sz="6" w:space="0"/>
+              <w:right w:val="single" w:color="000000" w:sz="6" w:space="0"/>
+            </w:tcBorders>
+            <w:shd w:val="clear" w:color="auto" w:fill="auto"/>
+            <w:tcMar>
+              <w:top w:w="80" w:type="dxa"/>
+              <w:left w:w="120" w:type="dxa"/>
+              <w:bottom w:w="80" w:type="dxa"/>
+              <w:right w:w="120" w:type="dxa"/>
+            </w:tcMar>
+            <w:vAlign w:val="center"/>
+          </w:tcPr>
+          <w:p>
+            <w:pPr>
+              <w:keepNext w:val="0"/>
+              <w:keepLines w:val="0"/>
+              <w:widowControl/>
+              <w:suppressLineNumbers w:val="0"/>
+              <w:spacing w:before="40" w:beforeAutospacing="0" w:after="40" w:afterAutospacing="0" w:line="360" w:lineRule="auto"/>
+              <w:ind w:left="0" w:right="0"/>
+              <w:jc w:val="left"/>
+              <w:rPr>
+                <w:rFonts w:hint="default"/>
+              </w:rPr>
+            </w:pPr>
+            <w:r>
+              <w:rPr>
+                <w:rFonts w:hint="default"/>
+              </w:rPr>
+              <w:t>Controller chuyển đổi id sang kiểu số nguyên bằng Integer.parseInt(idRaw). Nếu id không phải số hợp lệ, hệ thống phát sinh NumberFormatException. Controller bắt lỗi và redirect về /movies?detailMessage=invalid_id.</w:t>
             </w:r>
           </w:p>
         </w:tc>
@@ -13709,7 +14550,7 @@
                 <w:szCs w:val="24"/>
                 <w:lang w:val="en-US" w:eastAsia="zh-CN" w:bidi="ar"/>
               </w:rPr>
-              <w:t>4.1.0</w:t>
+              <w:t>4.1.3</w:t>
             </w:r>
           </w:p>
         </w:tc>
@@ -13752,7 +14593,7 @@
                 <w:szCs w:val="24"/>
                 <w:lang w:val="en-US" w:eastAsia="zh-CN" w:bidi="ar"/>
               </w:rPr>
-              <w:t>Khách hàng nhấn nút “Chi tiết” trên một movie card tại trang danh sách phim (/movies). Trình duyệt gửi HTTP GET request đến URL: /movie-detail?id={movieId}.</w:t>
+              <w:t>MovieController gọi phương thức getMovieDetail(id) của MovieService.</w:t>
             </w:r>
           </w:p>
         </w:tc>
@@ -13814,7 +14655,7 @@
                 <w:szCs w:val="24"/>
                 <w:lang w:val="en-US" w:eastAsia="zh-CN" w:bidi="ar"/>
               </w:rPr>
-              <w:t>4.1.1</w:t>
+              <w:t>4.1.4</w:t>
             </w:r>
           </w:p>
         </w:tc>
@@ -13851,9 +14692,13 @@
             </w:pPr>
             <w:r>
               <w:rPr>
-                <w:rFonts w:hint="default"/>
-              </w:rPr>
-              <w:t>MovieController tiếp nhận request. Controller lấy giá trị tham số id từ request bằng request.getParameter("id"). Nếu id là null hoặc chuỗi rỗng, Controller redirect về /movies?detailMessage=missing_id và kết thúc use case.</w:t>
+                <w:rFonts w:hint="default" w:ascii="Times New Roman" w:hAnsi="Times New Roman" w:eastAsia="Times New Roman" w:cs="Times New Roman"/>
+                <w:kern w:val="0"/>
+                <w:sz w:val="24"/>
+                <w:szCs w:val="24"/>
+                <w:lang w:val="en-US" w:eastAsia="zh-CN" w:bidi="ar"/>
+              </w:rPr>
+              <w:t>MovieService gọi phương thức findById(id) của MovieDAO để truy vấn thông tin phim từ cơ sở dữ liệu.</w:t>
             </w:r>
           </w:p>
         </w:tc>
@@ -13915,7 +14760,7 @@
                 <w:szCs w:val="24"/>
                 <w:lang w:val="en-US" w:eastAsia="zh-CN" w:bidi="ar"/>
               </w:rPr>
-              <w:t>4.1.2</w:t>
+              <w:t>4.1.5</w:t>
             </w:r>
           </w:p>
         </w:tc>
@@ -13952,9 +14797,117 @@
             </w:pPr>
             <w:r>
               <w:rPr>
-                <w:rFonts w:hint="default"/>
-              </w:rPr>
-              <w:t>Controller chuyển đổi id sang kiểu số nguyên bằng Integer.parseInt(idRaw). Nếu id không phải số hợp lệ, hệ thống phát sinh NumberFormatException. Controller bắt lỗi và redirect về /movies?detailMessage=invalid_id.</w:t>
+                <w:rFonts w:hint="default" w:ascii="Times New Roman" w:hAnsi="Times New Roman" w:eastAsia="Times New Roman" w:cs="Times New Roman"/>
+                <w:kern w:val="0"/>
+                <w:sz w:val="24"/>
+                <w:szCs w:val="24"/>
+                <w:lang w:val="en-US" w:eastAsia="zh-CN" w:bidi="ar"/>
+              </w:rPr>
+              <w:t>MovieDAO thực hiện câu truy vấn SQL lấy thông tin chi tiết phim từ bảng movies, kết hợp với movie_genres và genres để lấy danh sách thể loại. Câu truy vấn chỉ lấy phim có id tương ứng và có trạng thái NOW_SHOWING nhằm tránh trường hợp người dùng truy cập trực tiếp vào chi tiết phim không còn được hiển thị. Kết quả được ánh xạ thành đối tượng Movie thông qua JDBI BeanMapper.</w:t>
+            </w:r>
+          </w:p>
+        </w:tc>
+      </w:tr>
+      <w:tr>
+        <w:tblPrEx>
+          <w:tblBorders>
+            <w:top w:val="single" w:color="auto" w:sz="4" w:space="0"/>
+            <w:left w:val="single" w:color="auto" w:sz="4" w:space="0"/>
+            <w:bottom w:val="single" w:color="auto" w:sz="4" w:space="0"/>
+            <w:right w:val="single" w:color="auto" w:sz="4" w:space="0"/>
+            <w:insideH w:val="single" w:color="auto" w:sz="4" w:space="0"/>
+            <w:insideV w:val="single" w:color="auto" w:sz="4" w:space="0"/>
+          </w:tblBorders>
+          <w:tblCellMar>
+            <w:top w:w="0" w:type="dxa"/>
+            <w:left w:w="10" w:type="dxa"/>
+            <w:bottom w:w="0" w:type="dxa"/>
+            <w:right w:w="10" w:type="dxa"/>
+          </w:tblCellMar>
+        </w:tblPrEx>
+        <w:tc>
+          <w:tcPr>
+            <w:tcW w:w="1200" w:type="dxa"/>
+            <w:tcBorders>
+              <w:top w:val="single" w:color="000000" w:sz="6" w:space="0"/>
+              <w:left w:val="single" w:color="000000" w:sz="6" w:space="0"/>
+              <w:bottom w:val="single" w:color="000000" w:sz="6" w:space="0"/>
+              <w:right w:val="single" w:color="000000" w:sz="6" w:space="0"/>
+            </w:tcBorders>
+            <w:shd w:val="clear" w:color="auto" w:fill="auto"/>
+            <w:tcMar>
+              <w:top w:w="80" w:type="dxa"/>
+              <w:left w:w="120" w:type="dxa"/>
+              <w:bottom w:w="80" w:type="dxa"/>
+              <w:right w:w="120" w:type="dxa"/>
+            </w:tcMar>
+            <w:vAlign w:val="center"/>
+          </w:tcPr>
+          <w:p>
+            <w:pPr>
+              <w:keepNext w:val="0"/>
+              <w:keepLines w:val="0"/>
+              <w:widowControl/>
+              <w:suppressLineNumbers w:val="0"/>
+              <w:spacing w:before="40" w:beforeAutospacing="0" w:after="40" w:afterAutospacing="0" w:line="360" w:lineRule="auto"/>
+              <w:ind w:left="0" w:right="0"/>
+              <w:jc w:val="center"/>
+              <w:rPr>
+                <w:rFonts w:hint="default"/>
+              </w:rPr>
+            </w:pPr>
+            <w:r>
+              <w:rPr>
+                <w:rFonts w:hint="default" w:ascii="Times New Roman" w:hAnsi="Times New Roman" w:eastAsia="Times New Roman" w:cs="Times New Roman"/>
+                <w:kern w:val="0"/>
+                <w:sz w:val="24"/>
+                <w:szCs w:val="24"/>
+                <w:lang w:val="en-US" w:eastAsia="zh-CN" w:bidi="ar"/>
+              </w:rPr>
+              <w:t>4.1.6</w:t>
+            </w:r>
+          </w:p>
+        </w:tc>
+        <w:tc>
+          <w:tcPr>
+            <w:tcW w:w="7826" w:type="dxa"/>
+            <w:tcBorders>
+              <w:top w:val="single" w:color="000000" w:sz="6" w:space="0"/>
+              <w:left w:val="single" w:color="000000" w:sz="6" w:space="0"/>
+              <w:bottom w:val="single" w:color="000000" w:sz="6" w:space="0"/>
+              <w:right w:val="single" w:color="000000" w:sz="6" w:space="0"/>
+            </w:tcBorders>
+            <w:shd w:val="clear" w:color="auto" w:fill="auto"/>
+            <w:tcMar>
+              <w:top w:w="80" w:type="dxa"/>
+              <w:left w:w="120" w:type="dxa"/>
+              <w:bottom w:w="80" w:type="dxa"/>
+              <w:right w:w="120" w:type="dxa"/>
+            </w:tcMar>
+            <w:vAlign w:val="center"/>
+          </w:tcPr>
+          <w:p>
+            <w:pPr>
+              <w:keepNext w:val="0"/>
+              <w:keepLines w:val="0"/>
+              <w:widowControl/>
+              <w:suppressLineNumbers w:val="0"/>
+              <w:spacing w:before="40" w:beforeAutospacing="0" w:after="40" w:afterAutospacing="0" w:line="360" w:lineRule="auto"/>
+              <w:ind w:left="0" w:right="0"/>
+              <w:jc w:val="left"/>
+              <w:rPr>
+                <w:rFonts w:hint="default"/>
+              </w:rPr>
+            </w:pPr>
+            <w:r>
+              <w:rPr>
+                <w:rFonts w:hint="default" w:ascii="Times New Roman" w:hAnsi="Times New Roman" w:eastAsia="Times New Roman" w:cs="Times New Roman"/>
+                <w:kern w:val="0"/>
+                <w:sz w:val="24"/>
+                <w:szCs w:val="24"/>
+                <w:lang w:val="en-US" w:eastAsia="zh-CN" w:bidi="ar"/>
+              </w:rPr>
+              <w:t>MovieDAO trả về đối tượng Movie cho MovieService. Thông tin phim bao gồm: id, title, durationMinutes, ageRating, shortDescription, description, posterUrl, trailerUrl, releaseDate, status, genreNames.</w:t>
             </w:r>
           </w:p>
         </w:tc>
@@ -14016,7 +14969,7 @@
                 <w:szCs w:val="24"/>
                 <w:lang w:val="en-US" w:eastAsia="zh-CN" w:bidi="ar"/>
               </w:rPr>
-              <w:t>4.1.3</w:t>
+              <w:t>4.1.7</w:t>
             </w:r>
           </w:p>
         </w:tc>
@@ -14059,7 +15012,7 @@
                 <w:szCs w:val="24"/>
                 <w:lang w:val="en-US" w:eastAsia="zh-CN" w:bidi="ar"/>
               </w:rPr>
-              <w:t>MovieController gọi phương thức getMovieDetail(id) của MovieService.</w:t>
+              <w:t>MovieService trả về đối tượng Movie cho MovieController. Nếu đối tượng Movie là null, tức là phim không tồn tại trong database hoặc không thuộc trạng thái được hiển thị, Controller redirect về /movies?detailMessage=movie_not_available và kết thúc use case.</w:t>
             </w:r>
           </w:p>
         </w:tc>
@@ -14121,7 +15074,7 @@
                 <w:szCs w:val="24"/>
                 <w:lang w:val="en-US" w:eastAsia="zh-CN" w:bidi="ar"/>
               </w:rPr>
-              <w:t>4.1.4</w:t>
+              <w:t>4.1.8</w:t>
             </w:r>
           </w:p>
         </w:tc>
@@ -14164,7 +15117,7 @@
                 <w:szCs w:val="24"/>
                 <w:lang w:val="en-US" w:eastAsia="zh-CN" w:bidi="ar"/>
               </w:rPr>
-              <w:t>MovieService gọi phương thức findById(id) của MovieDAO để truy vấn thông tin phim từ cơ sở dữ liệu.</w:t>
+              <w:t>MovieController đặt đối tượng Movie vào request attribute với tên "movie" (request.setAttribute("movie", movie)) và forward request sang movie-detail.jsp.</w:t>
             </w:r>
           </w:p>
         </w:tc>
@@ -14179,427 +15132,6 @@
             <w:insideH w:val="single" w:color="auto" w:sz="4" w:space="0"/>
             <w:insideV w:val="single" w:color="auto" w:sz="4" w:space="0"/>
           </w:tblBorders>
-          <w:shd w:val="clear" w:color="auto" w:fill="auto"/>
-          <w:tblCellMar>
-            <w:top w:w="0" w:type="dxa"/>
-            <w:left w:w="10" w:type="dxa"/>
-            <w:bottom w:w="0" w:type="dxa"/>
-            <w:right w:w="10" w:type="dxa"/>
-          </w:tblCellMar>
-        </w:tblPrEx>
-        <w:tc>
-          <w:tcPr>
-            <w:tcW w:w="1200" w:type="dxa"/>
-            <w:tcBorders>
-              <w:top w:val="single" w:color="000000" w:sz="6" w:space="0"/>
-              <w:left w:val="single" w:color="000000" w:sz="6" w:space="0"/>
-              <w:bottom w:val="single" w:color="000000" w:sz="6" w:space="0"/>
-              <w:right w:val="single" w:color="000000" w:sz="6" w:space="0"/>
-            </w:tcBorders>
-            <w:shd w:val="clear" w:color="auto" w:fill="auto"/>
-            <w:tcMar>
-              <w:top w:w="80" w:type="dxa"/>
-              <w:left w:w="120" w:type="dxa"/>
-              <w:bottom w:w="80" w:type="dxa"/>
-              <w:right w:w="120" w:type="dxa"/>
-            </w:tcMar>
-            <w:vAlign w:val="center"/>
-          </w:tcPr>
-          <w:p>
-            <w:pPr>
-              <w:keepNext w:val="0"/>
-              <w:keepLines w:val="0"/>
-              <w:widowControl/>
-              <w:suppressLineNumbers w:val="0"/>
-              <w:spacing w:before="40" w:beforeAutospacing="0" w:after="40" w:afterAutospacing="0" w:line="360" w:lineRule="auto"/>
-              <w:ind w:left="0" w:right="0"/>
-              <w:jc w:val="center"/>
-              <w:rPr>
-                <w:rFonts w:hint="default"/>
-              </w:rPr>
-            </w:pPr>
-            <w:r>
-              <w:rPr>
-                <w:rFonts w:hint="default" w:ascii="Times New Roman" w:hAnsi="Times New Roman" w:eastAsia="Times New Roman" w:cs="Times New Roman"/>
-                <w:kern w:val="0"/>
-                <w:sz w:val="24"/>
-                <w:szCs w:val="24"/>
-                <w:lang w:val="en-US" w:eastAsia="zh-CN" w:bidi="ar"/>
-              </w:rPr>
-              <w:t>4.1.5</w:t>
-            </w:r>
-          </w:p>
-        </w:tc>
-        <w:tc>
-          <w:tcPr>
-            <w:tcW w:w="7826" w:type="dxa"/>
-            <w:tcBorders>
-              <w:top w:val="single" w:color="000000" w:sz="6" w:space="0"/>
-              <w:left w:val="single" w:color="000000" w:sz="6" w:space="0"/>
-              <w:bottom w:val="single" w:color="000000" w:sz="6" w:space="0"/>
-              <w:right w:val="single" w:color="000000" w:sz="6" w:space="0"/>
-            </w:tcBorders>
-            <w:shd w:val="clear" w:color="auto" w:fill="auto"/>
-            <w:tcMar>
-              <w:top w:w="80" w:type="dxa"/>
-              <w:left w:w="120" w:type="dxa"/>
-              <w:bottom w:w="80" w:type="dxa"/>
-              <w:right w:w="120" w:type="dxa"/>
-            </w:tcMar>
-            <w:vAlign w:val="center"/>
-          </w:tcPr>
-          <w:p>
-            <w:pPr>
-              <w:keepNext w:val="0"/>
-              <w:keepLines w:val="0"/>
-              <w:widowControl/>
-              <w:suppressLineNumbers w:val="0"/>
-              <w:spacing w:before="40" w:beforeAutospacing="0" w:after="40" w:afterAutospacing="0" w:line="360" w:lineRule="auto"/>
-              <w:ind w:left="0" w:right="0"/>
-              <w:jc w:val="left"/>
-              <w:rPr>
-                <w:rFonts w:hint="default"/>
-              </w:rPr>
-            </w:pPr>
-            <w:r>
-              <w:rPr>
-                <w:rFonts w:hint="default" w:ascii="Times New Roman" w:hAnsi="Times New Roman" w:eastAsia="Times New Roman" w:cs="Times New Roman"/>
-                <w:kern w:val="0"/>
-                <w:sz w:val="24"/>
-                <w:szCs w:val="24"/>
-                <w:lang w:val="en-US" w:eastAsia="zh-CN" w:bidi="ar"/>
-              </w:rPr>
-              <w:t>MovieDAO thực hiện câu truy vấn SQL lấy thông tin chi tiết phim từ bảng movies, kết hợp với movie_genres và genres để lấy danh sách thể loại. Câu truy vấn chỉ lấy phim có id tương ứng và có trạng thái NOW_SHOWING nhằm tránh trường hợp người dùng truy cập trực tiếp vào chi tiết phim không còn được hiển thị. Kết quả được ánh xạ thành đối tượng Movie thông qua JDBI BeanMapper.</w:t>
-            </w:r>
-          </w:p>
-        </w:tc>
-      </w:tr>
-      <w:tr>
-        <w:tblPrEx>
-          <w:tblBorders>
-            <w:top w:val="single" w:color="auto" w:sz="4" w:space="0"/>
-            <w:left w:val="single" w:color="auto" w:sz="4" w:space="0"/>
-            <w:bottom w:val="single" w:color="auto" w:sz="4" w:space="0"/>
-            <w:right w:val="single" w:color="auto" w:sz="4" w:space="0"/>
-            <w:insideH w:val="single" w:color="auto" w:sz="4" w:space="0"/>
-            <w:insideV w:val="single" w:color="auto" w:sz="4" w:space="0"/>
-          </w:tblBorders>
-          <w:shd w:val="clear" w:color="auto" w:fill="auto"/>
-          <w:tblCellMar>
-            <w:top w:w="0" w:type="dxa"/>
-            <w:left w:w="10" w:type="dxa"/>
-            <w:bottom w:w="0" w:type="dxa"/>
-            <w:right w:w="10" w:type="dxa"/>
-          </w:tblCellMar>
-        </w:tblPrEx>
-        <w:tc>
-          <w:tcPr>
-            <w:tcW w:w="1200" w:type="dxa"/>
-            <w:tcBorders>
-              <w:top w:val="single" w:color="000000" w:sz="6" w:space="0"/>
-              <w:left w:val="single" w:color="000000" w:sz="6" w:space="0"/>
-              <w:bottom w:val="single" w:color="000000" w:sz="6" w:space="0"/>
-              <w:right w:val="single" w:color="000000" w:sz="6" w:space="0"/>
-            </w:tcBorders>
-            <w:shd w:val="clear" w:color="auto" w:fill="auto"/>
-            <w:tcMar>
-              <w:top w:w="80" w:type="dxa"/>
-              <w:left w:w="120" w:type="dxa"/>
-              <w:bottom w:w="80" w:type="dxa"/>
-              <w:right w:w="120" w:type="dxa"/>
-            </w:tcMar>
-            <w:vAlign w:val="center"/>
-          </w:tcPr>
-          <w:p>
-            <w:pPr>
-              <w:keepNext w:val="0"/>
-              <w:keepLines w:val="0"/>
-              <w:widowControl/>
-              <w:suppressLineNumbers w:val="0"/>
-              <w:spacing w:before="40" w:beforeAutospacing="0" w:after="40" w:afterAutospacing="0" w:line="360" w:lineRule="auto"/>
-              <w:ind w:left="0" w:right="0"/>
-              <w:jc w:val="center"/>
-              <w:rPr>
-                <w:rFonts w:hint="default"/>
-              </w:rPr>
-            </w:pPr>
-            <w:r>
-              <w:rPr>
-                <w:rFonts w:hint="default" w:ascii="Times New Roman" w:hAnsi="Times New Roman" w:eastAsia="Times New Roman" w:cs="Times New Roman"/>
-                <w:kern w:val="0"/>
-                <w:sz w:val="24"/>
-                <w:szCs w:val="24"/>
-                <w:lang w:val="en-US" w:eastAsia="zh-CN" w:bidi="ar"/>
-              </w:rPr>
-              <w:t>4.1.6</w:t>
-            </w:r>
-          </w:p>
-        </w:tc>
-        <w:tc>
-          <w:tcPr>
-            <w:tcW w:w="7826" w:type="dxa"/>
-            <w:tcBorders>
-              <w:top w:val="single" w:color="000000" w:sz="6" w:space="0"/>
-              <w:left w:val="single" w:color="000000" w:sz="6" w:space="0"/>
-              <w:bottom w:val="single" w:color="000000" w:sz="6" w:space="0"/>
-              <w:right w:val="single" w:color="000000" w:sz="6" w:space="0"/>
-            </w:tcBorders>
-            <w:shd w:val="clear" w:color="auto" w:fill="auto"/>
-            <w:tcMar>
-              <w:top w:w="80" w:type="dxa"/>
-              <w:left w:w="120" w:type="dxa"/>
-              <w:bottom w:w="80" w:type="dxa"/>
-              <w:right w:w="120" w:type="dxa"/>
-            </w:tcMar>
-            <w:vAlign w:val="center"/>
-          </w:tcPr>
-          <w:p>
-            <w:pPr>
-              <w:keepNext w:val="0"/>
-              <w:keepLines w:val="0"/>
-              <w:widowControl/>
-              <w:suppressLineNumbers w:val="0"/>
-              <w:spacing w:before="40" w:beforeAutospacing="0" w:after="40" w:afterAutospacing="0" w:line="360" w:lineRule="auto"/>
-              <w:ind w:left="0" w:right="0"/>
-              <w:jc w:val="left"/>
-              <w:rPr>
-                <w:rFonts w:hint="default"/>
-              </w:rPr>
-            </w:pPr>
-            <w:r>
-              <w:rPr>
-                <w:rFonts w:hint="default" w:ascii="Times New Roman" w:hAnsi="Times New Roman" w:eastAsia="Times New Roman" w:cs="Times New Roman"/>
-                <w:kern w:val="0"/>
-                <w:sz w:val="24"/>
-                <w:szCs w:val="24"/>
-                <w:lang w:val="en-US" w:eastAsia="zh-CN" w:bidi="ar"/>
-              </w:rPr>
-              <w:t>MovieDAO trả về đối tượng Movie cho MovieService. Thông tin phim bao gồm: id, title, durationMinutes, ageRating, shortDescription, description, posterUrl, trailerUrl, releaseDate, status, genreNames.</w:t>
-            </w:r>
-          </w:p>
-        </w:tc>
-      </w:tr>
-      <w:tr>
-        <w:tblPrEx>
-          <w:tblBorders>
-            <w:top w:val="single" w:color="auto" w:sz="4" w:space="0"/>
-            <w:left w:val="single" w:color="auto" w:sz="4" w:space="0"/>
-            <w:bottom w:val="single" w:color="auto" w:sz="4" w:space="0"/>
-            <w:right w:val="single" w:color="auto" w:sz="4" w:space="0"/>
-            <w:insideH w:val="single" w:color="auto" w:sz="4" w:space="0"/>
-            <w:insideV w:val="single" w:color="auto" w:sz="4" w:space="0"/>
-          </w:tblBorders>
-          <w:shd w:val="clear" w:color="auto" w:fill="auto"/>
-          <w:tblCellMar>
-            <w:top w:w="0" w:type="dxa"/>
-            <w:left w:w="10" w:type="dxa"/>
-            <w:bottom w:w="0" w:type="dxa"/>
-            <w:right w:w="10" w:type="dxa"/>
-          </w:tblCellMar>
-        </w:tblPrEx>
-        <w:tc>
-          <w:tcPr>
-            <w:tcW w:w="1200" w:type="dxa"/>
-            <w:tcBorders>
-              <w:top w:val="single" w:color="000000" w:sz="6" w:space="0"/>
-              <w:left w:val="single" w:color="000000" w:sz="6" w:space="0"/>
-              <w:bottom w:val="single" w:color="000000" w:sz="6" w:space="0"/>
-              <w:right w:val="single" w:color="000000" w:sz="6" w:space="0"/>
-            </w:tcBorders>
-            <w:shd w:val="clear" w:color="auto" w:fill="auto"/>
-            <w:tcMar>
-              <w:top w:w="80" w:type="dxa"/>
-              <w:left w:w="120" w:type="dxa"/>
-              <w:bottom w:w="80" w:type="dxa"/>
-              <w:right w:w="120" w:type="dxa"/>
-            </w:tcMar>
-            <w:vAlign w:val="center"/>
-          </w:tcPr>
-          <w:p>
-            <w:pPr>
-              <w:keepNext w:val="0"/>
-              <w:keepLines w:val="0"/>
-              <w:widowControl/>
-              <w:suppressLineNumbers w:val="0"/>
-              <w:spacing w:before="40" w:beforeAutospacing="0" w:after="40" w:afterAutospacing="0" w:line="360" w:lineRule="auto"/>
-              <w:ind w:left="0" w:right="0"/>
-              <w:jc w:val="center"/>
-              <w:rPr>
-                <w:rFonts w:hint="default"/>
-              </w:rPr>
-            </w:pPr>
-            <w:r>
-              <w:rPr>
-                <w:rFonts w:hint="default" w:ascii="Times New Roman" w:hAnsi="Times New Roman" w:eastAsia="Times New Roman" w:cs="Times New Roman"/>
-                <w:kern w:val="0"/>
-                <w:sz w:val="24"/>
-                <w:szCs w:val="24"/>
-                <w:lang w:val="en-US" w:eastAsia="zh-CN" w:bidi="ar"/>
-              </w:rPr>
-              <w:t>4.1.7</w:t>
-            </w:r>
-          </w:p>
-        </w:tc>
-        <w:tc>
-          <w:tcPr>
-            <w:tcW w:w="7826" w:type="dxa"/>
-            <w:tcBorders>
-              <w:top w:val="single" w:color="000000" w:sz="6" w:space="0"/>
-              <w:left w:val="single" w:color="000000" w:sz="6" w:space="0"/>
-              <w:bottom w:val="single" w:color="000000" w:sz="6" w:space="0"/>
-              <w:right w:val="single" w:color="000000" w:sz="6" w:space="0"/>
-            </w:tcBorders>
-            <w:shd w:val="clear" w:color="auto" w:fill="auto"/>
-            <w:tcMar>
-              <w:top w:w="80" w:type="dxa"/>
-              <w:left w:w="120" w:type="dxa"/>
-              <w:bottom w:w="80" w:type="dxa"/>
-              <w:right w:w="120" w:type="dxa"/>
-            </w:tcMar>
-            <w:vAlign w:val="center"/>
-          </w:tcPr>
-          <w:p>
-            <w:pPr>
-              <w:keepNext w:val="0"/>
-              <w:keepLines w:val="0"/>
-              <w:widowControl/>
-              <w:suppressLineNumbers w:val="0"/>
-              <w:spacing w:before="40" w:beforeAutospacing="0" w:after="40" w:afterAutospacing="0" w:line="360" w:lineRule="auto"/>
-              <w:ind w:left="0" w:right="0"/>
-              <w:jc w:val="left"/>
-              <w:rPr>
-                <w:rFonts w:hint="default"/>
-              </w:rPr>
-            </w:pPr>
-            <w:r>
-              <w:rPr>
-                <w:rFonts w:hint="default" w:ascii="Times New Roman" w:hAnsi="Times New Roman" w:eastAsia="Times New Roman" w:cs="Times New Roman"/>
-                <w:kern w:val="0"/>
-                <w:sz w:val="24"/>
-                <w:szCs w:val="24"/>
-                <w:lang w:val="en-US" w:eastAsia="zh-CN" w:bidi="ar"/>
-              </w:rPr>
-              <w:t>MovieService trả về đối tượng Movie cho MovieController. Nếu đối tượng Movie là null, tức là phim không tồn tại trong database hoặc không thuộc trạng thái được hiển thị, Controller redirect về /movies?detailMessage=movie_not_available và kết thúc use case.</w:t>
-            </w:r>
-          </w:p>
-        </w:tc>
-      </w:tr>
-      <w:tr>
-        <w:tblPrEx>
-          <w:tblBorders>
-            <w:top w:val="single" w:color="auto" w:sz="4" w:space="0"/>
-            <w:left w:val="single" w:color="auto" w:sz="4" w:space="0"/>
-            <w:bottom w:val="single" w:color="auto" w:sz="4" w:space="0"/>
-            <w:right w:val="single" w:color="auto" w:sz="4" w:space="0"/>
-            <w:insideH w:val="single" w:color="auto" w:sz="4" w:space="0"/>
-            <w:insideV w:val="single" w:color="auto" w:sz="4" w:space="0"/>
-          </w:tblBorders>
-          <w:shd w:val="clear" w:color="auto" w:fill="auto"/>
-          <w:tblCellMar>
-            <w:top w:w="0" w:type="dxa"/>
-            <w:left w:w="10" w:type="dxa"/>
-            <w:bottom w:w="0" w:type="dxa"/>
-            <w:right w:w="10" w:type="dxa"/>
-          </w:tblCellMar>
-        </w:tblPrEx>
-        <w:tc>
-          <w:tcPr>
-            <w:tcW w:w="1200" w:type="dxa"/>
-            <w:tcBorders>
-              <w:top w:val="single" w:color="000000" w:sz="6" w:space="0"/>
-              <w:left w:val="single" w:color="000000" w:sz="6" w:space="0"/>
-              <w:bottom w:val="single" w:color="000000" w:sz="6" w:space="0"/>
-              <w:right w:val="single" w:color="000000" w:sz="6" w:space="0"/>
-            </w:tcBorders>
-            <w:shd w:val="clear" w:color="auto" w:fill="auto"/>
-            <w:tcMar>
-              <w:top w:w="80" w:type="dxa"/>
-              <w:left w:w="120" w:type="dxa"/>
-              <w:bottom w:w="80" w:type="dxa"/>
-              <w:right w:w="120" w:type="dxa"/>
-            </w:tcMar>
-            <w:vAlign w:val="center"/>
-          </w:tcPr>
-          <w:p>
-            <w:pPr>
-              <w:keepNext w:val="0"/>
-              <w:keepLines w:val="0"/>
-              <w:widowControl/>
-              <w:suppressLineNumbers w:val="0"/>
-              <w:spacing w:before="40" w:beforeAutospacing="0" w:after="40" w:afterAutospacing="0" w:line="360" w:lineRule="auto"/>
-              <w:ind w:left="0" w:right="0"/>
-              <w:jc w:val="center"/>
-              <w:rPr>
-                <w:rFonts w:hint="default"/>
-              </w:rPr>
-            </w:pPr>
-            <w:r>
-              <w:rPr>
-                <w:rFonts w:hint="default" w:ascii="Times New Roman" w:hAnsi="Times New Roman" w:eastAsia="Times New Roman" w:cs="Times New Roman"/>
-                <w:kern w:val="0"/>
-                <w:sz w:val="24"/>
-                <w:szCs w:val="24"/>
-                <w:lang w:val="en-US" w:eastAsia="zh-CN" w:bidi="ar"/>
-              </w:rPr>
-              <w:t>4.1.8</w:t>
-            </w:r>
-          </w:p>
-        </w:tc>
-        <w:tc>
-          <w:tcPr>
-            <w:tcW w:w="7826" w:type="dxa"/>
-            <w:tcBorders>
-              <w:top w:val="single" w:color="000000" w:sz="6" w:space="0"/>
-              <w:left w:val="single" w:color="000000" w:sz="6" w:space="0"/>
-              <w:bottom w:val="single" w:color="000000" w:sz="6" w:space="0"/>
-              <w:right w:val="single" w:color="000000" w:sz="6" w:space="0"/>
-            </w:tcBorders>
-            <w:shd w:val="clear" w:color="auto" w:fill="auto"/>
-            <w:tcMar>
-              <w:top w:w="80" w:type="dxa"/>
-              <w:left w:w="120" w:type="dxa"/>
-              <w:bottom w:w="80" w:type="dxa"/>
-              <w:right w:w="120" w:type="dxa"/>
-            </w:tcMar>
-            <w:vAlign w:val="center"/>
-          </w:tcPr>
-          <w:p>
-            <w:pPr>
-              <w:keepNext w:val="0"/>
-              <w:keepLines w:val="0"/>
-              <w:widowControl/>
-              <w:suppressLineNumbers w:val="0"/>
-              <w:spacing w:before="40" w:beforeAutospacing="0" w:after="40" w:afterAutospacing="0" w:line="360" w:lineRule="auto"/>
-              <w:ind w:left="0" w:right="0"/>
-              <w:jc w:val="left"/>
-              <w:rPr>
-                <w:rFonts w:hint="default"/>
-              </w:rPr>
-            </w:pPr>
-            <w:r>
-              <w:rPr>
-                <w:rFonts w:hint="default" w:ascii="Times New Roman" w:hAnsi="Times New Roman" w:eastAsia="Times New Roman" w:cs="Times New Roman"/>
-                <w:kern w:val="0"/>
-                <w:sz w:val="24"/>
-                <w:szCs w:val="24"/>
-                <w:lang w:val="en-US" w:eastAsia="zh-CN" w:bidi="ar"/>
-              </w:rPr>
-              <w:t>MovieController đặt đối tượng Movie vào request attribute với tên "movie" (request.setAttribute("movie", movie)) và forward request sang movie-detail.jsp.</w:t>
-            </w:r>
-          </w:p>
-        </w:tc>
-      </w:tr>
-      <w:tr>
-        <w:tblPrEx>
-          <w:tblBorders>
-            <w:top w:val="single" w:color="auto" w:sz="4" w:space="0"/>
-            <w:left w:val="single" w:color="auto" w:sz="4" w:space="0"/>
-            <w:bottom w:val="single" w:color="auto" w:sz="4" w:space="0"/>
-            <w:right w:val="single" w:color="auto" w:sz="4" w:space="0"/>
-            <w:insideH w:val="single" w:color="auto" w:sz="4" w:space="0"/>
-            <w:insideV w:val="single" w:color="auto" w:sz="4" w:space="0"/>
-          </w:tblBorders>
-          <w:shd w:val="clear" w:color="auto" w:fill="auto"/>
           <w:tblCellMar>
             <w:top w:w="0" w:type="dxa"/>
             <w:left w:w="10" w:type="dxa"/>
@@ -16747,11 +17279,11 @@
         </w:tblCellMar>
       </w:tblPr>
       <w:tblGrid>
-        <w:gridCol w:w="599"/>
-        <w:gridCol w:w="1712"/>
-        <w:gridCol w:w="1061"/>
-        <w:gridCol w:w="2174"/>
-        <w:gridCol w:w="3737"/>
+        <w:gridCol w:w="585"/>
+        <w:gridCol w:w="1578"/>
+        <w:gridCol w:w="1006"/>
+        <w:gridCol w:w="2376"/>
+        <w:gridCol w:w="3738"/>
       </w:tblGrid>
       <w:tr>
         <w:tblPrEx>
@@ -17023,8 +17555,8 @@
           <w:lang w:val="en-US"/>
         </w:rPr>
       </w:pPr>
-      <w:bookmarkStart w:id="72" w:name="_Toc25459"/>
-      <w:bookmarkStart w:id="73" w:name="_Toc30079"/>
+      <w:bookmarkStart w:id="72" w:name="_Toc30079"/>
+      <w:bookmarkStart w:id="73" w:name="_Toc25459"/>
       <w:bookmarkStart w:id="74" w:name="_Toc231414251"/>
       <w:r>
         <w:rPr>
@@ -17091,9 +17623,9 @@
       <w:r>
         <w:drawing>
           <wp:inline distT="0" distB="0" distL="114300" distR="114300">
-            <wp:extent cx="5749290" cy="3260725"/>
-            <wp:effectExtent l="0" t="0" r="11430" b="635"/>
-            <wp:docPr id="1" name="Picture 1"/>
+            <wp:extent cx="5748020" cy="3319780"/>
+            <wp:effectExtent l="0" t="0" r="12700" b="2540"/>
+            <wp:docPr id="2" name="Picture 1"/>
             <wp:cNvGraphicFramePr>
               <a:graphicFrameLocks xmlns:a="http://schemas.openxmlformats.org/drawingml/2006/main" noChangeAspect="1"/>
             </wp:cNvGraphicFramePr>
@@ -17101,7 +17633,7 @@
               <a:graphicData uri="http://schemas.openxmlformats.org/drawingml/2006/picture">
                 <pic:pic xmlns:pic="http://schemas.openxmlformats.org/drawingml/2006/picture">
                   <pic:nvPicPr>
-                    <pic:cNvPr id="1" name="Picture 1"/>
+                    <pic:cNvPr id="2" name="Picture 1"/>
                     <pic:cNvPicPr>
                       <a:picLocks noChangeAspect="1"/>
                     </pic:cNvPicPr>
@@ -17115,7 +17647,7 @@
                   <pic:spPr>
                     <a:xfrm>
                       <a:off x="0" y="0"/>
-                      <a:ext cx="5749290" cy="3260725"/>
+                      <a:ext cx="5748020" cy="3319780"/>
                     </a:xfrm>
                     <a:prstGeom prst="rect">
                       <a:avLst/>
@@ -17434,8 +17966,8 @@
           <w:lang w:val="en-US"/>
         </w:rPr>
       </w:pPr>
-      <w:bookmarkStart w:id="75" w:name="_Toc17615"/>
-      <w:bookmarkStart w:id="76" w:name="_Toc16866"/>
+      <w:bookmarkStart w:id="75" w:name="_Toc16866"/>
+      <w:bookmarkStart w:id="76" w:name="_Toc17615"/>
       <w:bookmarkStart w:id="77" w:name="_Toc231414252"/>
       <w:r>
         <w:rPr>
@@ -17495,9 +18027,9 @@
           <w:lang w:val="en-US"/>
         </w:rPr>
       </w:pPr>
-      <w:bookmarkStart w:id="78" w:name="_Toc231414253"/>
-      <w:bookmarkStart w:id="79" w:name="_Toc23109"/>
-      <w:bookmarkStart w:id="80" w:name="_Toc866"/>
+      <w:bookmarkStart w:id="78" w:name="_Toc866"/>
+      <w:bookmarkStart w:id="79" w:name="_Toc231414253"/>
+      <w:bookmarkStart w:id="80" w:name="_Toc23109"/>
       <w:r>
         <w:rPr>
           <w:lang w:val="en-US"/>
@@ -18451,6 +18983,12 @@
             <w:insideV w:val="single" w:color="auto" w:sz="4" w:space="0"/>
           </w:tblBorders>
           <w:shd w:val="clear" w:color="auto" w:fill="auto"/>
+          <w:tblCellMar>
+            <w:top w:w="0" w:type="dxa"/>
+            <w:left w:w="10" w:type="dxa"/>
+            <w:bottom w:w="0" w:type="dxa"/>
+            <w:right w:w="10" w:type="dxa"/>
+          </w:tblCellMar>
         </w:tblPrEx>
         <w:tc>
           <w:tcPr>
@@ -19226,9 +19764,9 @@
           <w:lang w:val="en-US"/>
         </w:rPr>
       </w:pPr>
-      <w:bookmarkStart w:id="84" w:name="_Toc14643"/>
-      <w:bookmarkStart w:id="85" w:name="_Toc13906"/>
-      <w:bookmarkStart w:id="86" w:name="_Toc231414255"/>
+      <w:bookmarkStart w:id="84" w:name="_Toc13906"/>
+      <w:bookmarkStart w:id="85" w:name="_Toc231414255"/>
+      <w:bookmarkStart w:id="86" w:name="_Toc14643"/>
       <w:r>
         <w:rPr>
           <w:lang w:val="en-US"/>
@@ -19238,743 +19776,6 @@
       <w:bookmarkEnd w:id="84"/>
       <w:bookmarkEnd w:id="85"/>
       <w:bookmarkEnd w:id="86"/>
-    </w:p>
-    <w:tbl>
-      <w:tblPr>
-        <w:tblStyle w:val="9"/>
-        <w:tblW w:w="9026" w:type="dxa"/>
-        <w:tblInd w:w="0" w:type="dxa"/>
-        <w:tblBorders>
-          <w:top w:val="single" w:color="auto" w:sz="4" w:space="0"/>
-          <w:left w:val="single" w:color="auto" w:sz="4" w:space="0"/>
-          <w:bottom w:val="single" w:color="auto" w:sz="4" w:space="0"/>
-          <w:right w:val="single" w:color="auto" w:sz="4" w:space="0"/>
-          <w:insideH w:val="single" w:color="auto" w:sz="4" w:space="0"/>
-          <w:insideV w:val="single" w:color="auto" w:sz="4" w:space="0"/>
-        </w:tblBorders>
-        <w:shd w:val="clear" w:color="auto" w:fill="auto"/>
-        <w:tblLayout w:type="autofit"/>
-        <w:tblCellMar>
-          <w:top w:w="0" w:type="dxa"/>
-          <w:left w:w="10" w:type="dxa"/>
-          <w:bottom w:w="0" w:type="dxa"/>
-          <w:right w:w="10" w:type="dxa"/>
-        </w:tblCellMar>
-      </w:tblPr>
-      <w:tblGrid>
-        <w:gridCol w:w="2000"/>
-        <w:gridCol w:w="7026"/>
-      </w:tblGrid>
-      <w:tr>
-        <w:tblPrEx>
-          <w:tblBorders>
-            <w:top w:val="single" w:color="auto" w:sz="4" w:space="0"/>
-            <w:left w:val="single" w:color="auto" w:sz="4" w:space="0"/>
-            <w:bottom w:val="single" w:color="auto" w:sz="4" w:space="0"/>
-            <w:right w:val="single" w:color="auto" w:sz="4" w:space="0"/>
-            <w:insideH w:val="single" w:color="auto" w:sz="4" w:space="0"/>
-            <w:insideV w:val="single" w:color="auto" w:sz="4" w:space="0"/>
-          </w:tblBorders>
-          <w:shd w:val="clear" w:color="auto" w:fill="auto"/>
-        </w:tblPrEx>
-        <w:tc>
-          <w:tcPr>
-            <w:tcW w:w="2000" w:type="dxa"/>
-            <w:tcBorders>
-              <w:top w:val="single" w:color="000000" w:sz="6" w:space="0"/>
-              <w:left w:val="single" w:color="000000" w:sz="6" w:space="0"/>
-              <w:bottom w:val="single" w:color="000000" w:sz="6" w:space="0"/>
-              <w:right w:val="single" w:color="000000" w:sz="6" w:space="0"/>
-            </w:tcBorders>
-            <w:shd w:val="clear" w:color="auto" w:fill="D9D9D9"/>
-            <w:tcMar>
-              <w:top w:w="80" w:type="dxa"/>
-              <w:left w:w="120" w:type="dxa"/>
-              <w:bottom w:w="80" w:type="dxa"/>
-              <w:right w:w="120" w:type="dxa"/>
-            </w:tcMar>
-            <w:vAlign w:val="center"/>
-          </w:tcPr>
-          <w:p>
-            <w:pPr>
-              <w:keepNext w:val="0"/>
-              <w:keepLines w:val="0"/>
-              <w:widowControl/>
-              <w:suppressLineNumbers w:val="0"/>
-              <w:spacing w:before="40" w:beforeAutospacing="0" w:after="40" w:afterAutospacing="0" w:line="360" w:lineRule="auto"/>
-              <w:ind w:left="0" w:right="0"/>
-              <w:jc w:val="left"/>
-              <w:rPr>
-                <w:rFonts w:hint="default"/>
-              </w:rPr>
-            </w:pPr>
-            <w:r>
-              <w:rPr>
-                <w:rFonts w:hint="default" w:ascii="Times New Roman" w:hAnsi="Times New Roman" w:eastAsia="Times New Roman" w:cs="Times New Roman"/>
-                <w:b/>
-                <w:bCs/>
-                <w:color w:val="auto"/>
-                <w:kern w:val="0"/>
-                <w:sz w:val="24"/>
-                <w:szCs w:val="24"/>
-                <w:lang w:val="en-US" w:eastAsia="zh-CN" w:bidi="ar"/>
-              </w:rPr>
-              <w:t>TC ID</w:t>
-            </w:r>
-          </w:p>
-        </w:tc>
-        <w:tc>
-          <w:tcPr>
-            <w:tcW w:w="7026" w:type="dxa"/>
-            <w:tcBorders>
-              <w:top w:val="single" w:color="000000" w:sz="6" w:space="0"/>
-              <w:left w:val="single" w:color="000000" w:sz="6" w:space="0"/>
-              <w:bottom w:val="single" w:color="000000" w:sz="6" w:space="0"/>
-              <w:right w:val="single" w:color="000000" w:sz="6" w:space="0"/>
-            </w:tcBorders>
-            <w:shd w:val="clear" w:color="auto" w:fill="auto"/>
-            <w:tcMar>
-              <w:top w:w="80" w:type="dxa"/>
-              <w:left w:w="120" w:type="dxa"/>
-              <w:bottom w:w="80" w:type="dxa"/>
-              <w:right w:w="120" w:type="dxa"/>
-            </w:tcMar>
-            <w:vAlign w:val="center"/>
-          </w:tcPr>
-          <w:p>
-            <w:pPr>
-              <w:keepNext w:val="0"/>
-              <w:keepLines w:val="0"/>
-              <w:widowControl/>
-              <w:suppressLineNumbers w:val="0"/>
-              <w:spacing w:before="40" w:beforeAutospacing="0" w:after="40" w:afterAutospacing="0" w:line="360" w:lineRule="auto"/>
-              <w:ind w:left="0" w:right="0"/>
-              <w:jc w:val="left"/>
-              <w:rPr>
-                <w:rFonts w:hint="default"/>
-              </w:rPr>
-            </w:pPr>
-            <w:r>
-              <w:rPr>
-                <w:rFonts w:hint="default" w:ascii="Times New Roman" w:hAnsi="Times New Roman" w:eastAsia="Times New Roman" w:cs="Times New Roman"/>
-                <w:kern w:val="0"/>
-                <w:sz w:val="24"/>
-                <w:szCs w:val="24"/>
-                <w:lang w:val="en-US" w:eastAsia="zh-CN" w:bidi="ar"/>
-              </w:rPr>
-              <w:t>TC04-03</w:t>
-            </w:r>
-          </w:p>
-        </w:tc>
-      </w:tr>
-      <w:tr>
-        <w:tblPrEx>
-          <w:tblBorders>
-            <w:top w:val="single" w:color="auto" w:sz="4" w:space="0"/>
-            <w:left w:val="single" w:color="auto" w:sz="4" w:space="0"/>
-            <w:bottom w:val="single" w:color="auto" w:sz="4" w:space="0"/>
-            <w:right w:val="single" w:color="auto" w:sz="4" w:space="0"/>
-            <w:insideH w:val="single" w:color="auto" w:sz="4" w:space="0"/>
-            <w:insideV w:val="single" w:color="auto" w:sz="4" w:space="0"/>
-          </w:tblBorders>
-          <w:shd w:val="clear" w:color="auto" w:fill="auto"/>
-          <w:tblCellMar>
-            <w:top w:w="0" w:type="dxa"/>
-            <w:left w:w="10" w:type="dxa"/>
-            <w:bottom w:w="0" w:type="dxa"/>
-            <w:right w:w="10" w:type="dxa"/>
-          </w:tblCellMar>
-        </w:tblPrEx>
-        <w:tc>
-          <w:tcPr>
-            <w:tcW w:w="2000" w:type="dxa"/>
-            <w:tcBorders>
-              <w:top w:val="single" w:color="000000" w:sz="6" w:space="0"/>
-              <w:left w:val="single" w:color="000000" w:sz="6" w:space="0"/>
-              <w:bottom w:val="single" w:color="000000" w:sz="6" w:space="0"/>
-              <w:right w:val="single" w:color="000000" w:sz="6" w:space="0"/>
-            </w:tcBorders>
-            <w:shd w:val="clear" w:color="auto" w:fill="D9D9D9"/>
-            <w:tcMar>
-              <w:top w:w="80" w:type="dxa"/>
-              <w:left w:w="120" w:type="dxa"/>
-              <w:bottom w:w="80" w:type="dxa"/>
-              <w:right w:w="120" w:type="dxa"/>
-            </w:tcMar>
-            <w:vAlign w:val="center"/>
-          </w:tcPr>
-          <w:p>
-            <w:pPr>
-              <w:keepNext w:val="0"/>
-              <w:keepLines w:val="0"/>
-              <w:widowControl/>
-              <w:suppressLineNumbers w:val="0"/>
-              <w:spacing w:before="40" w:beforeAutospacing="0" w:after="40" w:afterAutospacing="0" w:line="360" w:lineRule="auto"/>
-              <w:ind w:left="0" w:right="0"/>
-              <w:jc w:val="left"/>
-              <w:rPr>
-                <w:rFonts w:hint="default"/>
-              </w:rPr>
-            </w:pPr>
-            <w:r>
-              <w:rPr>
-                <w:rFonts w:hint="default" w:ascii="Times New Roman" w:hAnsi="Times New Roman" w:eastAsia="Times New Roman" w:cs="Times New Roman"/>
-                <w:b/>
-                <w:bCs/>
-                <w:color w:val="auto"/>
-                <w:kern w:val="0"/>
-                <w:sz w:val="24"/>
-                <w:szCs w:val="24"/>
-                <w:lang w:val="en-US" w:eastAsia="zh-CN" w:bidi="ar"/>
-              </w:rPr>
-              <w:t>Mô tả</w:t>
-            </w:r>
-          </w:p>
-        </w:tc>
-        <w:tc>
-          <w:tcPr>
-            <w:tcW w:w="7026" w:type="dxa"/>
-            <w:tcBorders>
-              <w:top w:val="single" w:color="000000" w:sz="6" w:space="0"/>
-              <w:left w:val="single" w:color="000000" w:sz="6" w:space="0"/>
-              <w:bottom w:val="single" w:color="000000" w:sz="6" w:space="0"/>
-              <w:right w:val="single" w:color="000000" w:sz="6" w:space="0"/>
-            </w:tcBorders>
-            <w:shd w:val="clear" w:color="auto" w:fill="auto"/>
-            <w:tcMar>
-              <w:top w:w="80" w:type="dxa"/>
-              <w:left w:w="120" w:type="dxa"/>
-              <w:bottom w:w="80" w:type="dxa"/>
-              <w:right w:w="120" w:type="dxa"/>
-            </w:tcMar>
-            <w:vAlign w:val="center"/>
-          </w:tcPr>
-          <w:p>
-            <w:pPr>
-              <w:keepNext w:val="0"/>
-              <w:keepLines w:val="0"/>
-              <w:widowControl/>
-              <w:suppressLineNumbers w:val="0"/>
-              <w:spacing w:before="40" w:beforeAutospacing="0" w:after="40" w:afterAutospacing="0" w:line="360" w:lineRule="auto"/>
-              <w:ind w:left="0" w:right="0"/>
-              <w:jc w:val="left"/>
-              <w:rPr>
-                <w:rFonts w:hint="default"/>
-              </w:rPr>
-            </w:pPr>
-            <w:r>
-              <w:rPr>
-                <w:rFonts w:hint="default" w:ascii="Times New Roman" w:hAnsi="Times New Roman" w:eastAsia="Times New Roman" w:cs="Times New Roman"/>
-                <w:kern w:val="0"/>
-                <w:sz w:val="24"/>
-                <w:szCs w:val="24"/>
-                <w:lang w:val="en-US" w:eastAsia="zh-CN" w:bidi="ar"/>
-              </w:rPr>
-              <w:t>Truy cập URL /movie-detail không kèm tham số id.</w:t>
-            </w:r>
-          </w:p>
-        </w:tc>
-      </w:tr>
-      <w:tr>
-        <w:tblPrEx>
-          <w:tblBorders>
-            <w:top w:val="single" w:color="auto" w:sz="4" w:space="0"/>
-            <w:left w:val="single" w:color="auto" w:sz="4" w:space="0"/>
-            <w:bottom w:val="single" w:color="auto" w:sz="4" w:space="0"/>
-            <w:right w:val="single" w:color="auto" w:sz="4" w:space="0"/>
-            <w:insideH w:val="single" w:color="auto" w:sz="4" w:space="0"/>
-            <w:insideV w:val="single" w:color="auto" w:sz="4" w:space="0"/>
-          </w:tblBorders>
-          <w:shd w:val="clear" w:color="auto" w:fill="auto"/>
-          <w:tblCellMar>
-            <w:top w:w="0" w:type="dxa"/>
-            <w:left w:w="10" w:type="dxa"/>
-            <w:bottom w:w="0" w:type="dxa"/>
-            <w:right w:w="10" w:type="dxa"/>
-          </w:tblCellMar>
-        </w:tblPrEx>
-        <w:tc>
-          <w:tcPr>
-            <w:tcW w:w="2000" w:type="dxa"/>
-            <w:tcBorders>
-              <w:top w:val="single" w:color="000000" w:sz="6" w:space="0"/>
-              <w:left w:val="single" w:color="000000" w:sz="6" w:space="0"/>
-              <w:bottom w:val="single" w:color="000000" w:sz="6" w:space="0"/>
-              <w:right w:val="single" w:color="000000" w:sz="6" w:space="0"/>
-            </w:tcBorders>
-            <w:shd w:val="clear" w:color="auto" w:fill="D9D9D9"/>
-            <w:tcMar>
-              <w:top w:w="80" w:type="dxa"/>
-              <w:left w:w="120" w:type="dxa"/>
-              <w:bottom w:w="80" w:type="dxa"/>
-              <w:right w:w="120" w:type="dxa"/>
-            </w:tcMar>
-            <w:vAlign w:val="center"/>
-          </w:tcPr>
-          <w:p>
-            <w:pPr>
-              <w:keepNext w:val="0"/>
-              <w:keepLines w:val="0"/>
-              <w:widowControl/>
-              <w:suppressLineNumbers w:val="0"/>
-              <w:spacing w:before="40" w:beforeAutospacing="0" w:after="40" w:afterAutospacing="0" w:line="360" w:lineRule="auto"/>
-              <w:ind w:left="0" w:right="0"/>
-              <w:jc w:val="left"/>
-              <w:rPr>
-                <w:rFonts w:hint="default"/>
-              </w:rPr>
-            </w:pPr>
-            <w:r>
-              <w:rPr>
-                <w:rFonts w:hint="default" w:ascii="Times New Roman" w:hAnsi="Times New Roman" w:eastAsia="Times New Roman" w:cs="Times New Roman"/>
-                <w:b/>
-                <w:bCs/>
-                <w:color w:val="auto"/>
-                <w:kern w:val="0"/>
-                <w:sz w:val="24"/>
-                <w:szCs w:val="24"/>
-                <w:lang w:val="en-US" w:eastAsia="zh-CN" w:bidi="ar"/>
-              </w:rPr>
-              <w:t>Tiền điều kiện</w:t>
-            </w:r>
-          </w:p>
-        </w:tc>
-        <w:tc>
-          <w:tcPr>
-            <w:tcW w:w="7026" w:type="dxa"/>
-            <w:tcBorders>
-              <w:top w:val="single" w:color="000000" w:sz="6" w:space="0"/>
-              <w:left w:val="single" w:color="000000" w:sz="6" w:space="0"/>
-              <w:bottom w:val="single" w:color="000000" w:sz="6" w:space="0"/>
-              <w:right w:val="single" w:color="000000" w:sz="6" w:space="0"/>
-            </w:tcBorders>
-            <w:shd w:val="clear" w:color="auto" w:fill="auto"/>
-            <w:tcMar>
-              <w:top w:w="80" w:type="dxa"/>
-              <w:left w:w="120" w:type="dxa"/>
-              <w:bottom w:w="80" w:type="dxa"/>
-              <w:right w:w="120" w:type="dxa"/>
-            </w:tcMar>
-            <w:vAlign w:val="center"/>
-          </w:tcPr>
-          <w:p>
-            <w:pPr>
-              <w:keepNext w:val="0"/>
-              <w:keepLines w:val="0"/>
-              <w:widowControl/>
-              <w:suppressLineNumbers w:val="0"/>
-              <w:spacing w:before="20" w:beforeAutospacing="0" w:after="20" w:afterAutospacing="0" w:line="360" w:lineRule="auto"/>
-              <w:ind w:left="0" w:right="0"/>
-              <w:jc w:val="both"/>
-              <w:rPr>
-                <w:rFonts w:hint="default"/>
-              </w:rPr>
-            </w:pPr>
-            <w:r>
-              <w:rPr>
-                <w:rFonts w:hint="default" w:ascii="Times New Roman" w:hAnsi="Times New Roman" w:eastAsia="Times New Roman" w:cs="Times New Roman"/>
-                <w:color w:val="000000"/>
-                <w:kern w:val="0"/>
-                <w:sz w:val="24"/>
-                <w:szCs w:val="24"/>
-                <w:lang w:val="en-US" w:eastAsia="zh-CN" w:bidi="ar"/>
-              </w:rPr>
-              <w:t>1. Hệ thống đang hoạt động bình thường.</w:t>
-            </w:r>
-          </w:p>
-        </w:tc>
-      </w:tr>
-      <w:tr>
-        <w:tblPrEx>
-          <w:tblBorders>
-            <w:top w:val="single" w:color="auto" w:sz="4" w:space="0"/>
-            <w:left w:val="single" w:color="auto" w:sz="4" w:space="0"/>
-            <w:bottom w:val="single" w:color="auto" w:sz="4" w:space="0"/>
-            <w:right w:val="single" w:color="auto" w:sz="4" w:space="0"/>
-            <w:insideH w:val="single" w:color="auto" w:sz="4" w:space="0"/>
-            <w:insideV w:val="single" w:color="auto" w:sz="4" w:space="0"/>
-          </w:tblBorders>
-          <w:shd w:val="clear" w:color="auto" w:fill="auto"/>
-          <w:tblCellMar>
-            <w:top w:w="0" w:type="dxa"/>
-            <w:left w:w="10" w:type="dxa"/>
-            <w:bottom w:w="0" w:type="dxa"/>
-            <w:right w:w="10" w:type="dxa"/>
-          </w:tblCellMar>
-        </w:tblPrEx>
-        <w:tc>
-          <w:tcPr>
-            <w:tcW w:w="2000" w:type="dxa"/>
-            <w:tcBorders>
-              <w:top w:val="single" w:color="000000" w:sz="6" w:space="0"/>
-              <w:left w:val="single" w:color="000000" w:sz="6" w:space="0"/>
-              <w:bottom w:val="single" w:color="000000" w:sz="6" w:space="0"/>
-              <w:right w:val="single" w:color="000000" w:sz="6" w:space="0"/>
-            </w:tcBorders>
-            <w:shd w:val="clear" w:color="auto" w:fill="D9D9D9"/>
-            <w:tcMar>
-              <w:top w:w="80" w:type="dxa"/>
-              <w:left w:w="120" w:type="dxa"/>
-              <w:bottom w:w="80" w:type="dxa"/>
-              <w:right w:w="120" w:type="dxa"/>
-            </w:tcMar>
-            <w:vAlign w:val="center"/>
-          </w:tcPr>
-          <w:p>
-            <w:pPr>
-              <w:keepNext w:val="0"/>
-              <w:keepLines w:val="0"/>
-              <w:widowControl/>
-              <w:suppressLineNumbers w:val="0"/>
-              <w:spacing w:before="40" w:beforeAutospacing="0" w:after="40" w:afterAutospacing="0" w:line="360" w:lineRule="auto"/>
-              <w:ind w:left="0" w:right="0"/>
-              <w:jc w:val="left"/>
-              <w:rPr>
-                <w:rFonts w:hint="default"/>
-              </w:rPr>
-            </w:pPr>
-            <w:r>
-              <w:rPr>
-                <w:rFonts w:hint="default" w:ascii="Times New Roman" w:hAnsi="Times New Roman" w:eastAsia="Times New Roman" w:cs="Times New Roman"/>
-                <w:b/>
-                <w:bCs/>
-                <w:color w:val="auto"/>
-                <w:kern w:val="0"/>
-                <w:sz w:val="24"/>
-                <w:szCs w:val="24"/>
-                <w:lang w:val="en-US" w:eastAsia="zh-CN" w:bidi="ar"/>
-              </w:rPr>
-              <w:t>Các bước thực hiện</w:t>
-            </w:r>
-          </w:p>
-        </w:tc>
-        <w:tc>
-          <w:tcPr>
-            <w:tcW w:w="7026" w:type="dxa"/>
-            <w:tcBorders>
-              <w:top w:val="single" w:color="000000" w:sz="6" w:space="0"/>
-              <w:left w:val="single" w:color="000000" w:sz="6" w:space="0"/>
-              <w:bottom w:val="single" w:color="000000" w:sz="6" w:space="0"/>
-              <w:right w:val="single" w:color="000000" w:sz="6" w:space="0"/>
-            </w:tcBorders>
-            <w:shd w:val="clear" w:color="auto" w:fill="auto"/>
-            <w:tcMar>
-              <w:top w:w="80" w:type="dxa"/>
-              <w:left w:w="120" w:type="dxa"/>
-              <w:bottom w:w="80" w:type="dxa"/>
-              <w:right w:w="120" w:type="dxa"/>
-            </w:tcMar>
-            <w:vAlign w:val="center"/>
-          </w:tcPr>
-          <w:p>
-            <w:pPr>
-              <w:keepNext w:val="0"/>
-              <w:keepLines w:val="0"/>
-              <w:widowControl/>
-              <w:suppressLineNumbers w:val="0"/>
-              <w:spacing w:before="20" w:beforeAutospacing="0" w:after="20" w:afterAutospacing="0" w:line="360" w:lineRule="auto"/>
-              <w:ind w:left="0" w:right="0"/>
-              <w:jc w:val="both"/>
-              <w:rPr>
-                <w:rFonts w:hint="default"/>
-              </w:rPr>
-            </w:pPr>
-            <w:r>
-              <w:rPr>
-                <w:rFonts w:hint="default" w:ascii="Times New Roman" w:hAnsi="Times New Roman" w:eastAsia="Times New Roman" w:cs="Times New Roman"/>
-                <w:color w:val="000000"/>
-                <w:kern w:val="0"/>
-                <w:sz w:val="24"/>
-                <w:szCs w:val="24"/>
-                <w:lang w:val="en-US" w:eastAsia="zh-CN" w:bidi="ar"/>
-              </w:rPr>
-              <w:t>1. Mở trình duyệt, truy cập URL: /movie-detail (không có ?id=...).</w:t>
-            </w:r>
-          </w:p>
-          <w:p>
-            <w:pPr>
-              <w:keepNext w:val="0"/>
-              <w:keepLines w:val="0"/>
-              <w:widowControl/>
-              <w:suppressLineNumbers w:val="0"/>
-              <w:spacing w:before="20" w:beforeAutospacing="0" w:after="20" w:afterAutospacing="0" w:line="360" w:lineRule="auto"/>
-              <w:ind w:left="0" w:right="0"/>
-              <w:jc w:val="both"/>
-              <w:rPr>
-                <w:rFonts w:hint="default"/>
-              </w:rPr>
-            </w:pPr>
-            <w:r>
-              <w:rPr>
-                <w:rFonts w:hint="default" w:ascii="Times New Roman" w:hAnsi="Times New Roman" w:eastAsia="Times New Roman" w:cs="Times New Roman"/>
-                <w:color w:val="000000"/>
-                <w:kern w:val="0"/>
-                <w:sz w:val="24"/>
-                <w:szCs w:val="24"/>
-                <w:lang w:val="en-US" w:eastAsia="zh-CN" w:bidi="ar"/>
-              </w:rPr>
-              <w:t>2. MovieController nhận request, gọi request.getParameter("id").</w:t>
-            </w:r>
-          </w:p>
-          <w:p>
-            <w:pPr>
-              <w:keepNext w:val="0"/>
-              <w:keepLines w:val="0"/>
-              <w:widowControl/>
-              <w:suppressLineNumbers w:val="0"/>
-              <w:spacing w:before="20" w:beforeAutospacing="0" w:after="20" w:afterAutospacing="0" w:line="360" w:lineRule="auto"/>
-              <w:ind w:left="0" w:right="0"/>
-              <w:jc w:val="both"/>
-              <w:rPr>
-                <w:rFonts w:hint="default"/>
-              </w:rPr>
-            </w:pPr>
-            <w:r>
-              <w:rPr>
-                <w:rFonts w:hint="default" w:ascii="Times New Roman" w:hAnsi="Times New Roman" w:eastAsia="Times New Roman" w:cs="Times New Roman"/>
-                <w:color w:val="000000"/>
-                <w:kern w:val="0"/>
-                <w:sz w:val="24"/>
-                <w:szCs w:val="24"/>
-                <w:lang w:val="en-US" w:eastAsia="zh-CN" w:bidi="ar"/>
-              </w:rPr>
-              <w:t>3. Giá trị trả về là null.</w:t>
-            </w:r>
-          </w:p>
-          <w:p>
-            <w:pPr>
-              <w:keepNext w:val="0"/>
-              <w:keepLines w:val="0"/>
-              <w:widowControl/>
-              <w:suppressLineNumbers w:val="0"/>
-              <w:spacing w:before="20" w:beforeAutospacing="0" w:after="20" w:afterAutospacing="0" w:line="360" w:lineRule="auto"/>
-              <w:ind w:left="0" w:right="0"/>
-              <w:jc w:val="both"/>
-              <w:rPr>
-                <w:rFonts w:hint="default"/>
-              </w:rPr>
-            </w:pPr>
-            <w:r>
-              <w:rPr>
-                <w:rFonts w:hint="default" w:ascii="Times New Roman" w:hAnsi="Times New Roman" w:eastAsia="Times New Roman" w:cs="Times New Roman"/>
-                <w:color w:val="000000"/>
-                <w:kern w:val="0"/>
-                <w:sz w:val="24"/>
-                <w:szCs w:val="24"/>
-                <w:lang w:val="en-US" w:eastAsia="zh-CN" w:bidi="ar"/>
-              </w:rPr>
-              <w:t>4. MovieController kiểm tra idRaw == null.</w:t>
-            </w:r>
-          </w:p>
-        </w:tc>
-      </w:tr>
-      <w:tr>
-        <w:tblPrEx>
-          <w:tblBorders>
-            <w:top w:val="single" w:color="auto" w:sz="4" w:space="0"/>
-            <w:left w:val="single" w:color="auto" w:sz="4" w:space="0"/>
-            <w:bottom w:val="single" w:color="auto" w:sz="4" w:space="0"/>
-            <w:right w:val="single" w:color="auto" w:sz="4" w:space="0"/>
-            <w:insideH w:val="single" w:color="auto" w:sz="4" w:space="0"/>
-            <w:insideV w:val="single" w:color="auto" w:sz="4" w:space="0"/>
-          </w:tblBorders>
-          <w:shd w:val="clear" w:color="auto" w:fill="auto"/>
-          <w:tblCellMar>
-            <w:top w:w="0" w:type="dxa"/>
-            <w:left w:w="10" w:type="dxa"/>
-            <w:bottom w:w="0" w:type="dxa"/>
-            <w:right w:w="10" w:type="dxa"/>
-          </w:tblCellMar>
-        </w:tblPrEx>
-        <w:tc>
-          <w:tcPr>
-            <w:tcW w:w="2000" w:type="dxa"/>
-            <w:tcBorders>
-              <w:top w:val="single" w:color="000000" w:sz="6" w:space="0"/>
-              <w:left w:val="single" w:color="000000" w:sz="6" w:space="0"/>
-              <w:bottom w:val="single" w:color="000000" w:sz="6" w:space="0"/>
-              <w:right w:val="single" w:color="000000" w:sz="6" w:space="0"/>
-            </w:tcBorders>
-            <w:shd w:val="clear" w:color="auto" w:fill="D9D9D9"/>
-            <w:tcMar>
-              <w:top w:w="80" w:type="dxa"/>
-              <w:left w:w="120" w:type="dxa"/>
-              <w:bottom w:w="80" w:type="dxa"/>
-              <w:right w:w="120" w:type="dxa"/>
-            </w:tcMar>
-            <w:vAlign w:val="center"/>
-          </w:tcPr>
-          <w:p>
-            <w:pPr>
-              <w:keepNext w:val="0"/>
-              <w:keepLines w:val="0"/>
-              <w:widowControl/>
-              <w:suppressLineNumbers w:val="0"/>
-              <w:spacing w:before="40" w:beforeAutospacing="0" w:after="40" w:afterAutospacing="0" w:line="360" w:lineRule="auto"/>
-              <w:ind w:left="0" w:right="0"/>
-              <w:jc w:val="left"/>
-              <w:rPr>
-                <w:rFonts w:hint="default"/>
-              </w:rPr>
-            </w:pPr>
-            <w:r>
-              <w:rPr>
-                <w:rFonts w:hint="default" w:ascii="Times New Roman" w:hAnsi="Times New Roman" w:eastAsia="Times New Roman" w:cs="Times New Roman"/>
-                <w:b/>
-                <w:bCs/>
-                <w:color w:val="auto"/>
-                <w:kern w:val="0"/>
-                <w:sz w:val="24"/>
-                <w:szCs w:val="24"/>
-                <w:lang w:val="en-US" w:eastAsia="zh-CN" w:bidi="ar"/>
-              </w:rPr>
-              <w:t>Kết quả mong đợi</w:t>
-            </w:r>
-          </w:p>
-        </w:tc>
-        <w:tc>
-          <w:tcPr>
-            <w:tcW w:w="7026" w:type="dxa"/>
-            <w:tcBorders>
-              <w:top w:val="single" w:color="000000" w:sz="6" w:space="0"/>
-              <w:left w:val="single" w:color="000000" w:sz="6" w:space="0"/>
-              <w:bottom w:val="single" w:color="000000" w:sz="6" w:space="0"/>
-              <w:right w:val="single" w:color="000000" w:sz="6" w:space="0"/>
-            </w:tcBorders>
-            <w:shd w:val="clear" w:color="auto" w:fill="auto"/>
-            <w:tcMar>
-              <w:top w:w="80" w:type="dxa"/>
-              <w:left w:w="120" w:type="dxa"/>
-              <w:bottom w:w="80" w:type="dxa"/>
-              <w:right w:w="120" w:type="dxa"/>
-            </w:tcMar>
-            <w:vAlign w:val="center"/>
-          </w:tcPr>
-          <w:p>
-            <w:pPr>
-              <w:keepNext w:val="0"/>
-              <w:keepLines w:val="0"/>
-              <w:widowControl/>
-              <w:numPr>
-                <w:ilvl w:val="0"/>
-                <w:numId w:val="7"/>
-              </w:numPr>
-              <w:suppressLineNumbers w:val="0"/>
-              <w:spacing w:before="20" w:beforeAutospacing="0" w:after="20" w:afterAutospacing="0" w:line="360" w:lineRule="auto"/>
-              <w:ind w:left="0" w:right="0"/>
-              <w:jc w:val="both"/>
-              <w:rPr>
-                <w:rFonts w:hint="default" w:ascii="Times New Roman" w:hAnsi="Times New Roman" w:eastAsia="Times New Roman" w:cs="Times New Roman"/>
-                <w:color w:val="000000"/>
-                <w:kern w:val="0"/>
-                <w:sz w:val="24"/>
-                <w:szCs w:val="24"/>
-                <w:lang w:val="en-US" w:eastAsia="zh-CN" w:bidi="ar"/>
-              </w:rPr>
-            </w:pPr>
-            <w:r>
-              <w:rPr>
-                <w:rFonts w:hint="default" w:ascii="Times New Roman" w:hAnsi="Times New Roman" w:eastAsia="Times New Roman" w:cs="Times New Roman"/>
-                <w:color w:val="000000"/>
-                <w:kern w:val="0"/>
-                <w:sz w:val="24"/>
-                <w:szCs w:val="24"/>
-                <w:lang w:val="en-US" w:eastAsia="zh-CN" w:bidi="ar"/>
-              </w:rPr>
-              <w:t>Hệ thống redirect về /movies?detailMessage=missing_id và hiển thị thông báo “Vui lòng chọn phim từ danh sách.”</w:t>
-            </w:r>
-          </w:p>
-          <w:p>
-            <w:pPr>
-              <w:keepNext w:val="0"/>
-              <w:keepLines w:val="0"/>
-              <w:widowControl/>
-              <w:numPr>
-                <w:numId w:val="0"/>
-              </w:numPr>
-              <w:suppressLineNumbers w:val="0"/>
-              <w:spacing w:before="20" w:beforeAutospacing="0" w:after="20" w:afterAutospacing="0" w:line="360" w:lineRule="auto"/>
-              <w:ind w:right="0" w:rightChars="0"/>
-              <w:jc w:val="both"/>
-              <w:rPr>
-                <w:rFonts w:hint="default"/>
-              </w:rPr>
-            </w:pPr>
-            <w:r>
-              <w:rPr>
-                <w:rFonts w:hint="default" w:ascii="Times New Roman" w:hAnsi="Times New Roman" w:eastAsia="Times New Roman" w:cs="Times New Roman"/>
-                <w:color w:val="000000"/>
-                <w:kern w:val="0"/>
-                <w:sz w:val="24"/>
-                <w:szCs w:val="24"/>
-                <w:lang w:val="en-US" w:eastAsia="zh-CN" w:bidi="ar"/>
-              </w:rPr>
-              <w:t>2. Không hiển thị trang trắng hay lỗi server.</w:t>
-            </w:r>
-          </w:p>
-          <w:p>
-            <w:pPr>
-              <w:keepNext w:val="0"/>
-              <w:keepLines w:val="0"/>
-              <w:widowControl/>
-              <w:suppressLineNumbers w:val="0"/>
-              <w:spacing w:before="20" w:beforeAutospacing="0" w:after="20" w:afterAutospacing="0" w:line="360" w:lineRule="auto"/>
-              <w:ind w:left="0" w:right="0"/>
-              <w:jc w:val="both"/>
-              <w:rPr>
-                <w:rFonts w:hint="default"/>
-              </w:rPr>
-            </w:pPr>
-            <w:r>
-              <w:rPr>
-                <w:rFonts w:hint="default" w:ascii="Times New Roman" w:hAnsi="Times New Roman" w:eastAsia="Times New Roman" w:cs="Times New Roman"/>
-                <w:color w:val="000000"/>
-                <w:kern w:val="0"/>
-                <w:sz w:val="24"/>
-                <w:szCs w:val="24"/>
-                <w:lang w:val="en-US" w:eastAsia="zh-CN" w:bidi="ar"/>
-              </w:rPr>
-              <w:t>3. Không phát sinh HTTP 500.</w:t>
-            </w:r>
-          </w:p>
-        </w:tc>
-      </w:tr>
-    </w:tbl>
-    <w:p>
-      <w:pPr>
-        <w:keepNext w:val="0"/>
-        <w:keepLines w:val="0"/>
-        <w:widowControl/>
-        <w:suppressLineNumbers w:val="0"/>
-        <w:spacing w:before="0" w:beforeAutospacing="0" w:after="0" w:afterAutospacing="0" w:line="360" w:lineRule="auto"/>
-        <w:ind w:left="0" w:right="0"/>
-        <w:jc w:val="left"/>
-        <w:rPr>
-          <w:lang w:val="en-US"/>
-        </w:rPr>
-      </w:pPr>
-    </w:p>
-    <w:p>
-      <w:pPr>
-        <w:pStyle w:val="3"/>
-        <w:widowControl/>
-        <w:spacing w:line="360" w:lineRule="auto"/>
-        <w:rPr>
-          <w:lang w:val="en-US"/>
-        </w:rPr>
-      </w:pPr>
-      <w:bookmarkStart w:id="87" w:name="_Toc6276"/>
-      <w:bookmarkStart w:id="88" w:name="_Toc4233"/>
-      <w:bookmarkStart w:id="89" w:name="_Toc231414256"/>
-      <w:r>
-        <w:rPr>
-          <w:lang w:val="en-US"/>
-        </w:rPr>
-        <w:t>6.4. TC04-04: Tham số id không phải số</w:t>
-      </w:r>
-      <w:bookmarkEnd w:id="87"/>
-      <w:bookmarkEnd w:id="88"/>
-      <w:bookmarkEnd w:id="89"/>
     </w:p>
     <w:tbl>
       <w:tblPr>
@@ -20105,7 +19906,7 @@
                 <w:szCs w:val="24"/>
                 <w:lang w:val="en-US" w:eastAsia="zh-CN" w:bidi="ar"/>
               </w:rPr>
-              <w:t>TC04-04</w:t>
+              <w:t>TC04-03</w:t>
             </w:r>
           </w:p>
         </w:tc>
@@ -20213,7 +20014,7 @@
                 <w:szCs w:val="24"/>
                 <w:lang w:val="en-US" w:eastAsia="zh-CN" w:bidi="ar"/>
               </w:rPr>
-              <w:t>Truy cập trang chi tiết phim với id là chuỗi ký tự không hợp lệ.</w:t>
+              <w:t>Truy cập URL /movie-detail không kèm tham số id.</w:t>
             </w:r>
           </w:p>
         </w:tc>
@@ -20431,7 +20232,7 @@
                 <w:szCs w:val="24"/>
                 <w:lang w:val="en-US" w:eastAsia="zh-CN" w:bidi="ar"/>
               </w:rPr>
-              <w:t>1. Mở trình duyệt, truy cập URL: /movie-detail?id=abc.</w:t>
+              <w:t>1. Mở trình duyệt, truy cập URL: /movie-detail (không có ?id=...).</w:t>
             </w:r>
           </w:p>
           <w:p>
@@ -20456,7 +20257,7 @@
                 <w:szCs w:val="24"/>
                 <w:lang w:val="en-US" w:eastAsia="zh-CN" w:bidi="ar"/>
               </w:rPr>
-              <w:t>2. MovieController nhận idRaw = "abc".</w:t>
+              <w:t>2. MovieController nhận request, gọi request.getParameter("id").</w:t>
             </w:r>
           </w:p>
           <w:p>
@@ -20481,7 +20282,32 @@
                 <w:szCs w:val="24"/>
                 <w:lang w:val="en-US" w:eastAsia="zh-CN" w:bidi="ar"/>
               </w:rPr>
-              <w:t>3. Controller thực hiện Integer.parseInt("abc"), phát sinh NumberFormatException.</w:t>
+              <w:t>3. Giá trị trả về là null.</w:t>
+            </w:r>
+          </w:p>
+          <w:p>
+            <w:pPr>
+              <w:keepNext w:val="0"/>
+              <w:keepLines w:val="0"/>
+              <w:widowControl/>
+              <w:suppressLineNumbers w:val="0"/>
+              <w:spacing w:before="20" w:beforeAutospacing="0" w:after="20" w:afterAutospacing="0" w:line="360" w:lineRule="auto"/>
+              <w:ind w:left="0" w:right="0"/>
+              <w:jc w:val="both"/>
+              <w:rPr>
+                <w:rFonts w:hint="default"/>
+              </w:rPr>
+            </w:pPr>
+            <w:r>
+              <w:rPr>
+                <w:rFonts w:hint="default" w:ascii="Times New Roman" w:hAnsi="Times New Roman" w:eastAsia="Times New Roman" w:cs="Times New Roman"/>
+                <w:color w:val="000000"/>
+                <w:kern w:val="0"/>
+                <w:sz w:val="24"/>
+                <w:szCs w:val="24"/>
+                <w:lang w:val="en-US" w:eastAsia="zh-CN" w:bidi="ar"/>
+              </w:rPr>
+              <w:t>4. MovieController kiểm tra idRaw == null.</w:t>
             </w:r>
           </w:p>
         </w:tc>
@@ -20573,16 +20399,15 @@
               <w:keepNext w:val="0"/>
               <w:keepLines w:val="0"/>
               <w:widowControl/>
+              <w:numPr>
+                <w:ilvl w:val="0"/>
+                <w:numId w:val="7"/>
+              </w:numPr>
               <w:suppressLineNumbers w:val="0"/>
               <w:spacing w:before="20" w:beforeAutospacing="0" w:after="20" w:afterAutospacing="0" w:line="360" w:lineRule="auto"/>
               <w:ind w:left="0" w:right="0"/>
               <w:jc w:val="both"/>
               <w:rPr>
-                <w:rFonts w:hint="default"/>
-              </w:rPr>
-            </w:pPr>
-            <w:r>
-              <w:rPr>
                 <w:rFonts w:hint="default" w:ascii="Times New Roman" w:hAnsi="Times New Roman" w:eastAsia="Times New Roman" w:cs="Times New Roman"/>
                 <w:color w:val="000000"/>
                 <w:kern w:val="0"/>
@@ -20590,17 +20415,31 @@
                 <w:szCs w:val="24"/>
                 <w:lang w:val="en-US" w:eastAsia="zh-CN" w:bidi="ar"/>
               </w:rPr>
-              <w:t>1. Hệ thống xử lý ngoại lệ, không crash.</w:t>
-            </w:r>
-          </w:p>
-          <w:p>
-            <w:pPr>
-              <w:keepNext w:val="0"/>
-              <w:keepLines w:val="0"/>
-              <w:widowControl/>
+            </w:pPr>
+            <w:r>
+              <w:rPr>
+                <w:rFonts w:hint="default" w:ascii="Times New Roman" w:hAnsi="Times New Roman" w:eastAsia="Times New Roman" w:cs="Times New Roman"/>
+                <w:color w:val="000000"/>
+                <w:kern w:val="0"/>
+                <w:sz w:val="24"/>
+                <w:szCs w:val="24"/>
+                <w:lang w:val="en-US" w:eastAsia="zh-CN" w:bidi="ar"/>
+              </w:rPr>
+              <w:t>Hệ thống redirect về /movies?detailMessage=missing_id và hiển thị thông báo “Vui lòng chọn phim từ danh sách.”</w:t>
+            </w:r>
+          </w:p>
+          <w:p>
+            <w:pPr>
+              <w:keepNext w:val="0"/>
+              <w:keepLines w:val="0"/>
+              <w:widowControl/>
+              <w:numPr>
+                <w:ilvl w:val="0"/>
+                <w:numId w:val="0"/>
+              </w:numPr>
               <w:suppressLineNumbers w:val="0"/>
               <w:spacing w:before="20" w:beforeAutospacing="0" w:after="20" w:afterAutospacing="0" w:line="360" w:lineRule="auto"/>
-              <w:ind w:left="0" w:right="0"/>
+              <w:ind w:left="0" w:right="0" w:rightChars="0"/>
               <w:jc w:val="both"/>
               <w:rPr>
                 <w:rFonts w:hint="default"/>
@@ -20615,7 +20454,7 @@
                 <w:szCs w:val="24"/>
                 <w:lang w:val="en-US" w:eastAsia="zh-CN" w:bidi="ar"/>
               </w:rPr>
-              <w:t>2. Hệ thống redirect về trang danh sách phim (/movies).</w:t>
+              <w:t>2. Không hiển thị trang trắng hay lỗi server.</w:t>
             </w:r>
           </w:p>
           <w:p>
@@ -20640,7 +20479,7 @@
                 <w:szCs w:val="24"/>
                 <w:lang w:val="en-US" w:eastAsia="zh-CN" w:bidi="ar"/>
               </w:rPr>
-              <w:t>3. Không phát sinh HTTP 500 hiển thị ra người dùng.</w:t>
+              <w:t>3. Không phát sinh HTTP 500.</w:t>
             </w:r>
           </w:p>
         </w:tc>
@@ -20669,18 +20508,18 @@
           <w:lang w:val="en-US"/>
         </w:rPr>
       </w:pPr>
-      <w:bookmarkStart w:id="90" w:name="_Toc231414257"/>
-      <w:bookmarkStart w:id="91" w:name="_Toc20901"/>
-      <w:bookmarkStart w:id="92" w:name="_Toc28465"/>
-      <w:r>
-        <w:rPr>
-          <w:lang w:val="en-US"/>
-        </w:rPr>
-        <w:t>6.5. TC04-05: Phim không có trailer</w:t>
-      </w:r>
-      <w:bookmarkEnd w:id="90"/>
-      <w:bookmarkEnd w:id="91"/>
-      <w:bookmarkEnd w:id="92"/>
+      <w:bookmarkStart w:id="87" w:name="_Toc4233"/>
+      <w:bookmarkStart w:id="88" w:name="_Toc6276"/>
+      <w:bookmarkStart w:id="89" w:name="_Toc231414256"/>
+      <w:r>
+        <w:rPr>
+          <w:lang w:val="en-US"/>
+        </w:rPr>
+        <w:t>6.4. TC04-04: Tham số id không phải số</w:t>
+      </w:r>
+      <w:bookmarkEnd w:id="87"/>
+      <w:bookmarkEnd w:id="88"/>
+      <w:bookmarkEnd w:id="89"/>
     </w:p>
     <w:tbl>
       <w:tblPr>
@@ -20811,7 +20650,7 @@
                 <w:szCs w:val="24"/>
                 <w:lang w:val="en-US" w:eastAsia="zh-CN" w:bidi="ar"/>
               </w:rPr>
-              <w:t>TC04-05</w:t>
+              <w:t>TC04-04</w:t>
             </w:r>
           </w:p>
         </w:tc>
@@ -20919,140 +20758,7 @@
                 <w:szCs w:val="24"/>
                 <w:lang w:val="en-US" w:eastAsia="zh-CN" w:bidi="ar"/>
               </w:rPr>
-              <w:t>Xem chi tiết phim mà trường trailerUrl là null hoặc rỗng.</w:t>
-            </w:r>
-          </w:p>
-        </w:tc>
-      </w:tr>
-      <w:tr>
-        <w:tblPrEx>
-          <w:tblBorders>
-            <w:top w:val="single" w:color="auto" w:sz="4" w:space="0"/>
-            <w:left w:val="single" w:color="auto" w:sz="4" w:space="0"/>
-            <w:bottom w:val="single" w:color="auto" w:sz="4" w:space="0"/>
-            <w:right w:val="single" w:color="auto" w:sz="4" w:space="0"/>
-            <w:insideH w:val="single" w:color="auto" w:sz="4" w:space="0"/>
-            <w:insideV w:val="single" w:color="auto" w:sz="4" w:space="0"/>
-          </w:tblBorders>
-          <w:tblCellMar>
-            <w:top w:w="0" w:type="dxa"/>
-            <w:left w:w="10" w:type="dxa"/>
-            <w:bottom w:w="0" w:type="dxa"/>
-            <w:right w:w="10" w:type="dxa"/>
-          </w:tblCellMar>
-        </w:tblPrEx>
-        <w:tc>
-          <w:tcPr>
-            <w:tcW w:w="2000" w:type="dxa"/>
-            <w:tcBorders>
-              <w:top w:val="single" w:color="000000" w:sz="6" w:space="0"/>
-              <w:left w:val="single" w:color="000000" w:sz="6" w:space="0"/>
-              <w:bottom w:val="single" w:color="000000" w:sz="6" w:space="0"/>
-              <w:right w:val="single" w:color="000000" w:sz="6" w:space="0"/>
-            </w:tcBorders>
-            <w:shd w:val="clear" w:color="auto" w:fill="D9D9D9"/>
-            <w:tcMar>
-              <w:top w:w="80" w:type="dxa"/>
-              <w:left w:w="120" w:type="dxa"/>
-              <w:bottom w:w="80" w:type="dxa"/>
-              <w:right w:w="120" w:type="dxa"/>
-            </w:tcMar>
-            <w:vAlign w:val="center"/>
-          </w:tcPr>
-          <w:p>
-            <w:pPr>
-              <w:keepNext w:val="0"/>
-              <w:keepLines w:val="0"/>
-              <w:widowControl/>
-              <w:suppressLineNumbers w:val="0"/>
-              <w:spacing w:before="40" w:beforeAutospacing="0" w:after="40" w:afterAutospacing="0" w:line="360" w:lineRule="auto"/>
-              <w:ind w:left="0" w:right="0"/>
-              <w:jc w:val="left"/>
-              <w:rPr>
-                <w:rFonts w:hint="default"/>
-              </w:rPr>
-            </w:pPr>
-            <w:r>
-              <w:rPr>
-                <w:rFonts w:hint="default" w:ascii="Times New Roman" w:hAnsi="Times New Roman" w:eastAsia="Times New Roman" w:cs="Times New Roman"/>
-                <w:b/>
-                <w:bCs/>
-                <w:color w:val="auto"/>
-                <w:kern w:val="0"/>
-                <w:sz w:val="24"/>
-                <w:szCs w:val="24"/>
-                <w:lang w:val="en-US" w:eastAsia="zh-CN" w:bidi="ar"/>
-              </w:rPr>
-              <w:t>Tiền điều kiện</w:t>
-            </w:r>
-          </w:p>
-        </w:tc>
-        <w:tc>
-          <w:tcPr>
-            <w:tcW w:w="7026" w:type="dxa"/>
-            <w:tcBorders>
-              <w:top w:val="single" w:color="000000" w:sz="6" w:space="0"/>
-              <w:left w:val="single" w:color="000000" w:sz="6" w:space="0"/>
-              <w:bottom w:val="single" w:color="000000" w:sz="6" w:space="0"/>
-              <w:right w:val="single" w:color="000000" w:sz="6" w:space="0"/>
-            </w:tcBorders>
-            <w:shd w:val="clear" w:color="auto" w:fill="auto"/>
-            <w:tcMar>
-              <w:top w:w="80" w:type="dxa"/>
-              <w:left w:w="120" w:type="dxa"/>
-              <w:bottom w:w="80" w:type="dxa"/>
-              <w:right w:w="120" w:type="dxa"/>
-            </w:tcMar>
-            <w:vAlign w:val="center"/>
-          </w:tcPr>
-          <w:p>
-            <w:pPr>
-              <w:keepNext w:val="0"/>
-              <w:keepLines w:val="0"/>
-              <w:widowControl/>
-              <w:suppressLineNumbers w:val="0"/>
-              <w:spacing w:before="20" w:beforeAutospacing="0" w:after="20" w:afterAutospacing="0" w:line="360" w:lineRule="auto"/>
-              <w:ind w:left="0" w:right="0"/>
-              <w:jc w:val="both"/>
-              <w:rPr>
-                <w:rFonts w:hint="default"/>
-              </w:rPr>
-            </w:pPr>
-            <w:r>
-              <w:rPr>
-                <w:rFonts w:hint="default" w:ascii="Times New Roman" w:hAnsi="Times New Roman" w:eastAsia="Times New Roman" w:cs="Times New Roman"/>
-                <w:color w:val="000000"/>
-                <w:kern w:val="0"/>
-                <w:sz w:val="24"/>
-                <w:szCs w:val="24"/>
-                <w:lang w:val="en-US" w:eastAsia="zh-CN" w:bidi="ar"/>
-              </w:rPr>
-              <w:t>1. Hệ thống đang hoạt động bình thường.</w:t>
-            </w:r>
-          </w:p>
-          <w:p>
-            <w:pPr>
-              <w:keepNext w:val="0"/>
-              <w:keepLines w:val="0"/>
-              <w:widowControl/>
-              <w:suppressLineNumbers w:val="0"/>
-              <w:spacing w:before="20" w:beforeAutospacing="0" w:after="20" w:afterAutospacing="0" w:line="360" w:lineRule="auto"/>
-              <w:ind w:left="0" w:right="0"/>
-              <w:jc w:val="both"/>
-              <w:rPr>
-                <w:rFonts w:hint="default"/>
-              </w:rPr>
-            </w:pPr>
-            <w:r>
-              <w:rPr>
-                <w:rFonts w:hint="default" w:ascii="Times New Roman" w:hAnsi="Times New Roman" w:eastAsia="Times New Roman" w:cs="Times New Roman"/>
-                <w:color w:val="000000"/>
-                <w:kern w:val="0"/>
-                <w:sz w:val="24"/>
-                <w:szCs w:val="24"/>
-                <w:lang w:val="en-US" w:eastAsia="zh-CN" w:bidi="ar"/>
-              </w:rPr>
-              <w:t>2. Phim có id = 5 tồn tại nhưng trường trailerUrl trong database là NULL.</w:t>
+              <w:t>Truy cập trang chi tiết phim với id là chuỗi ký tự không hợp lệ.</w:t>
             </w:r>
           </w:p>
         </w:tc>
@@ -21117,7 +20823,7 @@
                 <w:szCs w:val="24"/>
                 <w:lang w:val="en-US" w:eastAsia="zh-CN" w:bidi="ar"/>
               </w:rPr>
-              <w:t>Các bước thực hiện</w:t>
+              <w:t>Tiền điều kiện</w:t>
             </w:r>
           </w:p>
         </w:tc>
@@ -21161,82 +20867,7 @@
                 <w:szCs w:val="24"/>
                 <w:lang w:val="en-US" w:eastAsia="zh-CN" w:bidi="ar"/>
               </w:rPr>
-              <w:t>1. Mở trình duyệt, truy cập URL: /movie-detail?id=5.</w:t>
-            </w:r>
-          </w:p>
-          <w:p>
-            <w:pPr>
-              <w:keepNext w:val="0"/>
-              <w:keepLines w:val="0"/>
-              <w:widowControl/>
-              <w:suppressLineNumbers w:val="0"/>
-              <w:spacing w:before="20" w:beforeAutospacing="0" w:after="20" w:afterAutospacing="0" w:line="360" w:lineRule="auto"/>
-              <w:ind w:left="0" w:right="0"/>
-              <w:jc w:val="both"/>
-              <w:rPr>
-                <w:rFonts w:hint="default"/>
-              </w:rPr>
-            </w:pPr>
-            <w:r>
-              <w:rPr>
-                <w:rFonts w:hint="default" w:ascii="Times New Roman" w:hAnsi="Times New Roman" w:eastAsia="Times New Roman" w:cs="Times New Roman"/>
-                <w:color w:val="000000"/>
-                <w:kern w:val="0"/>
-                <w:sz w:val="24"/>
-                <w:szCs w:val="24"/>
-                <w:lang w:val="en-US" w:eastAsia="zh-CN" w:bidi="ar"/>
-              </w:rPr>
-              <w:t>2. Hệ thống truy vấn và lấy được đối tượng Movie với trailerUrl = null.</w:t>
-            </w:r>
-          </w:p>
-          <w:p>
-            <w:pPr>
-              <w:keepNext w:val="0"/>
-              <w:keepLines w:val="0"/>
-              <w:widowControl/>
-              <w:suppressLineNumbers w:val="0"/>
-              <w:spacing w:before="20" w:beforeAutospacing="0" w:after="20" w:afterAutospacing="0" w:line="360" w:lineRule="auto"/>
-              <w:ind w:left="0" w:right="0"/>
-              <w:jc w:val="both"/>
-              <w:rPr>
-                <w:rFonts w:hint="default"/>
-              </w:rPr>
-            </w:pPr>
-            <w:r>
-              <w:rPr>
-                <w:rFonts w:hint="default" w:ascii="Times New Roman" w:hAnsi="Times New Roman" w:eastAsia="Times New Roman" w:cs="Times New Roman"/>
-                <w:color w:val="000000"/>
-                <w:kern w:val="0"/>
-                <w:sz w:val="24"/>
-                <w:szCs w:val="24"/>
-                <w:lang w:val="en-US" w:eastAsia="zh-CN" w:bidi="ar"/>
-              </w:rPr>
-              <w:t>3. MovieController forward sang movie-detail.jsp.</w:t>
-            </w:r>
-          </w:p>
-          <w:p>
-            <w:pPr>
-              <w:keepNext w:val="0"/>
-              <w:keepLines w:val="0"/>
-              <w:widowControl/>
-              <w:suppressLineNumbers w:val="0"/>
-              <w:spacing w:before="20" w:beforeAutospacing="0" w:after="20" w:afterAutospacing="0" w:line="360" w:lineRule="auto"/>
-              <w:ind w:left="0" w:right="0"/>
-              <w:jc w:val="both"/>
-              <w:rPr>
-                <w:rFonts w:hint="default"/>
-              </w:rPr>
-            </w:pPr>
-            <w:r>
-              <w:rPr>
-                <w:rFonts w:hint="default" w:ascii="Times New Roman" w:hAnsi="Times New Roman" w:eastAsia="Times New Roman" w:cs="Times New Roman"/>
-                <w:color w:val="000000"/>
-                <w:kern w:val="0"/>
-                <w:sz w:val="24"/>
-                <w:szCs w:val="24"/>
-                <w:lang w:val="en-US" w:eastAsia="zh-CN" w:bidi="ar"/>
-              </w:rPr>
-              <w:t>4. JSP kiểm tra: &lt;c:if test="${not empty movie.trailerUrl}"&gt;.</w:t>
+              <w:t>1. Hệ thống đang hoạt động bình thường.</w:t>
             </w:r>
           </w:p>
         </w:tc>
@@ -21301,7 +20932,7 @@
                 <w:szCs w:val="24"/>
                 <w:lang w:val="en-US" w:eastAsia="zh-CN" w:bidi="ar"/>
               </w:rPr>
-              <w:t>Kết quả mong đợi</w:t>
+              <w:t>Các bước thực hiện</w:t>
             </w:r>
           </w:p>
         </w:tc>
@@ -21345,7 +20976,7 @@
                 <w:szCs w:val="24"/>
                 <w:lang w:val="en-US" w:eastAsia="zh-CN" w:bidi="ar"/>
               </w:rPr>
-              <w:t>1. Trang chi tiết phim hiển thị thành công.</w:t>
+              <w:t>1. Mở trình duyệt, truy cập URL: /movie-detail?id=abc.</w:t>
             </w:r>
           </w:p>
           <w:p>
@@ -21370,7 +21001,7 @@
                 <w:szCs w:val="24"/>
                 <w:lang w:val="en-US" w:eastAsia="zh-CN" w:bidi="ar"/>
               </w:rPr>
-              <w:t>2. Nút "Trailer" bị ẩn hoàn toàn (không render ra HTML).</w:t>
+              <w:t>2. MovieController nhận idRaw = "abc".</w:t>
             </w:r>
           </w:p>
           <w:p>
@@ -21395,9 +21026,92 @@
                 <w:szCs w:val="24"/>
                 <w:lang w:val="en-US" w:eastAsia="zh-CN" w:bidi="ar"/>
               </w:rPr>
-              <w:t>3. Tất cả thông tin khác (tên, mô tả, poster, thể loại...) vẫn hiển thị bình thường.</w:t>
-            </w:r>
-          </w:p>
+              <w:t>3. Controller thực hiện Integer.parseInt("abc"), phát sinh NumberFormatException.</w:t>
+            </w:r>
+          </w:p>
+        </w:tc>
+      </w:tr>
+      <w:tr>
+        <w:tblPrEx>
+          <w:tblBorders>
+            <w:top w:val="single" w:color="auto" w:sz="4" w:space="0"/>
+            <w:left w:val="single" w:color="auto" w:sz="4" w:space="0"/>
+            <w:bottom w:val="single" w:color="auto" w:sz="4" w:space="0"/>
+            <w:right w:val="single" w:color="auto" w:sz="4" w:space="0"/>
+            <w:insideH w:val="single" w:color="auto" w:sz="4" w:space="0"/>
+            <w:insideV w:val="single" w:color="auto" w:sz="4" w:space="0"/>
+          </w:tblBorders>
+          <w:tblCellMar>
+            <w:top w:w="0" w:type="dxa"/>
+            <w:left w:w="10" w:type="dxa"/>
+            <w:bottom w:w="0" w:type="dxa"/>
+            <w:right w:w="10" w:type="dxa"/>
+          </w:tblCellMar>
+        </w:tblPrEx>
+        <w:tc>
+          <w:tcPr>
+            <w:tcW w:w="2000" w:type="dxa"/>
+            <w:tcBorders>
+              <w:top w:val="single" w:color="000000" w:sz="6" w:space="0"/>
+              <w:left w:val="single" w:color="000000" w:sz="6" w:space="0"/>
+              <w:bottom w:val="single" w:color="000000" w:sz="6" w:space="0"/>
+              <w:right w:val="single" w:color="000000" w:sz="6" w:space="0"/>
+            </w:tcBorders>
+            <w:shd w:val="clear" w:color="auto" w:fill="D9D9D9"/>
+            <w:tcMar>
+              <w:top w:w="80" w:type="dxa"/>
+              <w:left w:w="120" w:type="dxa"/>
+              <w:bottom w:w="80" w:type="dxa"/>
+              <w:right w:w="120" w:type="dxa"/>
+            </w:tcMar>
+            <w:vAlign w:val="center"/>
+          </w:tcPr>
+          <w:p>
+            <w:pPr>
+              <w:keepNext w:val="0"/>
+              <w:keepLines w:val="0"/>
+              <w:widowControl/>
+              <w:suppressLineNumbers w:val="0"/>
+              <w:spacing w:before="40" w:beforeAutospacing="0" w:after="40" w:afterAutospacing="0" w:line="360" w:lineRule="auto"/>
+              <w:ind w:left="0" w:right="0"/>
+              <w:jc w:val="left"/>
+              <w:rPr>
+                <w:rFonts w:hint="default"/>
+              </w:rPr>
+            </w:pPr>
+            <w:r>
+              <w:rPr>
+                <w:rFonts w:hint="default" w:ascii="Times New Roman" w:hAnsi="Times New Roman" w:eastAsia="Times New Roman" w:cs="Times New Roman"/>
+                <w:b/>
+                <w:bCs/>
+                <w:color w:val="auto"/>
+                <w:kern w:val="0"/>
+                <w:sz w:val="24"/>
+                <w:szCs w:val="24"/>
+                <w:lang w:val="en-US" w:eastAsia="zh-CN" w:bidi="ar"/>
+              </w:rPr>
+              <w:t>Kết quả mong đợi</w:t>
+            </w:r>
+          </w:p>
+        </w:tc>
+        <w:tc>
+          <w:tcPr>
+            <w:tcW w:w="7026" w:type="dxa"/>
+            <w:tcBorders>
+              <w:top w:val="single" w:color="000000" w:sz="6" w:space="0"/>
+              <w:left w:val="single" w:color="000000" w:sz="6" w:space="0"/>
+              <w:bottom w:val="single" w:color="000000" w:sz="6" w:space="0"/>
+              <w:right w:val="single" w:color="000000" w:sz="6" w:space="0"/>
+            </w:tcBorders>
+            <w:shd w:val="clear" w:color="auto" w:fill="auto"/>
+            <w:tcMar>
+              <w:top w:w="80" w:type="dxa"/>
+              <w:left w:w="120" w:type="dxa"/>
+              <w:bottom w:w="80" w:type="dxa"/>
+              <w:right w:w="120" w:type="dxa"/>
+            </w:tcMar>
+            <w:vAlign w:val="center"/>
+          </w:tcPr>
           <w:p>
             <w:pPr>
               <w:keepNext w:val="0"/>
@@ -21420,7 +21134,57 @@
                 <w:szCs w:val="24"/>
                 <w:lang w:val="en-US" w:eastAsia="zh-CN" w:bidi="ar"/>
               </w:rPr>
-              <w:t>4. Nút "Xem lịch chiếu" và "Quay lại" vẫn hoạt động.</w:t>
+              <w:t>1. Hệ thống xử lý ngoại lệ, không crash.</w:t>
+            </w:r>
+          </w:p>
+          <w:p>
+            <w:pPr>
+              <w:keepNext w:val="0"/>
+              <w:keepLines w:val="0"/>
+              <w:widowControl/>
+              <w:suppressLineNumbers w:val="0"/>
+              <w:spacing w:before="20" w:beforeAutospacing="0" w:after="20" w:afterAutospacing="0" w:line="360" w:lineRule="auto"/>
+              <w:ind w:left="0" w:right="0"/>
+              <w:jc w:val="both"/>
+              <w:rPr>
+                <w:rFonts w:hint="default"/>
+              </w:rPr>
+            </w:pPr>
+            <w:r>
+              <w:rPr>
+                <w:rFonts w:hint="default" w:ascii="Times New Roman" w:hAnsi="Times New Roman" w:eastAsia="Times New Roman" w:cs="Times New Roman"/>
+                <w:color w:val="000000"/>
+                <w:kern w:val="0"/>
+                <w:sz w:val="24"/>
+                <w:szCs w:val="24"/>
+                <w:lang w:val="en-US" w:eastAsia="zh-CN" w:bidi="ar"/>
+              </w:rPr>
+              <w:t>2. Hệ thống redirect về trang danh sách phim (/movies).</w:t>
+            </w:r>
+          </w:p>
+          <w:p>
+            <w:pPr>
+              <w:keepNext w:val="0"/>
+              <w:keepLines w:val="0"/>
+              <w:widowControl/>
+              <w:suppressLineNumbers w:val="0"/>
+              <w:spacing w:before="20" w:beforeAutospacing="0" w:after="20" w:afterAutospacing="0" w:line="360" w:lineRule="auto"/>
+              <w:ind w:left="0" w:right="0"/>
+              <w:jc w:val="both"/>
+              <w:rPr>
+                <w:rFonts w:hint="default"/>
+              </w:rPr>
+            </w:pPr>
+            <w:r>
+              <w:rPr>
+                <w:rFonts w:hint="default" w:ascii="Times New Roman" w:hAnsi="Times New Roman" w:eastAsia="Times New Roman" w:cs="Times New Roman"/>
+                <w:color w:val="000000"/>
+                <w:kern w:val="0"/>
+                <w:sz w:val="24"/>
+                <w:szCs w:val="24"/>
+                <w:lang w:val="en-US" w:eastAsia="zh-CN" w:bidi="ar"/>
+              </w:rPr>
+              <w:t>3. Không phát sinh HTTP 500 hiển thị ra người dùng.</w:t>
             </w:r>
           </w:p>
         </w:tc>
@@ -21449,18 +21213,18 @@
           <w:lang w:val="en-US"/>
         </w:rPr>
       </w:pPr>
-      <w:bookmarkStart w:id="93" w:name="_Toc26934"/>
-      <w:bookmarkStart w:id="94" w:name="_Toc231414258"/>
-      <w:bookmarkStart w:id="95" w:name="_Toc1156"/>
-      <w:r>
-        <w:rPr>
-          <w:lang w:val="en-US"/>
-        </w:rPr>
-        <w:t>6.6. TC04-06: Phim không có poster</w:t>
-      </w:r>
-      <w:bookmarkEnd w:id="93"/>
-      <w:bookmarkEnd w:id="94"/>
-      <w:bookmarkEnd w:id="95"/>
+      <w:bookmarkStart w:id="90" w:name="_Toc231414257"/>
+      <w:bookmarkStart w:id="91" w:name="_Toc28465"/>
+      <w:bookmarkStart w:id="92" w:name="_Toc20901"/>
+      <w:r>
+        <w:rPr>
+          <w:lang w:val="en-US"/>
+        </w:rPr>
+        <w:t>6.5. TC04-05: Phim không có trailer</w:t>
+      </w:r>
+      <w:bookmarkEnd w:id="90"/>
+      <w:bookmarkEnd w:id="91"/>
+      <w:bookmarkEnd w:id="92"/>
     </w:p>
     <w:tbl>
       <w:tblPr>
@@ -21591,7 +21355,114 @@
                 <w:szCs w:val="24"/>
                 <w:lang w:val="en-US" w:eastAsia="zh-CN" w:bidi="ar"/>
               </w:rPr>
-              <w:t>TC04-06</w:t>
+              <w:t>TC04-05</w:t>
+            </w:r>
+          </w:p>
+        </w:tc>
+      </w:tr>
+      <w:tr>
+        <w:tblPrEx>
+          <w:tblBorders>
+            <w:top w:val="single" w:color="auto" w:sz="4" w:space="0"/>
+            <w:left w:val="single" w:color="auto" w:sz="4" w:space="0"/>
+            <w:bottom w:val="single" w:color="auto" w:sz="4" w:space="0"/>
+            <w:right w:val="single" w:color="auto" w:sz="4" w:space="0"/>
+            <w:insideH w:val="single" w:color="auto" w:sz="4" w:space="0"/>
+            <w:insideV w:val="single" w:color="auto" w:sz="4" w:space="0"/>
+          </w:tblBorders>
+          <w:tblCellMar>
+            <w:top w:w="0" w:type="dxa"/>
+            <w:left w:w="10" w:type="dxa"/>
+            <w:bottom w:w="0" w:type="dxa"/>
+            <w:right w:w="10" w:type="dxa"/>
+          </w:tblCellMar>
+        </w:tblPrEx>
+        <w:tc>
+          <w:tcPr>
+            <w:tcW w:w="2000" w:type="dxa"/>
+            <w:tcBorders>
+              <w:top w:val="single" w:color="000000" w:sz="6" w:space="0"/>
+              <w:left w:val="single" w:color="000000" w:sz="6" w:space="0"/>
+              <w:bottom w:val="single" w:color="000000" w:sz="6" w:space="0"/>
+              <w:right w:val="single" w:color="000000" w:sz="6" w:space="0"/>
+            </w:tcBorders>
+            <w:shd w:val="clear" w:color="auto" w:fill="D9D9D9"/>
+            <w:tcMar>
+              <w:top w:w="80" w:type="dxa"/>
+              <w:left w:w="120" w:type="dxa"/>
+              <w:bottom w:w="80" w:type="dxa"/>
+              <w:right w:w="120" w:type="dxa"/>
+            </w:tcMar>
+            <w:vAlign w:val="center"/>
+          </w:tcPr>
+          <w:p>
+            <w:pPr>
+              <w:keepNext w:val="0"/>
+              <w:keepLines w:val="0"/>
+              <w:widowControl/>
+              <w:suppressLineNumbers w:val="0"/>
+              <w:spacing w:before="40" w:beforeAutospacing="0" w:after="40" w:afterAutospacing="0" w:line="360" w:lineRule="auto"/>
+              <w:ind w:left="0" w:right="0"/>
+              <w:jc w:val="left"/>
+              <w:rPr>
+                <w:rFonts w:hint="default"/>
+              </w:rPr>
+            </w:pPr>
+            <w:r>
+              <w:rPr>
+                <w:rFonts w:hint="default" w:ascii="Times New Roman" w:hAnsi="Times New Roman" w:eastAsia="Times New Roman" w:cs="Times New Roman"/>
+                <w:b/>
+                <w:bCs/>
+                <w:color w:val="auto"/>
+                <w:kern w:val="0"/>
+                <w:sz w:val="24"/>
+                <w:szCs w:val="24"/>
+                <w:lang w:val="en-US" w:eastAsia="zh-CN" w:bidi="ar"/>
+              </w:rPr>
+              <w:t>Mô tả</w:t>
+            </w:r>
+          </w:p>
+        </w:tc>
+        <w:tc>
+          <w:tcPr>
+            <w:tcW w:w="7026" w:type="dxa"/>
+            <w:tcBorders>
+              <w:top w:val="single" w:color="000000" w:sz="6" w:space="0"/>
+              <w:left w:val="single" w:color="000000" w:sz="6" w:space="0"/>
+              <w:bottom w:val="single" w:color="000000" w:sz="6" w:space="0"/>
+              <w:right w:val="single" w:color="000000" w:sz="6" w:space="0"/>
+            </w:tcBorders>
+            <w:shd w:val="clear" w:color="auto" w:fill="auto"/>
+            <w:tcMar>
+              <w:top w:w="80" w:type="dxa"/>
+              <w:left w:w="120" w:type="dxa"/>
+              <w:bottom w:w="80" w:type="dxa"/>
+              <w:right w:w="120" w:type="dxa"/>
+            </w:tcMar>
+            <w:vAlign w:val="center"/>
+          </w:tcPr>
+          <w:p>
+            <w:pPr>
+              <w:keepNext w:val="0"/>
+              <w:keepLines w:val="0"/>
+              <w:widowControl/>
+              <w:suppressLineNumbers w:val="0"/>
+              <w:spacing w:before="40" w:beforeAutospacing="0" w:after="40" w:afterAutospacing="0" w:line="360" w:lineRule="auto"/>
+              <w:ind w:left="0" w:right="0"/>
+              <w:jc w:val="left"/>
+              <w:rPr>
+                <w:rFonts w:hint="default"/>
+              </w:rPr>
+            </w:pPr>
+            <w:r>
+              <w:rPr>
+                <w:rFonts w:hint="default" w:ascii="Times New Roman" w:hAnsi="Times New Roman" w:eastAsia="Times New Roman" w:cs="Times New Roman"/>
+                <w:kern w:val="0"/>
+                <w:sz w:val="24"/>
+                <w:szCs w:val="24"/>
+                <w:lang w:val="en-US" w:eastAsia="zh-CN" w:bidi="ar"/>
+              </w:rPr>
+              <w:t>Xem chi tiết phim mà trường trailerUrl là null hoặc rỗng.</w:t>
             </w:r>
           </w:p>
         </w:tc>
@@ -21656,7 +21527,7 @@
                 <w:szCs w:val="24"/>
                 <w:lang w:val="en-US" w:eastAsia="zh-CN" w:bidi="ar"/>
               </w:rPr>
-              <w:t>Mô tả</w:t>
+              <w:t>Tiền điều kiện</w:t>
             </w:r>
           </w:p>
         </w:tc>
@@ -21684,22 +21555,48 @@
               <w:keepLines w:val="0"/>
               <w:widowControl/>
               <w:suppressLineNumbers w:val="0"/>
-              <w:spacing w:before="40" w:beforeAutospacing="0" w:after="40" w:afterAutospacing="0" w:line="360" w:lineRule="auto"/>
-              <w:ind w:left="0" w:right="0"/>
-              <w:jc w:val="left"/>
-              <w:rPr>
-                <w:rFonts w:hint="default"/>
-              </w:rPr>
-            </w:pPr>
-            <w:r>
-              <w:rPr>
-                <w:rFonts w:hint="default" w:ascii="Times New Roman" w:hAnsi="Times New Roman" w:eastAsia="Times New Roman" w:cs="Times New Roman"/>
-                <w:kern w:val="0"/>
-                <w:sz w:val="24"/>
-                <w:szCs w:val="24"/>
-                <w:lang w:val="en-US" w:eastAsia="zh-CN" w:bidi="ar"/>
-              </w:rPr>
-              <w:t>Xem chi tiết phim mà trường posterUrl là null hoặc rỗng.</w:t>
+              <w:spacing w:before="20" w:beforeAutospacing="0" w:after="20" w:afterAutospacing="0" w:line="360" w:lineRule="auto"/>
+              <w:ind w:left="0" w:right="0"/>
+              <w:jc w:val="both"/>
+              <w:rPr>
+                <w:rFonts w:hint="default"/>
+              </w:rPr>
+            </w:pPr>
+            <w:r>
+              <w:rPr>
+                <w:rFonts w:hint="default" w:ascii="Times New Roman" w:hAnsi="Times New Roman" w:eastAsia="Times New Roman" w:cs="Times New Roman"/>
+                <w:color w:val="000000"/>
+                <w:kern w:val="0"/>
+                <w:sz w:val="24"/>
+                <w:szCs w:val="24"/>
+                <w:lang w:val="en-US" w:eastAsia="zh-CN" w:bidi="ar"/>
+              </w:rPr>
+              <w:t>1. Hệ thống đang hoạt động bình thường.</w:t>
+            </w:r>
+          </w:p>
+          <w:p>
+            <w:pPr>
+              <w:keepNext w:val="0"/>
+              <w:keepLines w:val="0"/>
+              <w:widowControl/>
+              <w:suppressLineNumbers w:val="0"/>
+              <w:spacing w:before="20" w:beforeAutospacing="0" w:after="20" w:afterAutospacing="0" w:line="360" w:lineRule="auto"/>
+              <w:ind w:left="0" w:right="0"/>
+              <w:jc w:val="both"/>
+              <w:rPr>
+                <w:rFonts w:hint="default"/>
+              </w:rPr>
+            </w:pPr>
+            <w:r>
+              <w:rPr>
+                <w:rFonts w:hint="default" w:ascii="Times New Roman" w:hAnsi="Times New Roman" w:eastAsia="Times New Roman" w:cs="Times New Roman"/>
+                <w:color w:val="000000"/>
+                <w:kern w:val="0"/>
+                <w:sz w:val="24"/>
+                <w:szCs w:val="24"/>
+                <w:lang w:val="en-US" w:eastAsia="zh-CN" w:bidi="ar"/>
+              </w:rPr>
+              <w:t>2. Phim có id = 5 tồn tại nhưng trường trailerUrl trong database là NULL.</w:t>
             </w:r>
           </w:p>
         </w:tc>
@@ -21764,7 +21661,7 @@
                 <w:szCs w:val="24"/>
                 <w:lang w:val="en-US" w:eastAsia="zh-CN" w:bidi="ar"/>
               </w:rPr>
-              <w:t>Tiền điều kiện</w:t>
+              <w:t>Các bước thực hiện</w:t>
             </w:r>
           </w:p>
         </w:tc>
@@ -21808,7 +21705,7 @@
                 <w:szCs w:val="24"/>
                 <w:lang w:val="en-US" w:eastAsia="zh-CN" w:bidi="ar"/>
               </w:rPr>
-              <w:t>1. Hệ thống đang hoạt động bình thường.</w:t>
+              <w:t>1. Mở trình duyệt, truy cập URL: /movie-detail?id=5.</w:t>
             </w:r>
           </w:p>
           <w:p>
@@ -21833,7 +21730,57 @@
                 <w:szCs w:val="24"/>
                 <w:lang w:val="en-US" w:eastAsia="zh-CN" w:bidi="ar"/>
               </w:rPr>
-              <w:t>2. Phim tồn tại nhưng trường posterUrl trong database là NULL.</w:t>
+              <w:t>2. Hệ thống truy vấn và lấy được đối tượng Movie với trailerUrl = null.</w:t>
+            </w:r>
+          </w:p>
+          <w:p>
+            <w:pPr>
+              <w:keepNext w:val="0"/>
+              <w:keepLines w:val="0"/>
+              <w:widowControl/>
+              <w:suppressLineNumbers w:val="0"/>
+              <w:spacing w:before="20" w:beforeAutospacing="0" w:after="20" w:afterAutospacing="0" w:line="360" w:lineRule="auto"/>
+              <w:ind w:left="0" w:right="0"/>
+              <w:jc w:val="both"/>
+              <w:rPr>
+                <w:rFonts w:hint="default"/>
+              </w:rPr>
+            </w:pPr>
+            <w:r>
+              <w:rPr>
+                <w:rFonts w:hint="default" w:ascii="Times New Roman" w:hAnsi="Times New Roman" w:eastAsia="Times New Roman" w:cs="Times New Roman"/>
+                <w:color w:val="000000"/>
+                <w:kern w:val="0"/>
+                <w:sz w:val="24"/>
+                <w:szCs w:val="24"/>
+                <w:lang w:val="en-US" w:eastAsia="zh-CN" w:bidi="ar"/>
+              </w:rPr>
+              <w:t>3. MovieController forward sang movie-detail.jsp.</w:t>
+            </w:r>
+          </w:p>
+          <w:p>
+            <w:pPr>
+              <w:keepNext w:val="0"/>
+              <w:keepLines w:val="0"/>
+              <w:widowControl/>
+              <w:suppressLineNumbers w:val="0"/>
+              <w:spacing w:before="20" w:beforeAutospacing="0" w:after="20" w:afterAutospacing="0" w:line="360" w:lineRule="auto"/>
+              <w:ind w:left="0" w:right="0"/>
+              <w:jc w:val="both"/>
+              <w:rPr>
+                <w:rFonts w:hint="default"/>
+              </w:rPr>
+            </w:pPr>
+            <w:r>
+              <w:rPr>
+                <w:rFonts w:hint="default" w:ascii="Times New Roman" w:hAnsi="Times New Roman" w:eastAsia="Times New Roman" w:cs="Times New Roman"/>
+                <w:color w:val="000000"/>
+                <w:kern w:val="0"/>
+                <w:sz w:val="24"/>
+                <w:szCs w:val="24"/>
+                <w:lang w:val="en-US" w:eastAsia="zh-CN" w:bidi="ar"/>
+              </w:rPr>
+              <w:t>4. JSP kiểm tra: &lt;c:if test="${not empty movie.trailerUrl}"&gt;.</w:t>
             </w:r>
           </w:p>
         </w:tc>
@@ -21898,7 +21845,7 @@
                 <w:szCs w:val="24"/>
                 <w:lang w:val="en-US" w:eastAsia="zh-CN" w:bidi="ar"/>
               </w:rPr>
-              <w:t>Các bước thực hiện</w:t>
+              <w:t>Kết quả mong đợi</w:t>
             </w:r>
           </w:p>
         </w:tc>
@@ -21942,7 +21889,7 @@
                 <w:szCs w:val="24"/>
                 <w:lang w:val="en-US" w:eastAsia="zh-CN" w:bidi="ar"/>
               </w:rPr>
-              <w:t>1. Truy cập trang chi tiết phim của bộ phim không có poster.</w:t>
+              <w:t>1. Trang chi tiết phim hiển thị thành công.</w:t>
             </w:r>
           </w:p>
           <w:p>
@@ -21967,7 +21914,7 @@
                 <w:szCs w:val="24"/>
                 <w:lang w:val="en-US" w:eastAsia="zh-CN" w:bidi="ar"/>
               </w:rPr>
-              <w:t>2. JSP kiểm tra: &lt;c:choose&gt; → &lt;c:when test="${not empty movie.posterUrl}"&gt; thất bại.</w:t>
+              <w:t>2. Nút "Trailer" bị ẩn hoàn toàn (không render ra HTML).</w:t>
             </w:r>
           </w:p>
           <w:p>
@@ -21992,7 +21939,202 @@
                 <w:szCs w:val="24"/>
                 <w:lang w:val="en-US" w:eastAsia="zh-CN" w:bidi="ar"/>
               </w:rPr>
-              <w:t>3. JSP vào nhánh &lt;c:otherwise&gt;.</w:t>
+              <w:t>3. Tất cả thông tin khác (tên, mô tả, poster, thể loại...) vẫn hiển thị bình thường.</w:t>
+            </w:r>
+          </w:p>
+          <w:p>
+            <w:pPr>
+              <w:keepNext w:val="0"/>
+              <w:keepLines w:val="0"/>
+              <w:widowControl/>
+              <w:suppressLineNumbers w:val="0"/>
+              <w:spacing w:before="20" w:beforeAutospacing="0" w:after="20" w:afterAutospacing="0" w:line="360" w:lineRule="auto"/>
+              <w:ind w:left="0" w:right="0"/>
+              <w:jc w:val="both"/>
+              <w:rPr>
+                <w:rFonts w:hint="default"/>
+              </w:rPr>
+            </w:pPr>
+            <w:r>
+              <w:rPr>
+                <w:rFonts w:hint="default" w:ascii="Times New Roman" w:hAnsi="Times New Roman" w:eastAsia="Times New Roman" w:cs="Times New Roman"/>
+                <w:color w:val="000000"/>
+                <w:kern w:val="0"/>
+                <w:sz w:val="24"/>
+                <w:szCs w:val="24"/>
+                <w:lang w:val="en-US" w:eastAsia="zh-CN" w:bidi="ar"/>
+              </w:rPr>
+              <w:t>4. Nút "Xem lịch chiếu" và "Quay lại" vẫn hoạt động.</w:t>
+            </w:r>
+          </w:p>
+        </w:tc>
+      </w:tr>
+    </w:tbl>
+    <w:p>
+      <w:pPr>
+        <w:keepNext w:val="0"/>
+        <w:keepLines w:val="0"/>
+        <w:widowControl/>
+        <w:suppressLineNumbers w:val="0"/>
+        <w:spacing w:before="0" w:beforeAutospacing="0" w:after="0" w:afterAutospacing="0" w:line="360" w:lineRule="auto"/>
+        <w:ind w:left="0" w:right="0"/>
+        <w:jc w:val="left"/>
+        <w:rPr>
+          <w:lang w:val="en-US"/>
+        </w:rPr>
+      </w:pPr>
+    </w:p>
+    <w:p>
+      <w:pPr>
+        <w:pStyle w:val="3"/>
+        <w:widowControl/>
+        <w:spacing w:line="360" w:lineRule="auto"/>
+        <w:rPr>
+          <w:lang w:val="en-US"/>
+        </w:rPr>
+      </w:pPr>
+      <w:bookmarkStart w:id="93" w:name="_Toc1156"/>
+      <w:bookmarkStart w:id="94" w:name="_Toc231414258"/>
+      <w:bookmarkStart w:id="95" w:name="_Toc26934"/>
+      <w:r>
+        <w:rPr>
+          <w:lang w:val="en-US"/>
+        </w:rPr>
+        <w:t>6.6. TC04-06: Phim không có poster</w:t>
+      </w:r>
+      <w:bookmarkEnd w:id="93"/>
+      <w:bookmarkEnd w:id="94"/>
+      <w:bookmarkEnd w:id="95"/>
+    </w:p>
+    <w:tbl>
+      <w:tblPr>
+        <w:tblStyle w:val="9"/>
+        <w:tblW w:w="9026" w:type="dxa"/>
+        <w:tblInd w:w="0" w:type="dxa"/>
+        <w:tblBorders>
+          <w:top w:val="single" w:color="auto" w:sz="4" w:space="0"/>
+          <w:left w:val="single" w:color="auto" w:sz="4" w:space="0"/>
+          <w:bottom w:val="single" w:color="auto" w:sz="4" w:space="0"/>
+          <w:right w:val="single" w:color="auto" w:sz="4" w:space="0"/>
+          <w:insideH w:val="single" w:color="auto" w:sz="4" w:space="0"/>
+          <w:insideV w:val="single" w:color="auto" w:sz="4" w:space="0"/>
+        </w:tblBorders>
+        <w:shd w:val="clear" w:color="auto" w:fill="auto"/>
+        <w:tblLayout w:type="autofit"/>
+        <w:tblCellMar>
+          <w:top w:w="0" w:type="dxa"/>
+          <w:left w:w="10" w:type="dxa"/>
+          <w:bottom w:w="0" w:type="dxa"/>
+          <w:right w:w="10" w:type="dxa"/>
+        </w:tblCellMar>
+      </w:tblPr>
+      <w:tblGrid>
+        <w:gridCol w:w="2000"/>
+        <w:gridCol w:w="7026"/>
+      </w:tblGrid>
+      <w:tr>
+        <w:tblPrEx>
+          <w:tblBorders>
+            <w:top w:val="single" w:color="auto" w:sz="4" w:space="0"/>
+            <w:left w:val="single" w:color="auto" w:sz="4" w:space="0"/>
+            <w:bottom w:val="single" w:color="auto" w:sz="4" w:space="0"/>
+            <w:right w:val="single" w:color="auto" w:sz="4" w:space="0"/>
+            <w:insideH w:val="single" w:color="auto" w:sz="4" w:space="0"/>
+            <w:insideV w:val="single" w:color="auto" w:sz="4" w:space="0"/>
+          </w:tblBorders>
+          <w:tblCellMar>
+            <w:top w:w="0" w:type="dxa"/>
+            <w:left w:w="10" w:type="dxa"/>
+            <w:bottom w:w="0" w:type="dxa"/>
+            <w:right w:w="10" w:type="dxa"/>
+          </w:tblCellMar>
+        </w:tblPrEx>
+        <w:tc>
+          <w:tcPr>
+            <w:tcW w:w="2000" w:type="dxa"/>
+            <w:tcBorders>
+              <w:top w:val="single" w:color="000000" w:sz="6" w:space="0"/>
+              <w:left w:val="single" w:color="000000" w:sz="6" w:space="0"/>
+              <w:bottom w:val="single" w:color="000000" w:sz="6" w:space="0"/>
+              <w:right w:val="single" w:color="000000" w:sz="6" w:space="0"/>
+            </w:tcBorders>
+            <w:shd w:val="clear" w:color="auto" w:fill="D9D9D9"/>
+            <w:tcMar>
+              <w:top w:w="80" w:type="dxa"/>
+              <w:left w:w="120" w:type="dxa"/>
+              <w:bottom w:w="80" w:type="dxa"/>
+              <w:right w:w="120" w:type="dxa"/>
+            </w:tcMar>
+            <w:vAlign w:val="center"/>
+          </w:tcPr>
+          <w:p>
+            <w:pPr>
+              <w:keepNext w:val="0"/>
+              <w:keepLines w:val="0"/>
+              <w:widowControl/>
+              <w:suppressLineNumbers w:val="0"/>
+              <w:spacing w:before="40" w:beforeAutospacing="0" w:after="40" w:afterAutospacing="0" w:line="360" w:lineRule="auto"/>
+              <w:ind w:left="0" w:right="0"/>
+              <w:jc w:val="left"/>
+              <w:rPr>
+                <w:rFonts w:hint="default"/>
+              </w:rPr>
+            </w:pPr>
+            <w:r>
+              <w:rPr>
+                <w:rFonts w:hint="default" w:ascii="Times New Roman" w:hAnsi="Times New Roman" w:eastAsia="Times New Roman" w:cs="Times New Roman"/>
+                <w:b/>
+                <w:bCs/>
+                <w:color w:val="auto"/>
+                <w:kern w:val="0"/>
+                <w:sz w:val="24"/>
+                <w:szCs w:val="24"/>
+                <w:lang w:val="en-US" w:eastAsia="zh-CN" w:bidi="ar"/>
+              </w:rPr>
+              <w:t>TC ID</w:t>
+            </w:r>
+          </w:p>
+        </w:tc>
+        <w:tc>
+          <w:tcPr>
+            <w:tcW w:w="7026" w:type="dxa"/>
+            <w:tcBorders>
+              <w:top w:val="single" w:color="000000" w:sz="6" w:space="0"/>
+              <w:left w:val="single" w:color="000000" w:sz="6" w:space="0"/>
+              <w:bottom w:val="single" w:color="000000" w:sz="6" w:space="0"/>
+              <w:right w:val="single" w:color="000000" w:sz="6" w:space="0"/>
+            </w:tcBorders>
+            <w:shd w:val="clear" w:color="auto" w:fill="auto"/>
+            <w:tcMar>
+              <w:top w:w="80" w:type="dxa"/>
+              <w:left w:w="120" w:type="dxa"/>
+              <w:bottom w:w="80" w:type="dxa"/>
+              <w:right w:w="120" w:type="dxa"/>
+            </w:tcMar>
+            <w:vAlign w:val="center"/>
+          </w:tcPr>
+          <w:p>
+            <w:pPr>
+              <w:keepNext w:val="0"/>
+              <w:keepLines w:val="0"/>
+              <w:widowControl/>
+              <w:suppressLineNumbers w:val="0"/>
+              <w:spacing w:before="40" w:beforeAutospacing="0" w:after="40" w:afterAutospacing="0" w:line="360" w:lineRule="auto"/>
+              <w:ind w:left="0" w:right="0"/>
+              <w:jc w:val="left"/>
+              <w:rPr>
+                <w:rFonts w:hint="default"/>
+              </w:rPr>
+            </w:pPr>
+            <w:r>
+              <w:rPr>
+                <w:rFonts w:hint="default" w:ascii="Times New Roman" w:hAnsi="Times New Roman" w:eastAsia="Times New Roman" w:cs="Times New Roman"/>
+                <w:kern w:val="0"/>
+                <w:sz w:val="24"/>
+                <w:szCs w:val="24"/>
+                <w:lang w:val="en-US" w:eastAsia="zh-CN" w:bidi="ar"/>
+              </w:rPr>
+              <w:t>TC04-06</w:t>
             </w:r>
           </w:p>
         </w:tc>
@@ -22057,7 +22199,7 @@
                 <w:szCs w:val="24"/>
                 <w:lang w:val="en-US" w:eastAsia="zh-CN" w:bidi="ar"/>
               </w:rPr>
-              <w:t>Kết quả mong đợi</w:t>
+              <w:t>Mô tả</w:t>
             </w:r>
           </w:p>
         </w:tc>
@@ -22085,6 +22227,407 @@
               <w:keepLines w:val="0"/>
               <w:widowControl/>
               <w:suppressLineNumbers w:val="0"/>
+              <w:spacing w:before="40" w:beforeAutospacing="0" w:after="40" w:afterAutospacing="0" w:line="360" w:lineRule="auto"/>
+              <w:ind w:left="0" w:right="0"/>
+              <w:jc w:val="left"/>
+              <w:rPr>
+                <w:rFonts w:hint="default"/>
+              </w:rPr>
+            </w:pPr>
+            <w:r>
+              <w:rPr>
+                <w:rFonts w:hint="default" w:ascii="Times New Roman" w:hAnsi="Times New Roman" w:eastAsia="Times New Roman" w:cs="Times New Roman"/>
+                <w:kern w:val="0"/>
+                <w:sz w:val="24"/>
+                <w:szCs w:val="24"/>
+                <w:lang w:val="en-US" w:eastAsia="zh-CN" w:bidi="ar"/>
+              </w:rPr>
+              <w:t>Xem chi tiết phim mà trường posterUrl là null hoặc rỗng.</w:t>
+            </w:r>
+          </w:p>
+        </w:tc>
+      </w:tr>
+      <w:tr>
+        <w:tblPrEx>
+          <w:tblBorders>
+            <w:top w:val="single" w:color="auto" w:sz="4" w:space="0"/>
+            <w:left w:val="single" w:color="auto" w:sz="4" w:space="0"/>
+            <w:bottom w:val="single" w:color="auto" w:sz="4" w:space="0"/>
+            <w:right w:val="single" w:color="auto" w:sz="4" w:space="0"/>
+            <w:insideH w:val="single" w:color="auto" w:sz="4" w:space="0"/>
+            <w:insideV w:val="single" w:color="auto" w:sz="4" w:space="0"/>
+          </w:tblBorders>
+          <w:shd w:val="clear" w:color="auto" w:fill="auto"/>
+          <w:tblCellMar>
+            <w:top w:w="0" w:type="dxa"/>
+            <w:left w:w="10" w:type="dxa"/>
+            <w:bottom w:w="0" w:type="dxa"/>
+            <w:right w:w="10" w:type="dxa"/>
+          </w:tblCellMar>
+        </w:tblPrEx>
+        <w:tc>
+          <w:tcPr>
+            <w:tcW w:w="2000" w:type="dxa"/>
+            <w:tcBorders>
+              <w:top w:val="single" w:color="000000" w:sz="6" w:space="0"/>
+              <w:left w:val="single" w:color="000000" w:sz="6" w:space="0"/>
+              <w:bottom w:val="single" w:color="000000" w:sz="6" w:space="0"/>
+              <w:right w:val="single" w:color="000000" w:sz="6" w:space="0"/>
+            </w:tcBorders>
+            <w:shd w:val="clear" w:color="auto" w:fill="D9D9D9"/>
+            <w:tcMar>
+              <w:top w:w="80" w:type="dxa"/>
+              <w:left w:w="120" w:type="dxa"/>
+              <w:bottom w:w="80" w:type="dxa"/>
+              <w:right w:w="120" w:type="dxa"/>
+            </w:tcMar>
+            <w:vAlign w:val="center"/>
+          </w:tcPr>
+          <w:p>
+            <w:pPr>
+              <w:keepNext w:val="0"/>
+              <w:keepLines w:val="0"/>
+              <w:widowControl/>
+              <w:suppressLineNumbers w:val="0"/>
+              <w:spacing w:before="40" w:beforeAutospacing="0" w:after="40" w:afterAutospacing="0" w:line="360" w:lineRule="auto"/>
+              <w:ind w:left="0" w:right="0"/>
+              <w:jc w:val="left"/>
+              <w:rPr>
+                <w:rFonts w:hint="default"/>
+              </w:rPr>
+            </w:pPr>
+            <w:r>
+              <w:rPr>
+                <w:rFonts w:hint="default" w:ascii="Times New Roman" w:hAnsi="Times New Roman" w:eastAsia="Times New Roman" w:cs="Times New Roman"/>
+                <w:b/>
+                <w:bCs/>
+                <w:color w:val="auto"/>
+                <w:kern w:val="0"/>
+                <w:sz w:val="24"/>
+                <w:szCs w:val="24"/>
+                <w:lang w:val="en-US" w:eastAsia="zh-CN" w:bidi="ar"/>
+              </w:rPr>
+              <w:t>Tiền điều kiện</w:t>
+            </w:r>
+          </w:p>
+        </w:tc>
+        <w:tc>
+          <w:tcPr>
+            <w:tcW w:w="7026" w:type="dxa"/>
+            <w:tcBorders>
+              <w:top w:val="single" w:color="000000" w:sz="6" w:space="0"/>
+              <w:left w:val="single" w:color="000000" w:sz="6" w:space="0"/>
+              <w:bottom w:val="single" w:color="000000" w:sz="6" w:space="0"/>
+              <w:right w:val="single" w:color="000000" w:sz="6" w:space="0"/>
+            </w:tcBorders>
+            <w:shd w:val="clear" w:color="auto" w:fill="auto"/>
+            <w:tcMar>
+              <w:top w:w="80" w:type="dxa"/>
+              <w:left w:w="120" w:type="dxa"/>
+              <w:bottom w:w="80" w:type="dxa"/>
+              <w:right w:w="120" w:type="dxa"/>
+            </w:tcMar>
+            <w:vAlign w:val="center"/>
+          </w:tcPr>
+          <w:p>
+            <w:pPr>
+              <w:keepNext w:val="0"/>
+              <w:keepLines w:val="0"/>
+              <w:widowControl/>
+              <w:suppressLineNumbers w:val="0"/>
+              <w:spacing w:before="20" w:beforeAutospacing="0" w:after="20" w:afterAutospacing="0" w:line="360" w:lineRule="auto"/>
+              <w:ind w:left="0" w:right="0"/>
+              <w:jc w:val="both"/>
+              <w:rPr>
+                <w:rFonts w:hint="default"/>
+              </w:rPr>
+            </w:pPr>
+            <w:r>
+              <w:rPr>
+                <w:rFonts w:hint="default" w:ascii="Times New Roman" w:hAnsi="Times New Roman" w:eastAsia="Times New Roman" w:cs="Times New Roman"/>
+                <w:color w:val="000000"/>
+                <w:kern w:val="0"/>
+                <w:sz w:val="24"/>
+                <w:szCs w:val="24"/>
+                <w:lang w:val="en-US" w:eastAsia="zh-CN" w:bidi="ar"/>
+              </w:rPr>
+              <w:t>1. Hệ thống đang hoạt động bình thường.</w:t>
+            </w:r>
+          </w:p>
+          <w:p>
+            <w:pPr>
+              <w:keepNext w:val="0"/>
+              <w:keepLines w:val="0"/>
+              <w:widowControl/>
+              <w:suppressLineNumbers w:val="0"/>
+              <w:spacing w:before="20" w:beforeAutospacing="0" w:after="20" w:afterAutospacing="0" w:line="360" w:lineRule="auto"/>
+              <w:ind w:left="0" w:right="0"/>
+              <w:jc w:val="both"/>
+              <w:rPr>
+                <w:rFonts w:hint="default"/>
+              </w:rPr>
+            </w:pPr>
+            <w:r>
+              <w:rPr>
+                <w:rFonts w:hint="default" w:ascii="Times New Roman" w:hAnsi="Times New Roman" w:eastAsia="Times New Roman" w:cs="Times New Roman"/>
+                <w:color w:val="000000"/>
+                <w:kern w:val="0"/>
+                <w:sz w:val="24"/>
+                <w:szCs w:val="24"/>
+                <w:lang w:val="en-US" w:eastAsia="zh-CN" w:bidi="ar"/>
+              </w:rPr>
+              <w:t>2. Phim tồn tại nhưng trường posterUrl trong database là NULL.</w:t>
+            </w:r>
+          </w:p>
+        </w:tc>
+      </w:tr>
+      <w:tr>
+        <w:tblPrEx>
+          <w:tblBorders>
+            <w:top w:val="single" w:color="auto" w:sz="4" w:space="0"/>
+            <w:left w:val="single" w:color="auto" w:sz="4" w:space="0"/>
+            <w:bottom w:val="single" w:color="auto" w:sz="4" w:space="0"/>
+            <w:right w:val="single" w:color="auto" w:sz="4" w:space="0"/>
+            <w:insideH w:val="single" w:color="auto" w:sz="4" w:space="0"/>
+            <w:insideV w:val="single" w:color="auto" w:sz="4" w:space="0"/>
+          </w:tblBorders>
+          <w:shd w:val="clear" w:color="auto" w:fill="auto"/>
+          <w:tblCellMar>
+            <w:top w:w="0" w:type="dxa"/>
+            <w:left w:w="10" w:type="dxa"/>
+            <w:bottom w:w="0" w:type="dxa"/>
+            <w:right w:w="10" w:type="dxa"/>
+          </w:tblCellMar>
+        </w:tblPrEx>
+        <w:tc>
+          <w:tcPr>
+            <w:tcW w:w="2000" w:type="dxa"/>
+            <w:tcBorders>
+              <w:top w:val="single" w:color="000000" w:sz="6" w:space="0"/>
+              <w:left w:val="single" w:color="000000" w:sz="6" w:space="0"/>
+              <w:bottom w:val="single" w:color="000000" w:sz="6" w:space="0"/>
+              <w:right w:val="single" w:color="000000" w:sz="6" w:space="0"/>
+            </w:tcBorders>
+            <w:shd w:val="clear" w:color="auto" w:fill="D9D9D9"/>
+            <w:tcMar>
+              <w:top w:w="80" w:type="dxa"/>
+              <w:left w:w="120" w:type="dxa"/>
+              <w:bottom w:w="80" w:type="dxa"/>
+              <w:right w:w="120" w:type="dxa"/>
+            </w:tcMar>
+            <w:vAlign w:val="center"/>
+          </w:tcPr>
+          <w:p>
+            <w:pPr>
+              <w:keepNext w:val="0"/>
+              <w:keepLines w:val="0"/>
+              <w:widowControl/>
+              <w:suppressLineNumbers w:val="0"/>
+              <w:spacing w:before="40" w:beforeAutospacing="0" w:after="40" w:afterAutospacing="0" w:line="360" w:lineRule="auto"/>
+              <w:ind w:left="0" w:right="0"/>
+              <w:jc w:val="left"/>
+              <w:rPr>
+                <w:rFonts w:hint="default"/>
+              </w:rPr>
+            </w:pPr>
+            <w:r>
+              <w:rPr>
+                <w:rFonts w:hint="default" w:ascii="Times New Roman" w:hAnsi="Times New Roman" w:eastAsia="Times New Roman" w:cs="Times New Roman"/>
+                <w:b/>
+                <w:bCs/>
+                <w:color w:val="auto"/>
+                <w:kern w:val="0"/>
+                <w:sz w:val="24"/>
+                <w:szCs w:val="24"/>
+                <w:lang w:val="en-US" w:eastAsia="zh-CN" w:bidi="ar"/>
+              </w:rPr>
+              <w:t>Các bước thực hiện</w:t>
+            </w:r>
+          </w:p>
+        </w:tc>
+        <w:tc>
+          <w:tcPr>
+            <w:tcW w:w="7026" w:type="dxa"/>
+            <w:tcBorders>
+              <w:top w:val="single" w:color="000000" w:sz="6" w:space="0"/>
+              <w:left w:val="single" w:color="000000" w:sz="6" w:space="0"/>
+              <w:bottom w:val="single" w:color="000000" w:sz="6" w:space="0"/>
+              <w:right w:val="single" w:color="000000" w:sz="6" w:space="0"/>
+            </w:tcBorders>
+            <w:shd w:val="clear" w:color="auto" w:fill="auto"/>
+            <w:tcMar>
+              <w:top w:w="80" w:type="dxa"/>
+              <w:left w:w="120" w:type="dxa"/>
+              <w:bottom w:w="80" w:type="dxa"/>
+              <w:right w:w="120" w:type="dxa"/>
+            </w:tcMar>
+            <w:vAlign w:val="center"/>
+          </w:tcPr>
+          <w:p>
+            <w:pPr>
+              <w:keepNext w:val="0"/>
+              <w:keepLines w:val="0"/>
+              <w:widowControl/>
+              <w:suppressLineNumbers w:val="0"/>
+              <w:spacing w:before="20" w:beforeAutospacing="0" w:after="20" w:afterAutospacing="0" w:line="360" w:lineRule="auto"/>
+              <w:ind w:left="0" w:right="0"/>
+              <w:jc w:val="both"/>
+              <w:rPr>
+                <w:rFonts w:hint="default"/>
+              </w:rPr>
+            </w:pPr>
+            <w:r>
+              <w:rPr>
+                <w:rFonts w:hint="default" w:ascii="Times New Roman" w:hAnsi="Times New Roman" w:eastAsia="Times New Roman" w:cs="Times New Roman"/>
+                <w:color w:val="000000"/>
+                <w:kern w:val="0"/>
+                <w:sz w:val="24"/>
+                <w:szCs w:val="24"/>
+                <w:lang w:val="en-US" w:eastAsia="zh-CN" w:bidi="ar"/>
+              </w:rPr>
+              <w:t>1. Truy cập trang chi tiết phim của bộ phim không có poster.</w:t>
+            </w:r>
+          </w:p>
+          <w:p>
+            <w:pPr>
+              <w:keepNext w:val="0"/>
+              <w:keepLines w:val="0"/>
+              <w:widowControl/>
+              <w:suppressLineNumbers w:val="0"/>
+              <w:spacing w:before="20" w:beforeAutospacing="0" w:after="20" w:afterAutospacing="0" w:line="360" w:lineRule="auto"/>
+              <w:ind w:left="0" w:right="0"/>
+              <w:jc w:val="both"/>
+              <w:rPr>
+                <w:rFonts w:hint="default"/>
+              </w:rPr>
+            </w:pPr>
+            <w:r>
+              <w:rPr>
+                <w:rFonts w:hint="default" w:ascii="Times New Roman" w:hAnsi="Times New Roman" w:eastAsia="Times New Roman" w:cs="Times New Roman"/>
+                <w:color w:val="000000"/>
+                <w:kern w:val="0"/>
+                <w:sz w:val="24"/>
+                <w:szCs w:val="24"/>
+                <w:lang w:val="en-US" w:eastAsia="zh-CN" w:bidi="ar"/>
+              </w:rPr>
+              <w:t>2. JSP kiểm tra: &lt;c:choose&gt; → &lt;c:when test="${not empty movie.posterUrl}"&gt; thất bại.</w:t>
+            </w:r>
+          </w:p>
+          <w:p>
+            <w:pPr>
+              <w:keepNext w:val="0"/>
+              <w:keepLines w:val="0"/>
+              <w:widowControl/>
+              <w:suppressLineNumbers w:val="0"/>
+              <w:spacing w:before="20" w:beforeAutospacing="0" w:after="20" w:afterAutospacing="0" w:line="360" w:lineRule="auto"/>
+              <w:ind w:left="0" w:right="0"/>
+              <w:jc w:val="both"/>
+              <w:rPr>
+                <w:rFonts w:hint="default"/>
+              </w:rPr>
+            </w:pPr>
+            <w:r>
+              <w:rPr>
+                <w:rFonts w:hint="default" w:ascii="Times New Roman" w:hAnsi="Times New Roman" w:eastAsia="Times New Roman" w:cs="Times New Roman"/>
+                <w:color w:val="000000"/>
+                <w:kern w:val="0"/>
+                <w:sz w:val="24"/>
+                <w:szCs w:val="24"/>
+                <w:lang w:val="en-US" w:eastAsia="zh-CN" w:bidi="ar"/>
+              </w:rPr>
+              <w:t>3. JSP vào nhánh &lt;c:otherwise&gt;.</w:t>
+            </w:r>
+          </w:p>
+        </w:tc>
+      </w:tr>
+      <w:tr>
+        <w:tblPrEx>
+          <w:tblBorders>
+            <w:top w:val="single" w:color="auto" w:sz="4" w:space="0"/>
+            <w:left w:val="single" w:color="auto" w:sz="4" w:space="0"/>
+            <w:bottom w:val="single" w:color="auto" w:sz="4" w:space="0"/>
+            <w:right w:val="single" w:color="auto" w:sz="4" w:space="0"/>
+            <w:insideH w:val="single" w:color="auto" w:sz="4" w:space="0"/>
+            <w:insideV w:val="single" w:color="auto" w:sz="4" w:space="0"/>
+          </w:tblBorders>
+          <w:shd w:val="clear" w:color="auto" w:fill="auto"/>
+          <w:tblCellMar>
+            <w:top w:w="0" w:type="dxa"/>
+            <w:left w:w="10" w:type="dxa"/>
+            <w:bottom w:w="0" w:type="dxa"/>
+            <w:right w:w="10" w:type="dxa"/>
+          </w:tblCellMar>
+        </w:tblPrEx>
+        <w:tc>
+          <w:tcPr>
+            <w:tcW w:w="2000" w:type="dxa"/>
+            <w:tcBorders>
+              <w:top w:val="single" w:color="000000" w:sz="6" w:space="0"/>
+              <w:left w:val="single" w:color="000000" w:sz="6" w:space="0"/>
+              <w:bottom w:val="single" w:color="000000" w:sz="6" w:space="0"/>
+              <w:right w:val="single" w:color="000000" w:sz="6" w:space="0"/>
+            </w:tcBorders>
+            <w:shd w:val="clear" w:color="auto" w:fill="D9D9D9"/>
+            <w:tcMar>
+              <w:top w:w="80" w:type="dxa"/>
+              <w:left w:w="120" w:type="dxa"/>
+              <w:bottom w:w="80" w:type="dxa"/>
+              <w:right w:w="120" w:type="dxa"/>
+            </w:tcMar>
+            <w:vAlign w:val="center"/>
+          </w:tcPr>
+          <w:p>
+            <w:pPr>
+              <w:keepNext w:val="0"/>
+              <w:keepLines w:val="0"/>
+              <w:widowControl/>
+              <w:suppressLineNumbers w:val="0"/>
+              <w:spacing w:before="40" w:beforeAutospacing="0" w:after="40" w:afterAutospacing="0" w:line="360" w:lineRule="auto"/>
+              <w:ind w:left="0" w:right="0"/>
+              <w:jc w:val="left"/>
+              <w:rPr>
+                <w:rFonts w:hint="default"/>
+              </w:rPr>
+            </w:pPr>
+            <w:r>
+              <w:rPr>
+                <w:rFonts w:hint="default" w:ascii="Times New Roman" w:hAnsi="Times New Roman" w:eastAsia="Times New Roman" w:cs="Times New Roman"/>
+                <w:b/>
+                <w:bCs/>
+                <w:color w:val="auto"/>
+                <w:kern w:val="0"/>
+                <w:sz w:val="24"/>
+                <w:szCs w:val="24"/>
+                <w:lang w:val="en-US" w:eastAsia="zh-CN" w:bidi="ar"/>
+              </w:rPr>
+              <w:t>Kết quả mong đợi</w:t>
+            </w:r>
+          </w:p>
+        </w:tc>
+        <w:tc>
+          <w:tcPr>
+            <w:tcW w:w="7026" w:type="dxa"/>
+            <w:tcBorders>
+              <w:top w:val="single" w:color="000000" w:sz="6" w:space="0"/>
+              <w:left w:val="single" w:color="000000" w:sz="6" w:space="0"/>
+              <w:bottom w:val="single" w:color="000000" w:sz="6" w:space="0"/>
+              <w:right w:val="single" w:color="000000" w:sz="6" w:space="0"/>
+            </w:tcBorders>
+            <w:shd w:val="clear" w:color="auto" w:fill="auto"/>
+            <w:tcMar>
+              <w:top w:w="80" w:type="dxa"/>
+              <w:left w:w="120" w:type="dxa"/>
+              <w:bottom w:w="80" w:type="dxa"/>
+              <w:right w:w="120" w:type="dxa"/>
+            </w:tcMar>
+            <w:vAlign w:val="center"/>
+          </w:tcPr>
+          <w:p>
+            <w:pPr>
+              <w:keepNext w:val="0"/>
+              <w:keepLines w:val="0"/>
+              <w:widowControl/>
+              <w:suppressLineNumbers w:val="0"/>
               <w:spacing w:before="20" w:beforeAutospacing="0" w:after="20" w:afterAutospacing="0" w:line="360" w:lineRule="auto"/>
               <w:ind w:left="0" w:right="0"/>
               <w:jc w:val="both"/>
@@ -22206,8 +22749,8 @@
         </w:rPr>
       </w:pPr>
       <w:bookmarkStart w:id="96" w:name="_Toc1307"/>
-      <w:bookmarkStart w:id="97" w:name="_Toc16664"/>
-      <w:bookmarkStart w:id="98" w:name="_Toc231414259"/>
+      <w:bookmarkStart w:id="97" w:name="_Toc231414259"/>
+      <w:bookmarkStart w:id="98" w:name="_Toc16664"/>
       <w:r>
         <w:rPr>
           <w:lang w:val="en-US"/>
@@ -22579,7 +23122,6 @@
             <w:insideH w:val="single" w:color="auto" w:sz="4" w:space="0"/>
             <w:insideV w:val="single" w:color="auto" w:sz="4" w:space="0"/>
           </w:tblBorders>
-          <w:shd w:val="clear" w:color="auto" w:fill="auto"/>
           <w:tblCellMar>
             <w:top w:w="0" w:type="dxa"/>
             <w:left w:w="10" w:type="dxa"/>
@@ -22912,8 +23454,8 @@
         </w:rPr>
       </w:pPr>
       <w:bookmarkStart w:id="99" w:name="_Toc26462"/>
-      <w:bookmarkStart w:id="100" w:name="_Toc231414260"/>
-      <w:bookmarkStart w:id="101" w:name="_Toc1106"/>
+      <w:bookmarkStart w:id="100" w:name="_Toc1106"/>
+      <w:bookmarkStart w:id="101" w:name="_Toc231414260"/>
       <w:r>
         <w:rPr>
           <w:lang w:val="en-US"/>
@@ -23176,7 +23718,6 @@
             <w:insideH w:val="single" w:color="auto" w:sz="4" w:space="0"/>
             <w:insideV w:val="single" w:color="auto" w:sz="4" w:space="0"/>
           </w:tblBorders>
-          <w:shd w:val="clear" w:color="auto" w:fill="auto"/>
           <w:tblCellMar>
             <w:top w:w="0" w:type="dxa"/>
             <w:left w:w="10" w:type="dxa"/>
@@ -24484,8 +25025,8 @@
       <w:bookmarkStart w:id="107" w:name="_Toc8349"/>
       <w:bookmarkStart w:id="108" w:name="_Toc9810"/>
       <w:bookmarkStart w:id="109" w:name="_Toc7416"/>
-      <w:bookmarkStart w:id="110" w:name="_Toc228887530"/>
-      <w:bookmarkStart w:id="111" w:name="_Toc231414263"/>
+      <w:bookmarkStart w:id="110" w:name="_Toc231414263"/>
+      <w:bookmarkStart w:id="111" w:name="_Toc228887530"/>
       <w:r>
         <w:rPr>
           <w:rFonts w:hint="default" w:ascii="Arial" w:hAnsi="Arial" w:cs="Times New Roman"/>
@@ -24591,8 +25132,8 @@
           <w:lang w:val="en-US"/>
         </w:rPr>
       </w:pPr>
-      <w:bookmarkStart w:id="112" w:name="_Toc8838"/>
-      <w:bookmarkStart w:id="113" w:name="_Toc231414264"/>
+      <w:bookmarkStart w:id="112" w:name="_Toc231414264"/>
+      <w:bookmarkStart w:id="113" w:name="_Toc8838"/>
       <w:bookmarkStart w:id="114" w:name="_Toc29686"/>
       <w:r>
         <w:rPr>
@@ -24613,8 +25154,8 @@
           <w:lang w:val="en-US"/>
         </w:rPr>
       </w:pPr>
-      <w:bookmarkStart w:id="115" w:name="_Toc231414265"/>
-      <w:bookmarkStart w:id="116" w:name="_Toc21877"/>
+      <w:bookmarkStart w:id="115" w:name="_Toc21877"/>
+      <w:bookmarkStart w:id="116" w:name="_Toc231414265"/>
       <w:bookmarkStart w:id="117" w:name="_Toc27421"/>
       <w:r>
         <w:rPr>
@@ -25159,9 +25700,9 @@
           <w:lang w:val="en-US"/>
         </w:rPr>
       </w:pPr>
-      <w:bookmarkStart w:id="121" w:name="_Toc231414267"/>
-      <w:bookmarkStart w:id="122" w:name="_Toc15319"/>
-      <w:bookmarkStart w:id="123" w:name="_Toc19251"/>
+      <w:bookmarkStart w:id="121" w:name="_Toc19251"/>
+      <w:bookmarkStart w:id="122" w:name="_Toc231414267"/>
+      <w:bookmarkStart w:id="123" w:name="_Toc15319"/>
       <w:r>
         <w:rPr>
           <w:lang w:val="en-US"/>
@@ -25733,9 +26274,9 @@
           <w:lang w:val="en-US"/>
         </w:rPr>
       </w:pPr>
-      <w:bookmarkStart w:id="127" w:name="_Toc15589"/>
+      <w:bookmarkStart w:id="127" w:name="_Toc231414269"/>
       <w:bookmarkStart w:id="128" w:name="_Toc20779"/>
-      <w:bookmarkStart w:id="129" w:name="_Toc231414269"/>
+      <w:bookmarkStart w:id="129" w:name="_Toc15589"/>
       <w:r>
         <w:rPr>
           <w:lang w:val="en-US"/>
@@ -26504,9 +27045,9 @@
           <w:lang w:val="en-US"/>
         </w:rPr>
       </w:pPr>
-      <w:bookmarkStart w:id="137" w:name="_Toc639"/>
-      <w:bookmarkStart w:id="138" w:name="_Toc231414273"/>
-      <w:bookmarkStart w:id="139" w:name="_Toc21529"/>
+      <w:bookmarkStart w:id="137" w:name="_Toc21529"/>
+      <w:bookmarkStart w:id="138" w:name="_Toc639"/>
+      <w:bookmarkStart w:id="139" w:name="_Toc231414273"/>
       <w:r>
         <w:rPr>
           <w:lang w:val="en-US"/>
@@ -26821,9 +27362,9 @@
           <w:lang w:val="en-US"/>
         </w:rPr>
       </w:pPr>
-      <w:bookmarkStart w:id="141" w:name="_Toc231414274"/>
-      <w:bookmarkStart w:id="142" w:name="_Toc18912"/>
-      <w:bookmarkStart w:id="143" w:name="_Toc1456"/>
+      <w:bookmarkStart w:id="141" w:name="_Toc18912"/>
+      <w:bookmarkStart w:id="142" w:name="_Toc1456"/>
+      <w:bookmarkStart w:id="143" w:name="_Toc231414274"/>
       <w:r>
         <w:rPr>
           <w:lang w:val="en-US"/>

</xml_diff>